<commit_message>
PCR-005 follow-up (73 pp, gates green): DEV-005-03/04/05, classification by PCMP-001 §6.2 and §7.7, the owner's influence rule; register dispositions that name an ID written as words; DEV-004-03 (harvest scale-down model not qualified, owner Q8); PTP-001 review run 2 saved
The PCR-005 annex is re-anchored in a following commit.

Co-Authored-By: Claude Opus 5.5 <noreply@anthropic.com>
</commit_message>
<xml_diff>
--- a/pc_package/PCR-005_protein_a.docx
+++ b/pc_package/PCR-005_protein_a.docx
@@ -1032,6 +1032,32 @@
               <w:jc w:val="left"/>
             </w:pPr>
             <w:r>
+              <w:t xml:space="preserve">2D</w:t>
+            </w:r>
+          </w:p>
+        </w:tc>
+        <w:tc>
+          <w:tcPr/>
+          <w:p>
+            <w:pPr>
+              <w:pStyle w:val="Compact"/>
+              <w:jc w:val="left"/>
+            </w:pPr>
+            <w:r>
+              <w:t xml:space="preserve">two-dimensional</w:t>
+            </w:r>
+          </w:p>
+        </w:tc>
+      </w:tr>
+      <w:tr>
+        <w:tc>
+          <w:tcPr/>
+          <w:p>
+            <w:pPr>
+              <w:pStyle w:val="Compact"/>
+              <w:jc w:val="left"/>
+            </w:pPr>
+            <w:r>
               <w:t xml:space="preserve">AICc</w:t>
             </w:r>
           </w:p>
@@ -1123,6 +1149,32 @@
             </w:pPr>
             <w:r>
               <w:t xml:space="preserve">Biologics License Application</w:t>
+            </w:r>
+          </w:p>
+        </w:tc>
+      </w:tr>
+      <w:tr>
+        <w:tc>
+          <w:tcPr/>
+          <w:p>
+            <w:pPr>
+              <w:pStyle w:val="Compact"/>
+              <w:jc w:val="left"/>
+            </w:pPr>
+            <w:r>
+              <w:t xml:space="preserve">CHO</w:t>
+            </w:r>
+          </w:p>
+        </w:tc>
+        <w:tc>
+          <w:tcPr/>
+          <w:p>
+            <w:pPr>
+              <w:pStyle w:val="Compact"/>
+              <w:jc w:val="left"/>
+            </w:pPr>
+            <w:r>
+              <w:t xml:space="preserve">Chinese hamster ovary</w:t>
             </w:r>
           </w:p>
         </w:tc>
@@ -2164,7 +2216,18 @@
         </w:numPr>
       </w:pPr>
       <w:r>
-        <w:t xml:space="preserve">F1. The scale-down model is qualified for leached Protein A and, over the NOR in force, for pool host cell protein, which in the scale-down model is 0.973 times its value at manufacturing scale (90 % confidence interval 0.891 to 1.063). Over the protein load NOR as characterized, 20–40 g/L resin, the model is not qualified for pool host cell protein, because with the ratio at the low end of its interval the upper prediction limit of a single run, 17,143 ng/mg, exceeds the criterion. The NOR of protein load in force was therefore narrowed to 20–39 g/L resin. The qualification also rests on the widened criterion, on the 6 set-point runs added during the re-analysis (PD-005-01) and on the choice of the selected model. Leached Protein A is 1.18 ppm lower in the scale-down model, as expected from the longer hold of the load at manufacturing scale. Fragments were not compared at the two scales (</w:t>
+        <w:t xml:space="preserve">F1. The scale-down model is qualified for leached Protein A and, over the NOR in force, for pool host cell protein, which in the scale-down model is 0.973 times its value at manufacturing scale (90 % confidence interval 0.891 to 1.063). Over the protein load NOR as characterized, 20–40 g/L resin, the model is not qualified for pool host cell protein, because with the ratio at the low end of its interval the upper prediction limit of a single run, 17,143 ng/mg, exceeds the criterion. The NOR of protein load in force was therefore narrowed to 20–39 g/L resin. The qualification also rests on the widened criterion and on the 6 set-point runs added during the re-analysis (PD-005-01), and the selected model decides it (</w:t>
+      </w:r>
+      <w:hyperlink w:anchor="sec-rsm-hcp">
+        <w:r>
+          <w:rPr>
+            <w:rStyle w:val="Hyperlink"/>
+          </w:rPr>
+          <w:t xml:space="preserve">Section 5.3.1</w:t>
+        </w:r>
+      </w:hyperlink>
+      <w:r>
+        <w:t xml:space="preserve">). Leached Protein A is 1.18 ppm lower in the scale-down model, as expected from the longer hold of the load at manufacturing scale. Fragments were not compared at the two scales (</w:t>
       </w:r>
       <w:hyperlink w:anchor="sec-sdm">
         <w:r>
@@ -2327,7 +2390,7 @@
         </w:r>
       </w:hyperlink>
       <w:r>
-        <w:t xml:space="preserve">). Every NOR-propagated PAR spans the range studied of its parameter, except that of elution buffer pH for pool host cell protein, 3.21–3.9. On its median predictions pool host cell protein exceeds its criterion only at high protein load combined with low elution buffer pH, never with both inside their NORs (</w:t>
+        <w:t xml:space="preserve">). Every NOR-propagated PAR spans the range studied of its parameter, except that of elution buffer pH for pool host cell protein, 3.21–3.9. On the upper prediction limit of a single run, pool host cell protein exceeds its criterion only at high load combined with low pH, never with every parameter inside its NOR (</w:t>
       </w:r>
       <w:hyperlink w:anchor="sec-ds">
         <w:r>
@@ -2350,10 +2413,7 @@
         </w:numPr>
       </w:pPr>
       <w:r>
-        <w:t xml:space="preserve">F8. Criterion 5 of PCP-005 §7, on influential runs and residual trends, is not met. With each flagged run deleted in turn the conclusion over the NOR is the same for every output with a criterion, and the two residual trends are small against their criteria (PD-005-02,</w:t>
-      </w:r>
-      <w:r>
-        <w:t xml:space="preserve"> </w:t>
+        <w:t xml:space="preserve">F8. Criterion 5 of PCP-005 §7, on residual trends and influential runs, is met except for leached Protein A and fragments, whose residual trends are small against their criteria (PD-005-02). With each run above 4/n deleted in turn the conclusion over the NOR is the same for every output with a criterion (</w:t>
       </w:r>
       <w:hyperlink w:anchor="sec-resid">
         <w:r>
@@ -2399,7 +2459,7 @@
         </w:numPr>
       </w:pPr>
       <w:r>
-        <w:t xml:space="preserve">F10. No difference from the set-point runs was detected in pool host cell protein, step yield or leached Protein A at either end of the ranges of operating temperature and bed height, and each of these results met its criterion. Fragments were not measured in this study (</w:t>
+        <w:t xml:space="preserve">F10. No difference from the set-point runs was detected in pool host cell protein, step yield or leached Protein A at either end of the ranges of operating temperature and bed height, and each of these results met its criterion. Fragments were not measured by nrCE-SDS in this study (</w:t>
       </w:r>
       <w:hyperlink w:anchor="sec-uni">
         <w:r>
@@ -2460,7 +2520,7 @@
         <w:pStyle w:val="BodyText"/>
       </w:pPr>
       <w:r>
-        <w:t xml:space="preserve">The 2 deviations of the step (DEV-005-01 and DEV-005-02) were investigated, their runs were retained, and neither changes the judgement of an output against its criterion. The report also records 6 discrepancies from the plan (</w:t>
+        <w:t xml:space="preserve">The 5 deviations of the step (DEV-005-01 to DEV-005-05) were assessed, and none changes the judgement of an output against its criterion. The report also records 6 discrepancies from the plan (</w:t>
       </w:r>
       <w:hyperlink w:anchor="sec-dev">
         <w:r>
@@ -2545,7 +2605,7 @@
         </w:numPr>
       </w:pPr>
       <w:r>
-        <w:t xml:space="preserve">To estimate, before the first characterization run, the offset between the scale-down model and manufacturing scale for each quantity that the qualification compares, and to qualify the model by that offset for pool host cell protein and leached Protein A (PCP-005 §5.1).</w:t>
+        <w:t xml:space="preserve">Quantify the effect of each characterized parameter on pool host cell protein, on step yield and on leached Protein A, over the ranges given in PCP-005 §6.1.</w:t>
       </w:r>
     </w:p>
     <w:p>
@@ -2557,7 +2617,7 @@
         </w:numPr>
       </w:pPr>
       <w:r>
-        <w:t xml:space="preserve">To identify which of the 4 multivariate parameters, and which of their two-factor interactions, affect pool host cell protein, step yield and leached Protein A (screening design).</w:t>
+        <w:t xml:space="preserve">Define the region of the characterized space within which the quality attributes this step controls are predicted to remain within their acceptance criteria.</w:t>
       </w:r>
     </w:p>
     <w:p>
@@ -2569,7 +2629,7 @@
         </w:numPr>
       </w:pPr>
       <w:r>
-        <w:t xml:space="preserve">To fit response-surface models for pool host cell protein, step yield, leached Protein A and fragments by nrCE-SDS over the ranges studied, and to judge their adequacy for prediction.</w:t>
+        <w:t xml:space="preserve">Establish a proven acceptable range for each parameter and each quality attribute the step controls, both with the other parameters at their set-points and with the other parameters varying within their normal operating ranges.</w:t>
       </w:r>
     </w:p>
     <w:p>
@@ -2581,7 +2641,7 @@
         </w:numPr>
       </w:pPr>
       <w:r>
-        <w:t xml:space="preserve">To determine from the response-surface models the PAR of each multivariate parameter for each attribute of the Protein A pool with a criterion, at manufacturing scale where an offset applies.</w:t>
+        <w:t xml:space="preserve">Provide the demonstrated effects and the operating region from which each parameter will be classified under SOP-4001.</w:t>
       </w:r>
     </w:p>
     <w:p>
@@ -2593,7 +2653,7 @@
         </w:numPr>
       </w:pPr>
       <w:r>
-        <w:t xml:space="preserve">To establish the effect of operating temperature and bed height over their ranges, one factor at a time.</w:t>
+        <w:t xml:space="preserve">Justify the parameter ranges carried into Stage 2 and the contribution this step makes to the control strategy of the drug substance process.</w:t>
       </w:r>
     </w:p>
     <w:p>
@@ -2605,7 +2665,19 @@
         </w:numPr>
       </w:pPr>
       <w:r>
-        <w:t xml:space="preserve">To provide the data for the classification of every parameter of the step under the parameter classification procedure SOP-4001.</w:t>
+        <w:t xml:space="preserve">Estimate, before the first characterization run, the offset between the scale-down model and manufacturing scale for each quantity that the qualification compares, and qualify the model by that offset for pool host cell protein and leached Protein A (PCP-005 §5.1).</w:t>
+      </w:r>
+    </w:p>
+    <w:p>
+      <w:pPr>
+        <w:pStyle w:val="Compact"/>
+        <w:numPr>
+          <w:ilvl w:val="0"/>
+          <w:numId w:val="1002"/>
+        </w:numPr>
+      </w:pPr>
+      <w:r>
+        <w:t xml:space="preserve">Fit response-surface models for pool host cell protein, step yield, leached Protein A and fragments by nrCE-SDS over the ranges studied, and judge their adequacy for prediction.</w:t>
       </w:r>
     </w:p>
     <w:p>
@@ -2613,6 +2685,149 @@
         <w:pStyle w:val="FirstParagraph"/>
       </w:pPr>
       <w:r>
+        <w:t xml:space="preserve">Objectives 1 to 5 are those of Version 1.0. Objectives 6 and 7 were added at Version 2.0, which also adds fragments to objectives 1 and 3 and states the ranges of objective 3 at manufacturing scale for pool host cell protein and leached Protein A. Objective 1 is answered in</w:t>
+      </w:r>
+      <w:r>
+        <w:t xml:space="preserve"> </w:t>
+      </w:r>
+      <w:hyperlink w:anchor="sec-rsm">
+        <w:r>
+          <w:rPr>
+            <w:rStyle w:val="Hyperlink"/>
+          </w:rPr>
+          <w:t xml:space="preserve">Section 5.3</w:t>
+        </w:r>
+      </w:hyperlink>
+      <w:r>
+        <w:t xml:space="preserve"> </w:t>
+      </w:r>
+      <w:r>
+        <w:t xml:space="preserve">and</w:t>
+      </w:r>
+      <w:r>
+        <w:t xml:space="preserve"> </w:t>
+      </w:r>
+      <w:hyperlink w:anchor="sec-uni">
+        <w:r>
+          <w:rPr>
+            <w:rStyle w:val="Hyperlink"/>
+          </w:rPr>
+          <w:t xml:space="preserve">Section 5.6</w:t>
+        </w:r>
+      </w:hyperlink>
+      <w:r>
+        <w:t xml:space="preserve">, objective 2 in</w:t>
+      </w:r>
+      <w:r>
+        <w:t xml:space="preserve"> </w:t>
+      </w:r>
+      <w:hyperlink w:anchor="sec-ds">
+        <w:r>
+          <w:rPr>
+            <w:rStyle w:val="Hyperlink"/>
+          </w:rPr>
+          <w:t xml:space="preserve">Section 6</w:t>
+        </w:r>
+      </w:hyperlink>
+      <w:r>
+        <w:t xml:space="preserve">, objective 3 in</w:t>
+      </w:r>
+      <w:r>
+        <w:t xml:space="preserve"> </w:t>
+      </w:r>
+      <w:hyperlink w:anchor="sec-par">
+        <w:r>
+          <w:rPr>
+            <w:rStyle w:val="Hyperlink"/>
+          </w:rPr>
+          <w:t xml:space="preserve">Section 7</w:t>
+        </w:r>
+      </w:hyperlink>
+      <w:r>
+        <w:t xml:space="preserve">, objective 4 in</w:t>
+      </w:r>
+      <w:r>
+        <w:t xml:space="preserve"> </w:t>
+      </w:r>
+      <w:hyperlink w:anchor="sec-class">
+        <w:r>
+          <w:rPr>
+            <w:rStyle w:val="Hyperlink"/>
+          </w:rPr>
+          <w:t xml:space="preserve">Section 9</w:t>
+        </w:r>
+      </w:hyperlink>
+      <w:r>
+        <w:t xml:space="preserve">, objective 5 in</w:t>
+      </w:r>
+      <w:r>
+        <w:t xml:space="preserve"> </w:t>
+      </w:r>
+      <w:hyperlink w:anchor="sec-par">
+        <w:r>
+          <w:rPr>
+            <w:rStyle w:val="Hyperlink"/>
+          </w:rPr>
+          <w:t xml:space="preserve">Section 7</w:t>
+        </w:r>
+      </w:hyperlink>
+      <w:r>
+        <w:t xml:space="preserve"> </w:t>
+      </w:r>
+      <w:r>
+        <w:t xml:space="preserve">and</w:t>
+      </w:r>
+      <w:r>
+        <w:t xml:space="preserve"> </w:t>
+      </w:r>
+      <w:hyperlink w:anchor="sec-cs">
+        <w:r>
+          <w:rPr>
+            <w:rStyle w:val="Hyperlink"/>
+          </w:rPr>
+          <w:t xml:space="preserve">Section 10</w:t>
+        </w:r>
+      </w:hyperlink>
+      <w:r>
+        <w:t xml:space="preserve">, objective 6 in</w:t>
+      </w:r>
+      <w:r>
+        <w:t xml:space="preserve"> </w:t>
+      </w:r>
+      <w:hyperlink w:anchor="sec-sdm">
+        <w:r>
+          <w:rPr>
+            <w:rStyle w:val="Hyperlink"/>
+          </w:rPr>
+          <w:t xml:space="preserve">Section 3.1</w:t>
+        </w:r>
+      </w:hyperlink>
+      <w:r>
+        <w:t xml:space="preserve"> </w:t>
+      </w:r>
+      <w:r>
+        <w:t xml:space="preserve">and objective 7 in</w:t>
+      </w:r>
+      <w:r>
+        <w:t xml:space="preserve"> </w:t>
+      </w:r>
+      <w:hyperlink w:anchor="sec-rsm">
+        <w:r>
+          <w:rPr>
+            <w:rStyle w:val="Hyperlink"/>
+          </w:rPr>
+          <w:t xml:space="preserve">Section 5.3</w:t>
+        </w:r>
+      </w:hyperlink>
+      <w:r>
+        <w:t xml:space="preserve">.</w:t>
+      </w:r>
+    </w:p>
+    <w:p>
+      <w:pPr>
+        <w:pStyle w:val="BodyText"/>
+      </w:pPr>
+      <w:r>
         <w:t xml:space="preserve">The hold study of the eluate was not an objective of PCP-005. It was made during the Version 2.0 re-analysis and is recorded as the discrepancy PD-005-05 (</w:t>
       </w:r>
       <w:hyperlink w:anchor="sec-pd05">
@@ -2620,7 +2835,7 @@
           <w:rPr>
             <w:rStyle w:val="Hyperlink"/>
           </w:rPr>
-          <w:t xml:space="preserve">Section 13.3.2</w:t>
+          <w:t xml:space="preserve">Section 13.6.2</w:t>
         </w:r>
       </w:hyperlink>
       <w:r>
@@ -3544,7 +3759,7 @@
                     <w:t xml:space="preserve"> </w:t>
                   </w:r>
                   <w:r>
-                    <w:t xml:space="preserve">Widened on verification: a downstream step did better than the platform worst case at the one-sided 95 % prediction bound of a single batch, on an adequate model.</w:t>
+                    <w:t xml:space="preserve">Widened on verification: a downstream step did better than the platform worst case at the one-sided 95 % prediction bound of a single batch, on a model that meets the first three adequacy criteria of PCMP-001 §7.2.</w:t>
                   </w:r>
                 </w:p>
               </w:tc>
@@ -3779,7 +3994,7 @@
           <w:rPr>
             <w:rStyle w:val="Hyperlink"/>
           </w:rPr>
-          <w:t xml:space="preserve">Section 13.3.2</w:t>
+          <w:t xml:space="preserve">Section 13.6.2</w:t>
         </w:r>
       </w:hyperlink>
       <w:r>
@@ -3807,6 +4022,29 @@
       </w:hyperlink>
       <w:r>
         <w:t xml:space="preserve">), because the Version 1.0 records gave no execution dates (INV-001 finding 5).</w:t>
+      </w:r>
+    </w:p>
+    <w:p>
+      <w:pPr>
+        <w:pStyle w:val="Compact"/>
+        <w:numPr>
+          <w:ilvl w:val="0"/>
+          <w:numId w:val="1003"/>
+        </w:numPr>
+      </w:pPr>
+      <w:r>
+        <w:t xml:space="preserve">The deviations DEV-005-03 to DEV-005-05, on the univariate study and on the qualification of the scale-down model, are recorded (</w:t>
+      </w:r>
+      <w:hyperlink w:anchor="sec-dev">
+        <w:r>
+          <w:rPr>
+            <w:rStyle w:val="Hyperlink"/>
+          </w:rPr>
+          <w:t xml:space="preserve">Section 13</w:t>
+        </w:r>
+      </w:hyperlink>
+      <w:r>
+        <w:t xml:space="preserve">).</w:t>
       </w:r>
     </w:p>
     <w:p>
@@ -4484,7 +4722,7 @@
         </w:r>
       </w:hyperlink>
       <w:r>
-        <w:t xml:space="preserve">). Residual DNA has a drug substance criterion but no intermediate acceptance criterion, because the platform history gives no worst-case DNA clearance for the steps after Protein A (PCMP-001 §7.3). It was measured on the centre points for information and is judged in the drug substance (</w:t>
+        <w:t xml:space="preserve">). Residual DNA has a drug substance criterion but no intermediate acceptance criterion, because the platform history gives no worst-case DNA clearance for the steps after Protein A (PCMP-001 §7.3). It was measured in pg per mg of antibody on the centre points, for information, and it is judged in ng per dose in the drug substance (</w:t>
       </w:r>
       <w:hyperlink w:anchor="sec-cap">
         <w:r>
@@ -4635,7 +4873,7 @@
           <w:rPr>
             <w:rStyle w:val="Hyperlink"/>
           </w:rPr>
-          <w:t xml:space="preserve">Section 13.3.1</w:t>
+          <w:t xml:space="preserve">Section 13.6.1</w:t>
         </w:r>
       </w:hyperlink>
       <w:r>
@@ -5081,19 +5319,19 @@
                     <w:jc w:val="center"/>
                   </w:pPr>
                   <w:r>
-                    <w:t xml:space="preserve">-1.18</w:t>
-                  </w:r>
-                </w:p>
-              </w:tc>
-              <w:tc>
-                <w:tcPr/>
-                <w:p>
-                  <w:pPr>
-                    <w:pStyle w:val="Compact"/>
-                    <w:jc w:val="center"/>
-                  </w:pPr>
-                  <w:r>
-                    <w:t xml:space="preserve">-1.97 to -0.39</w:t>
+                    <w:t xml:space="preserve">−1.18</w:t>
+                  </w:r>
+                </w:p>
+              </w:tc>
+              <w:tc>
+                <w:tcPr/>
+                <w:p>
+                  <w:pPr>
+                    <w:pStyle w:val="Compact"/>
+                    <w:jc w:val="center"/>
+                  </w:pPr>
+                  <w:r>
+                    <w:t xml:space="preserve">−1.97 to −0.39</w:t>
                   </w:r>
                 </w:p>
               </w:tc>
@@ -5185,19 +5423,19 @@
                     <w:jc w:val="center"/>
                   </w:pPr>
                   <w:r>
-                    <w:t xml:space="preserve">-0.2</w:t>
-                  </w:r>
-                </w:p>
-              </w:tc>
-              <w:tc>
-                <w:tcPr/>
-                <w:p>
-                  <w:pPr>
-                    <w:pStyle w:val="Compact"/>
-                    <w:jc w:val="center"/>
-                  </w:pPr>
-                  <w:r>
-                    <w:t xml:space="preserve">-2.1 to 1.7</w:t>
+                    <w:t xml:space="preserve">−0.2</w:t>
+                  </w:r>
+                </w:p>
+              </w:tc>
+              <w:tc>
+                <w:tcPr/>
+                <w:p>
+                  <w:pPr>
+                    <w:pStyle w:val="Compact"/>
+                    <w:jc w:val="center"/>
+                  </w:pPr>
+                  <w:r>
+                    <w:t xml:space="preserve">−2.1 to 1.7</w:t>
                   </w:r>
                 </w:p>
               </w:tc>
@@ -5301,19 +5539,19 @@
                     <w:jc w:val="center"/>
                   </w:pPr>
                   <w:r>
-                    <w:t xml:space="preserve">-116</w:t>
-                  </w:r>
-                </w:p>
-              </w:tc>
-              <w:tc>
-                <w:tcPr/>
-                <w:p>
-                  <w:pPr>
-                    <w:pStyle w:val="Compact"/>
-                    <w:jc w:val="center"/>
-                  </w:pPr>
-                  <w:r>
-                    <w:t xml:space="preserve">-320 to 89</w:t>
+                    <w:t xml:space="preserve">−116</w:t>
+                  </w:r>
+                </w:p>
+              </w:tc>
+              <w:tc>
+                <w:tcPr/>
+                <w:p>
+                  <w:pPr>
+                    <w:pStyle w:val="Compact"/>
+                    <w:jc w:val="center"/>
+                  </w:pPr>
+                  <w:r>
+                    <w:t xml:space="preserve">−320 to 89</w:t>
                   </w:r>
                 </w:p>
               </w:tc>
@@ -5417,19 +5655,19 @@
                     <w:jc w:val="center"/>
                   </w:pPr>
                   <w:r>
-                    <w:t xml:space="preserve">-0.02</w:t>
-                  </w:r>
-                </w:p>
-              </w:tc>
-              <w:tc>
-                <w:tcPr/>
-                <w:p>
-                  <w:pPr>
-                    <w:pStyle w:val="Compact"/>
-                    <w:jc w:val="center"/>
-                  </w:pPr>
-                  <w:r>
-                    <w:t xml:space="preserve">-0.09 to 0.05</w:t>
+                    <w:t xml:space="preserve">−0.02</w:t>
+                  </w:r>
+                </w:p>
+              </w:tc>
+              <w:tc>
+                <w:tcPr/>
+                <w:p>
+                  <w:pPr>
+                    <w:pStyle w:val="Compact"/>
+                    <w:jc w:val="center"/>
+                  </w:pPr>
+                  <w:r>
+                    <w:t xml:space="preserve">−0.09 to 0.05</w:t>
                   </w:r>
                 </w:p>
               </w:tc>
@@ -5617,7 +5855,7 @@
           <w:rPr>
             <w:rStyle w:val="Hyperlink"/>
           </w:rPr>
-          <w:t xml:space="preserve">Section 13.3.1</w:t>
+          <w:t xml:space="preserve">Section 13.6.1</w:t>
         </w:r>
       </w:hyperlink>
       <w:r>
@@ -5633,7 +5871,7 @@
         </w:numPr>
       </w:pPr>
       <w:r>
-        <w:t xml:space="preserve">The selected model of pool host cell protein. Of the 9 models whose AICc lies within 2 units of that of the selected model, 2 would not qualify the scale-down model (</w:t>
+        <w:t xml:space="preserve">The selected model of pool host cell protein. The rule of the model selection takes the model with the lowest AICc, so the selected model decides the qualification. The other models whose AICc lies within 2 units of it are a sensitivity analysis, and 2 of them would not qualify the scale-down model (</w:t>
       </w:r>
       <w:hyperlink w:anchor="sec-rsm-hcp">
         <w:r>
@@ -5652,7 +5890,21 @@
         <w:pStyle w:val="FirstParagraph"/>
       </w:pPr>
       <w:r>
-        <w:t xml:space="preserve">Leached Protein A is 1.18 ppm lower in the scale-down model. The 90 % confidence interval of the difference, 0.39 to 1.97 ppm lower, excludes zero, and each scale-down run was below the manufacturing mean. The expected cause is cleavage of the ligand by harvest proteases. At manufacturing scale the clarified harvest is held longer before capture. Proteolytic activity in the harvest is expected to rise while it is held, and the load then cleaves more ligand from the resin during loading. This study does not test that cause. With the offset at either end of its interval the conclusion for leached Protein A is the same, and the model is qualified for it.</w:t>
+        <w:t xml:space="preserve">Leached Protein A is 1.18 ppm lower in the scale-down model. The 90 % confidence interval of the difference, 0.39 to 1.97 ppm lower, excludes zero, and each scale-down run was below the manufacturing mean. The expected cause is cleavage of the ligand by harvest proteases. At manufacturing scale the clarified harvest is held longer before capture. Proteolytic activity in the harvest is expected to rise while it is held, and the load then cleaves more ligand from the resin during loading. This study does not test that cause. With the offset at either end of its interval the conclusion for leached Protein A is the same, and the model is qualified for it. On the 3 runs of the planned study S-PA-SDM alone, the two scales differ in leached Protein A (p = 0.037). PCP-005 Version 1.0 required such a difference to be investigated, and no investigation is recorded (deviation DEV-005-04,</w:t>
+      </w:r>
+      <w:r>
+        <w:t xml:space="preserve"> </w:t>
+      </w:r>
+      <w:hyperlink w:anchor="sec-dev04">
+        <w:r>
+          <w:rPr>
+            <w:rStyle w:val="Hyperlink"/>
+          </w:rPr>
+          <w:t xml:space="preserve">Section 13.4</w:t>
+        </w:r>
+      </w:hyperlink>
+      <w:r>
+        <w:t xml:space="preserve">).</w:t>
       </w:r>
     </w:p>
     <w:p>
@@ -6643,7 +6895,7 @@
         <w:pStyle w:val="BodyText"/>
       </w:pPr>
       <w:r>
-        <w:t xml:space="preserve">The screening design ran before the method decision AMD-001 set nrCE-SDS as the method for fragments, and its pools were not retained. Its fragment results are by SEC only and are not used for any decision. The response-surface pools were retained frozen and were tested by nrCE-SDS in study S-PA-RET (2026-04-06 to 2026-04-17). On those pools SEC read fragments higher than nrCE-SDS by 0.12 to 1.37 percentage points (median 0.36). The hold study ran after AMD-001 and measured fragments by nrCE-SDS alone.</w:t>
+        <w:t xml:space="preserve">The screening design ran before the method decision AMD-001 set nrCE-SDS as the method for fragments, and its pools were not retained. Its fragment results are by SEC only and are not used for any decision. The univariate study S-PA-UNI ran before AMD-001, and its samples were not retained, so its fragment results are by SEC only and are not used for any decision. The response-surface pools were retained frozen and were tested by nrCE-SDS in study S-PA-RET (2026-04-06 to 2026-04-17). On those pools SEC read fragments higher than nrCE-SDS by 0.12 to 1.37 percentage points (median 0.36). The hold study ran after AMD-001 and measured fragments by nrCE-SDS alone.</w:t>
       </w:r>
     </w:p>
     <w:bookmarkEnd w:id="41"/>
@@ -7328,7 +7580,7 @@
         </w:numPr>
       </w:pPr>
       <w:r>
-        <w:t xml:space="preserve">Residuals. Regressions of the absolute residuals on the predicted values, and of the residuals on run order, show no slope significant at α = 0.05, and no run has a Cook’s distance above 4/n (0.14 for 28 runs).</w:t>
+        <w:t xml:space="preserve">Residuals. Regressions of the absolute residuals on the predicted values, and of the residuals on run order, show no slope significant at α = 0.05. A run with a Cook’s distance above 4/n (0.14 for 28 runs) is examined by deleting it and repeating the judgement. The model fails the criterion only where a run’s Cook’s distance exceeds the median of the F distribution with p and n − p degrees of freedom, p being the number of coefficients of the model.</w:t>
       </w:r>
     </w:p>
     <w:p>
@@ -7352,7 +7604,7 @@
         <w:pStyle w:val="BodyText"/>
       </w:pPr>
       <w:r>
-        <w:t xml:space="preserve">The PAR analysis follows PCMP-001 §6.4. The univariate PAR, which PCP-005 §8.2 calls the set-point analysis, holds the other parameters at their set-points. It is judged on the prediction of the model, the median for pool host cell protein and the mean for the other outputs. The NOR-propagated PAR is a multivariate PAR. It is the range of a parameter over which a single batch meets the criterion while the other parameters vary within their NORs. It is computed by Monte Carlo at 81 grid points across the range studied, with 2,000 operating points at each. Each other parameter is drawn from a normal distribution centred on its set-point, with a standard deviation of one sixth of its NOR, clipped to its range studied, and the coefficients of the model are drawn from their estimated covariance together with the residual. At each grid point the 97.5th percentile of the simulated batches must meet an upper criterion, so that at least 97.5 % of them meet it. The NOR-propagated PAR is the one that supports a PAR carried into the control strategy. The design space is computed on the median predictions of pool host cell protein, on a grid of 41 points per factor over the range studied (</w:t>
+        <w:t xml:space="preserve">The PAR analysis follows PCMP-001 §6.4. The univariate PAR, which PCP-005 §8.2 calls the set-point analysis, holds the other parameters at their set-points. It is judged on the prediction of the model, the median for pool host cell protein and the mean for the other outputs. The NOR-propagated PAR is a multivariate PAR. It is the range of a parameter over which a single batch meets the criterion while the other parameters vary within their NORs. It is computed by Monte Carlo at 81 grid points across the range studied, with 2,000 operating points at each. Each other parameter is drawn from a normal distribution centred on its set-point, with a standard deviation of one sixth of its NOR, clipped to its range studied, and the coefficients of the model are drawn from their estimated covariance together with the residual. At each grid point the 97.5th percentile of the simulated batches must meet an upper criterion, so that at least 97.5 % of them meet it. The NOR-propagated PAR is the one that supports a PAR carried into the control strategy. The design space is drawn on the 95 % prediction interval of a single run, on a grid of 41 points per factor over the range studied (</w:t>
       </w:r>
       <w:hyperlink w:anchor="sec-ds">
         <w:r>
@@ -7371,7 +7623,7 @@
         <w:pStyle w:val="BodyText"/>
       </w:pPr>
       <w:r>
-        <w:t xml:space="preserve">Because no selected model meets criterion 5, each output with a criterion was also examined by an influence analysis, in which each run with a Cook’s distance above 4/n is deleted in turn, the model selection repeated and the output judged over the NOR again, and by the size of each residual trend against the criterion of its output (</w:t>
+        <w:t xml:space="preserve">For each output with a criterion, each run with a Cook’s distance above 4/n was deleted in turn, the model selection repeated and the output judged over the NOR again, as criterion 5 requires. Where a selected model does not meet criterion 5, the size of each residual trend is stated against the criterion of its output, and the use of that model for the ranges and the design space is the discrepancy PD-005-02 (</w:t>
       </w:r>
       <w:hyperlink w:anchor="sec-resid">
         <w:r>
@@ -7382,7 +7634,7 @@
         </w:r>
       </w:hyperlink>
       <w:r>
-        <w:t xml:space="preserve">, discrepancy PD-005-02).</w:t>
+        <w:t xml:space="preserve">).</w:t>
       </w:r>
     </w:p>
     <w:p>
@@ -8149,7 +8401,21 @@
         </w:r>
       </w:hyperlink>
       <w:r>
-        <w:t xml:space="preserve">. Each study began after PCP-005 Version 1.0 was approved on 2025-11-03.</w:t>
+        <w:t xml:space="preserve">. Each study began after PCP-005 Version 1.0 was approved on 2025-11-03. Study S-PA-UNI ran before the response-surface design began, against the order of PCP-005 §11, in which the univariate assessments come fourth (deviation DEV-005-05,</w:t>
+      </w:r>
+      <w:r>
+        <w:t xml:space="preserve"> </w:t>
+      </w:r>
+      <w:hyperlink w:anchor="sec-dev05">
+        <w:r>
+          <w:rPr>
+            <w:rStyle w:val="Hyperlink"/>
+          </w:rPr>
+          <w:t xml:space="preserve">Section 13.5</w:t>
+        </w:r>
+      </w:hyperlink>
+      <w:r>
+        <w:t xml:space="preserve">).</w:t>
       </w:r>
     </w:p>
     <w:tbl>
@@ -8907,7 +9173,32 @@
         <w:pStyle w:val="FirstParagraph"/>
       </w:pPr>
       <w:r>
-        <w:t xml:space="preserve">Operating temperature and bed height were studied one factor at a time in the univariate study S-PA-UNI (2025-12-08 to 2025-12-12), with the other parameters at their set-points. Each was run 2 times at the low and the high end of its range studied. The 3 set-point runs of the planned qualification study S-PA-SDM served as the reference, as PCP-005 §6.4 planned. Bed height was varied at the set-point linear velocity, so that the residence time changed with it. The shortest bed gives a residence time of 3 min, shorter than any run of the designs. The responses were pool host cell protein, step yield and leached Protein A. Fragments were not measured in this study, which ran before AMD-001. For each attribute measured, the range of operating temperature or of bed height is supported when every individual result at both ends meets its criterion at manufacturing scale (PCP-005 §6.4). A univariate study cannot detect an interaction. The ranges of these two parameters are therefore supported only with the other parameters at their set-points.</w:t>
+        <w:t xml:space="preserve">Operating temperature and bed height were studied one factor at a time in the univariate study S-PA-UNI (2025-12-08 to 2025-12-12), with the other parameters at their set-points. Each was run 2 times at the low and the high end of its range studied. The 3 set-point runs of the planned qualification study S-PA-SDM served as the reference, in place of the runs at the centre of each range that PCP-005 §6.4 requires (deviation DEV-005-03,</w:t>
+      </w:r>
+      <w:r>
+        <w:t xml:space="preserve"> </w:t>
+      </w:r>
+      <w:hyperlink w:anchor="sec-dev03">
+        <w:r>
+          <w:rPr>
+            <w:rStyle w:val="Hyperlink"/>
+          </w:rPr>
+          <w:t xml:space="preserve">Section 13.3</w:t>
+        </w:r>
+      </w:hyperlink>
+      <w:r>
+        <w:t xml:space="preserve">). Bed height was varied at the set-point linear velocity, so that the residence time changed with it. The shortest bed gives a residence time of 3 min, shorter than any run of the designs. As PCP-005 §6.4 requires, the responses were those of the multivariate designs, pool host cell protein, step yield and leached Protein A, with aggregate and fragments by SEC. Fragments were not measured by nrCE-SDS (</w:t>
+      </w:r>
+      <w:hyperlink w:anchor="sec-methods">
+        <w:r>
+          <w:rPr>
+            <w:rStyle w:val="Hyperlink"/>
+          </w:rPr>
+          <w:t xml:space="preserve">Section 3.3</w:t>
+        </w:r>
+      </w:hyperlink>
+      <w:r>
+        <w:t xml:space="preserve">). For pool host cell protein and leached Protein A, the range of operating temperature or of bed height is supported when every individual result at both ends meets its criterion at manufacturing scale (PCP-005 §6.4). A univariate study cannot detect an interaction. The ranges of these two parameters are therefore supported only with the other parameters at their set-points.</w:t>
       </w:r>
     </w:p>
     <w:bookmarkEnd w:id="54"/>
@@ -8932,7 +9223,7 @@
           <w:rPr>
             <w:rStyle w:val="Hyperlink"/>
           </w:rPr>
-          <w:t xml:space="preserve">Section 13.3.2</w:t>
+          <w:t xml:space="preserve">Section 13.6.2</w:t>
         </w:r>
       </w:hyperlink>
       <w:r>
@@ -8944,7 +9235,7 @@
         <w:pStyle w:val="BodyText"/>
       </w:pPr>
       <w:r>
-        <w:t xml:space="preserve">The plan set no hold criterion, because it foresaw no hold study. The held eluate is the load of low-pH viral inactivation, so it is judged against the intermediate acceptance criteria of that load, which the rule of PCMP-001 §7.3 gives. For aggregate and acidic variants they equal the criteria of the production bioreactor output, because capture is expected to leave both unchanged (</w:t>
+        <w:t xml:space="preserve">The plan set no hold criterion, because it foresaw no hold study. The held eluate is the load of low-pH viral inactivation, so it is judged against the intermediate acceptance criteria in force for that load, as the verification of PCMP-001 §7.5 left them, and not against their a priori values. For aggregate and acidic variants they equal the criteria of the production bioreactor output, because capture is expected to leave both unchanged (</w:t>
       </w:r>
       <w:hyperlink w:anchor="sec-prior">
         <w:r>
@@ -15371,7 +15662,7 @@
         </w:r>
       </w:hyperlink>
       <w:r>
-        <w:t xml:space="preserve">). The qualification therefore also rests on the choice of the model with the lowest AICc.</w:t>
+        <w:t xml:space="preserve">). The rule of the model selection takes the model with the lowest AICc, so the selected model decides the qualification. The other models are a sensitivity analysis. It shows that the qualification would change with 2 models that the data support about as well as the selected one.</w:t>
       </w:r>
     </w:p>
     <w:p>
@@ -16255,7 +16546,7 @@
         <w:pStyle w:val="FirstParagraph"/>
       </w:pPr>
       <w:r>
-        <w:t xml:space="preserve">The selected model of leached Protein A has no term. Within the range studied, leached Protein A does not depend on the 4 parameters of the multivariate design by more than the design resolves. With the 28 runs and the scatter of this output, the half-width of the 95 % confidence interval of a main effect across the range studied is 0.67 ppm in a model of the four main effects. An effect smaller than this would not be told apart from zero. The model is the mean of the runs, 2.94 ppm in the scale-down model and 4.12 ppm at manufacturing scale. In the scale-down model leached Protein A ranged from 1.70 to 4.61 ppm across the runs of both designs. At manufacturing scale the highest result corresponds to 5.79 ppm, and every run met the intermediate acceptance criterion of ≤ 158 ppm (finding F5). These results use the re-assay of run 11. With the first result of that run in its place, the selection keeps end of pool collect, and that model is not significant (</w:t>
+        <w:t xml:space="preserve">The selected model of leached Protein A has no term. Within the range studied, leached Protein A does not depend on the 4 parameters of the multivariate design by more than the design resolves. With the 28 runs and the scatter of this output, the half-width of the 95 % confidence interval of a main effect across the range studied is 0.67 ppm in a model of the four main effects. An effect smaller than this would not be told apart from zero. The model is the mean of the runs, 2.94 ppm in the scale-down model and 4.12 ppm at manufacturing scale. In the scale-down model leached Protein A ranged from 1.70 to 4.61 ppm across the runs of both designs. At manufacturing scale the highest result corresponds to 5.79 ppm, and every run met the intermediate acceptance criterion of ≤ 158 ppm (finding F5). These results use the re-assay of run 11. With the first result of that run in its place, the selection keeps end of pool collect, and that model meets criteria 2 to 4 (</w:t>
       </w:r>
       <w:hyperlink w:anchor="sec-dev02">
         <w:r>
@@ -16705,12 +16996,14 @@
               <w:tblLook w:firstRow="1" w:lastRow="1" w:firstColumn="0" w:lastColumn="0" w:noHBand="0" w:noVBand="0" w:val="0020"/>
             </w:tblPr>
             <w:tblGrid>
-              <w:gridCol w:w="1320"/>
-              <w:gridCol w:w="1320"/>
-              <w:gridCol w:w="1320"/>
-              <w:gridCol w:w="1320"/>
-              <w:gridCol w:w="1320"/>
-              <w:gridCol w:w="1320"/>
+              <w:gridCol w:w="990"/>
+              <w:gridCol w:w="990"/>
+              <w:gridCol w:w="990"/>
+              <w:gridCol w:w="990"/>
+              <w:gridCol w:w="990"/>
+              <w:gridCol w:w="990"/>
+              <w:gridCol w:w="990"/>
+              <w:gridCol w:w="990"/>
             </w:tblGrid>
             <w:tr>
               <w:trPr>
@@ -16818,6 +17111,36 @@
                   </w:r>
                 </w:p>
               </w:tc>
+              <w:tc>
+                <w:tcPr/>
+                <w:p>
+                  <w:pPr>
+                    <w:pStyle w:val="Compact"/>
+                    <w:jc w:val="center"/>
+                  </w:pPr>
+                  <w:r>
+                    <w:t xml:space="preserve">F</w:t>
+                  </w:r>
+                  <w:r>
+                    <w:br/>
+                  </w:r>
+                  <w:r>
+                    <w:t xml:space="preserve">median</w:t>
+                  </w:r>
+                </w:p>
+              </w:tc>
+              <w:tc>
+                <w:tcPr/>
+                <w:p>
+                  <w:pPr>
+                    <w:pStyle w:val="Compact"/>
+                    <w:jc w:val="center"/>
+                  </w:pPr>
+                  <w:r>
+                    <w:t xml:space="preserve">Met</w:t>
+                  </w:r>
+                </w:p>
+              </w:tc>
             </w:tr>
             <w:tr>
               <w:tc>
@@ -16892,6 +17215,30 @@
                   </w:r>
                 </w:p>
               </w:tc>
+              <w:tc>
+                <w:tcPr/>
+                <w:p>
+                  <w:pPr>
+                    <w:pStyle w:val="Compact"/>
+                    <w:jc w:val="center"/>
+                  </w:pPr>
+                  <w:r>
+                    <w:t xml:space="preserve">0.92</w:t>
+                  </w:r>
+                </w:p>
+              </w:tc>
+              <w:tc>
+                <w:tcPr/>
+                <w:p>
+                  <w:pPr>
+                    <w:pStyle w:val="Compact"/>
+                    <w:jc w:val="center"/>
+                  </w:pPr>
+                  <w:r>
+                    <w:t xml:space="preserve">Yes</w:t>
+                  </w:r>
+                </w:p>
+              </w:tc>
             </w:tr>
             <w:tr>
               <w:tc>
@@ -16966,6 +17313,30 @@
                   </w:r>
                 </w:p>
               </w:tc>
+              <w:tc>
+                <w:tcPr/>
+                <w:p>
+                  <w:pPr>
+                    <w:pStyle w:val="Compact"/>
+                    <w:jc w:val="center"/>
+                  </w:pPr>
+                  <w:r>
+                    <w:t xml:space="preserve">0.92</w:t>
+                  </w:r>
+                </w:p>
+              </w:tc>
+              <w:tc>
+                <w:tcPr/>
+                <w:p>
+                  <w:pPr>
+                    <w:pStyle w:val="Compact"/>
+                    <w:jc w:val="center"/>
+                  </w:pPr>
+                  <w:r>
+                    <w:t xml:space="preserve">Yes</w:t>
+                  </w:r>
+                </w:p>
+              </w:tc>
             </w:tr>
             <w:tr>
               <w:tc>
@@ -17040,6 +17411,30 @@
                   </w:r>
                 </w:p>
               </w:tc>
+              <w:tc>
+                <w:tcPr/>
+                <w:p>
+                  <w:pPr>
+                    <w:pStyle w:val="Compact"/>
+                    <w:jc w:val="center"/>
+                  </w:pPr>
+                  <w:r>
+                    <w:t xml:space="preserve">0.47</w:t>
+                  </w:r>
+                </w:p>
+              </w:tc>
+              <w:tc>
+                <w:tcPr/>
+                <w:p>
+                  <w:pPr>
+                    <w:pStyle w:val="Compact"/>
+                    <w:jc w:val="center"/>
+                  </w:pPr>
+                  <w:r>
+                    <w:t xml:space="preserve">No</w:t>
+                  </w:r>
+                </w:p>
+              </w:tc>
             </w:tr>
             <w:tr>
               <w:tc>
@@ -17114,11 +17509,35 @@
                   </w:r>
                 </w:p>
               </w:tc>
+              <w:tc>
+                <w:tcPr/>
+                <w:p>
+                  <w:pPr>
+                    <w:pStyle w:val="Compact"/>
+                    <w:jc w:val="center"/>
+                  </w:pPr>
+                  <w:r>
+                    <w:t xml:space="preserve">0.81</w:t>
+                  </w:r>
+                </w:p>
+              </w:tc>
+              <w:tc>
+                <w:tcPr/>
+                <w:p>
+                  <w:pPr>
+                    <w:pStyle w:val="Compact"/>
+                    <w:jc w:val="center"/>
+                  </w:pPr>
+                  <w:r>
+                    <w:t xml:space="preserve">No</w:t>
+                  </w:r>
+                </w:p>
+              </w:tc>
             </w:tr>
             <w:tr>
               <w:tc>
                 <w:tcPr>
-                  <w:gridSpan w:val="6"/>
+                  <w:gridSpan w:val="8"/>
                 </w:tcPr>
                 <w:p>
                   <w:pPr>
@@ -17126,7 +17545,7 @@
                     <w:jc w:val="center"/>
                   </w:pPr>
                   <w:r>
-                    <w:t xml:space="preserve">Trend on predicted, the p-value of the regression of the absolute residuals on the predicted values (n.a., a model with no term predicts a single value). Trend on run order, the p-value of the regression of the residuals on the run order of execution, which Appendix B gives. Cook's D, Cook's distance. Runs above 4/n, the number of runs with a Cook's distance above 0.14.</w:t>
+                    <w:t xml:space="preserve">Trend on predicted, the p-value of the regression of the absolute residuals on the predicted values (n.a., a model with no term predicts a single value). Trend on run order, the p-value of the regression of the residuals on the run order of execution, which Appendix B gives. Cook's D, Cook's distance. Runs above 4/n, the number of runs with a Cook's distance above 0.14, each examined by deleting it. F median, the median of the F distribution with p and n − p degrees of freedom, p being the number of coefficients of the model, above which a run fails it. Met, no trend significant at α = 0.05 and no run above the F median.</w:t>
                   </w:r>
                 </w:p>
               </w:tc>
@@ -17150,7 +17569,7 @@
         <w:pStyle w:val="BodyText"/>
       </w:pPr>
       <w:r>
-        <w:t xml:space="preserve">Every selected model has runs above the Cook’s distance limit of 4/n, between 1 and 3 per output, so criterion 5 is not met for any output. The cut-off flags runs even when a model is correct. In data simulated from each selected model with normal residuals, it flags on average between 1.3 and 2.5 of the 28 runs, and at least one run in 87 to 96 % of the data sets. A flagged run is therefore not by itself a sign of a wrong model. Whether a conclusion depends on a flagged run is tested by deleting it.</w:t>
+        <w:t xml:space="preserve">Every selected model has runs above the Cook’s distance limit of 4/n, between 1 and 3 per output. The cut-off flags runs even when a model is correct. In data simulated from each selected model with normal residuals, it flags on average between 1.3 and 2.5 of the 28 runs, and at least one run in 87 to 96 % of the data sets. A flagged run is therefore examined, and it fails the model only where its Cook’s distance exceeds the median of F(p, n − p), 0.47 to 0.92 for these models. No run exceeds it, and the largest Cook’s distance is 0.26. Criterion 5 is therefore met for pool host cell protein and step yield, and it is not met for leached Protein A and fragments, because of their residual trends.</w:t>
       </w:r>
     </w:p>
     <w:p>
@@ -17158,7 +17577,7 @@
         <w:pStyle w:val="BodyText"/>
       </w:pPr>
       <w:r>
-        <w:t xml:space="preserve">For each output with a criterion, each run above the limit was deleted in turn, the model selection repeated, and the output judged over the NOR again. For pool host cell protein these are runs 6, 12 and 23. With any one of them deleted, the upper prediction limit over the NOR lies between 14,978 and 15,252 ng/mg at manufacturing scale, against 15,349 ng/mg with every run. With the offset at the low end of its interval it is at most 16,657 ng/mg, below the criterion of ≤ 17,069 ng/mg. The coefficients of protein load and elution buffer pH change by at most 3.1 %. Deleting run 23 adds the interaction of protein load with elution buffer pH and the square of protein load to the selected model (</w:t>
+        <w:t xml:space="preserve">For each output with a criterion, each run above 4/n was deleted in turn, the model selection repeated, and the output judged over the NOR again. For pool host cell protein these are runs 6, 12 and 23. With any one of them deleted, the upper prediction limit over the NOR lies between 14,978 and 15,252 ng/mg at manufacturing scale, against 15,349 ng/mg with every run. With the offset at the low end of its interval it is at most 16,657 ng/mg, below the criterion of ≤ 17,069 ng/mg. The coefficients of protein load and elution buffer pH change by at most 3.1 %. Deleting run 23 adds the interaction of protein load with elution buffer pH and the square of protein load to the selected model (</w:t>
       </w:r>
       <w:hyperlink w:anchor="sec-dev01">
         <w:r>
@@ -17198,7 +17617,21 @@
         <w:t xml:space="preserve"> </w:t>
       </w:r>
       <w:r>
-        <w:t xml:space="preserve">gives the results of the univariate study S-PA-UNI for pool host cell protein, step yield and leached Protein A. Each end of each range is the arithmetic mean of 2 runs. The difference is taken from the arithmetic mean of the 3 set-point runs of the planned qualification study S-PA-SDM, with its 95 % confidence interval (Student t, pooled variance). Both are in the scale-down model. The offset of leached Protein A is a difference, and it cancels from the difference. The offset of pool host cell protein is a ratio, and at manufacturing scale each difference in pool host cell protein would be divided by it, a change of 3 %.</w:t>
+        <w:t xml:space="preserve">gives the results of the univariate study S-PA-UNI for pool host cell protein, step yield and leached Protein A. Each end of each range is the arithmetic mean of 2 runs. The difference is taken from the arithmetic mean of the 3 set-point runs of the planned qualification study S-PA-SDM, with its 95 % confidence interval (Student t, pooled variance). The qualification runs are the reference because the univariate study made no run at the centre of each range (DEV-005-03,</w:t>
+      </w:r>
+      <w:r>
+        <w:t xml:space="preserve"> </w:t>
+      </w:r>
+      <w:hyperlink w:anchor="sec-dev03">
+        <w:r>
+          <w:rPr>
+            <w:rStyle w:val="Hyperlink"/>
+          </w:rPr>
+          <w:t xml:space="preserve">Section 13.3</w:t>
+        </w:r>
+      </w:hyperlink>
+      <w:r>
+        <w:t xml:space="preserve">). Both are in the scale-down model. The offset of leached Protein A is a difference, and it cancels from the difference. The offset of pool host cell protein is a ratio, and at manufacturing scale each difference in pool host cell protein would be divided by it, a change of 3 %.</w:t>
       </w:r>
       <w:r>
         <w:t xml:space="preserve"> </w:t>
@@ -17832,7 +18265,7 @@
                     <w:jc w:val="center"/>
                   </w:pPr>
                   <w:r>
-                    <w:t xml:space="preserve">Δ, the arithmetic mean of the 2 runs at the setting minus the arithmetic mean of the 3 set-point runs of study S-PA-SDM, both in the scale-down model. CI, confidence interval. HCP, pool host cell protein. LPA, leached Protein A. Yield in percentage points. Fragments were not measured in this study.</w:t>
+                    <w:t xml:space="preserve">Δ, the arithmetic mean of the 2 runs at the setting minus the arithmetic mean of the 3 set-point runs of study S-PA-SDM, both in the scale-down model. CI, confidence interval. HCP, pool host cell protein. LPA, leached Protein A. Yield in percentage points. Aggregate and fragments by SEC have no difference, because the set-point runs of study S-PA-SDM were not tested by SEC. Fragments by nrCE-SDS were not tested in this study.</w:t>
                   </w:r>
                 </w:p>
               </w:tc>
@@ -17892,16 +18325,19 @@
           <w:tbl>
             <w:tblPr>
               <w:tblStyle w:val="Table"/>
-              <w:tblW w:type="auto" w:w="0"/>
+              <w:tblW w:type="pct" w:w="5000"/>
+              <w:tblLayout w:type="fixed"/>
               <w:tblLook w:firstRow="1" w:lastRow="1" w:firstColumn="0" w:lastColumn="0" w:noHBand="0" w:noVBand="0" w:val="0020"/>
             </w:tblPr>
             <w:tblGrid>
-              <w:gridCol w:w="1320"/>
-              <w:gridCol w:w="1320"/>
-              <w:gridCol w:w="1320"/>
-              <w:gridCol w:w="1320"/>
-              <w:gridCol w:w="1320"/>
-              <w:gridCol w:w="1320"/>
+              <w:gridCol w:w="990"/>
+              <w:gridCol w:w="990"/>
+              <w:gridCol w:w="990"/>
+              <w:gridCol w:w="990"/>
+              <w:gridCol w:w="990"/>
+              <w:gridCol w:w="990"/>
+              <w:gridCol w:w="990"/>
+              <w:gridCol w:w="990"/>
             </w:tblGrid>
             <w:tr>
               <w:trPr>
@@ -17951,31 +18387,85 @@
                     <w:jc w:val="center"/>
                   </w:pPr>
                   <w:r>
-                    <w:t xml:space="preserve">HCP (ng/mg)</w:t>
-                  </w:r>
-                </w:p>
-              </w:tc>
-              <w:tc>
-                <w:tcPr/>
-                <w:p>
-                  <w:pPr>
-                    <w:pStyle w:val="Compact"/>
-                    <w:jc w:val="center"/>
-                  </w:pPr>
-                  <w:r>
-                    <w:t xml:space="preserve">Yield (%)</w:t>
-                  </w:r>
-                </w:p>
-              </w:tc>
-              <w:tc>
-                <w:tcPr/>
-                <w:p>
-                  <w:pPr>
-                    <w:pStyle w:val="Compact"/>
-                    <w:jc w:val="center"/>
-                  </w:pPr>
-                  <w:r>
-                    <w:t xml:space="preserve">LPA (ppm)</w:t>
+                    <w:t xml:space="preserve">HCP</w:t>
+                  </w:r>
+                  <w:r>
+                    <w:br/>
+                  </w:r>
+                  <w:r>
+                    <w:t xml:space="preserve">(ng/mg)</w:t>
+                  </w:r>
+                </w:p>
+              </w:tc>
+              <w:tc>
+                <w:tcPr/>
+                <w:p>
+                  <w:pPr>
+                    <w:pStyle w:val="Compact"/>
+                    <w:jc w:val="center"/>
+                  </w:pPr>
+                  <w:r>
+                    <w:t xml:space="preserve">Yield</w:t>
+                  </w:r>
+                  <w:r>
+                    <w:br/>
+                  </w:r>
+                  <w:r>
+                    <w:t xml:space="preserve">(%)</w:t>
+                  </w:r>
+                </w:p>
+              </w:tc>
+              <w:tc>
+                <w:tcPr/>
+                <w:p>
+                  <w:pPr>
+                    <w:pStyle w:val="Compact"/>
+                    <w:jc w:val="center"/>
+                  </w:pPr>
+                  <w:r>
+                    <w:t xml:space="preserve">LPA</w:t>
+                  </w:r>
+                  <w:r>
+                    <w:br/>
+                  </w:r>
+                  <w:r>
+                    <w:t xml:space="preserve">(ppm)</w:t>
+                  </w:r>
+                </w:p>
+              </w:tc>
+              <w:tc>
+                <w:tcPr/>
+                <w:p>
+                  <w:pPr>
+                    <w:pStyle w:val="Compact"/>
+                    <w:jc w:val="center"/>
+                  </w:pPr>
+                  <w:r>
+                    <w:t xml:space="preserve">HMW,</w:t>
+                  </w:r>
+                  <w:r>
+                    <w:br/>
+                  </w:r>
+                  <w:r>
+                    <w:t xml:space="preserve">SEC (%)</w:t>
+                  </w:r>
+                </w:p>
+              </w:tc>
+              <w:tc>
+                <w:tcPr/>
+                <w:p>
+                  <w:pPr>
+                    <w:pStyle w:val="Compact"/>
+                    <w:jc w:val="center"/>
+                  </w:pPr>
+                  <w:r>
+                    <w:t xml:space="preserve">LMW,</w:t>
+                  </w:r>
+                  <w:r>
+                    <w:br/>
+                  </w:r>
+                  <w:r>
+                    <w:t xml:space="preserve">SEC (%)</w:t>
                   </w:r>
                 </w:p>
               </w:tc>
@@ -18054,6 +18544,30 @@
                   </w:pPr>
                   <w:r>
                     <w:t xml:space="preserve">2.51</w:t>
+                  </w:r>
+                </w:p>
+              </w:tc>
+              <w:tc>
+                <w:tcPr/>
+                <w:p>
+                  <w:pPr>
+                    <w:pStyle w:val="Compact"/>
+                    <w:jc w:val="center"/>
+                  </w:pPr>
+                  <w:r>
+                    <w:t xml:space="preserve">1.59</w:t>
+                  </w:r>
+                </w:p>
+              </w:tc>
+              <w:tc>
+                <w:tcPr/>
+                <w:p>
+                  <w:pPr>
+                    <w:pStyle w:val="Compact"/>
+                    <w:jc w:val="center"/>
+                  </w:pPr>
+                  <w:r>
+                    <w:t xml:space="preserve">1.42</w:t>
                   </w:r>
                 </w:p>
               </w:tc>
@@ -18125,6 +18639,30 @@
                   </w:r>
                 </w:p>
               </w:tc>
+              <w:tc>
+                <w:tcPr/>
+                <w:p>
+                  <w:pPr>
+                    <w:pStyle w:val="Compact"/>
+                    <w:jc w:val="center"/>
+                  </w:pPr>
+                  <w:r>
+                    <w:t xml:space="preserve">1.55</w:t>
+                  </w:r>
+                </w:p>
+              </w:tc>
+              <w:tc>
+                <w:tcPr/>
+                <w:p>
+                  <w:pPr>
+                    <w:pStyle w:val="Compact"/>
+                    <w:jc w:val="center"/>
+                  </w:pPr>
+                  <w:r>
+                    <w:t xml:space="preserve">1.34</w:t>
+                  </w:r>
+                </w:p>
+              </w:tc>
             </w:tr>
             <w:tr>
               <w:tc>
@@ -18198,6 +18736,30 @@
                   </w:r>
                 </w:p>
               </w:tc>
+              <w:tc>
+                <w:tcPr/>
+                <w:p>
+                  <w:pPr>
+                    <w:pStyle w:val="Compact"/>
+                    <w:jc w:val="center"/>
+                  </w:pPr>
+                  <w:r>
+                    <w:t xml:space="preserve">1.56</w:t>
+                  </w:r>
+                </w:p>
+              </w:tc>
+              <w:tc>
+                <w:tcPr/>
+                <w:p>
+                  <w:pPr>
+                    <w:pStyle w:val="Compact"/>
+                    <w:jc w:val="center"/>
+                  </w:pPr>
+                  <w:r>
+                    <w:t xml:space="preserve">1.24</w:t>
+                  </w:r>
+                </w:p>
+              </w:tc>
             </w:tr>
             <w:tr>
               <w:tc>
@@ -18266,6 +18828,30 @@
                   </w:r>
                 </w:p>
               </w:tc>
+              <w:tc>
+                <w:tcPr/>
+                <w:p>
+                  <w:pPr>
+                    <w:pStyle w:val="Compact"/>
+                    <w:jc w:val="center"/>
+                  </w:pPr>
+                  <w:r>
+                    <w:t xml:space="preserve">1.53</w:t>
+                  </w:r>
+                </w:p>
+              </w:tc>
+              <w:tc>
+                <w:tcPr/>
+                <w:p>
+                  <w:pPr>
+                    <w:pStyle w:val="Compact"/>
+                    <w:jc w:val="center"/>
+                  </w:pPr>
+                  <w:r>
+                    <w:t xml:space="preserve">1.31</w:t>
+                  </w:r>
+                </w:p>
+              </w:tc>
             </w:tr>
             <w:tr>
               <w:tc>
@@ -18341,6 +18927,30 @@
                   </w:pPr>
                   <w:r>
                     <w:t xml:space="preserve">2.52</w:t>
+                  </w:r>
+                </w:p>
+              </w:tc>
+              <w:tc>
+                <w:tcPr/>
+                <w:p>
+                  <w:pPr>
+                    <w:pStyle w:val="Compact"/>
+                    <w:jc w:val="center"/>
+                  </w:pPr>
+                  <w:r>
+                    <w:t xml:space="preserve">1.60</w:t>
+                  </w:r>
+                </w:p>
+              </w:tc>
+              <w:tc>
+                <w:tcPr/>
+                <w:p>
+                  <w:pPr>
+                    <w:pStyle w:val="Compact"/>
+                    <w:jc w:val="center"/>
+                  </w:pPr>
+                  <w:r>
+                    <w:t xml:space="preserve">1.26</w:t>
                   </w:r>
                 </w:p>
               </w:tc>
@@ -18412,6 +19022,30 @@
                   </w:r>
                 </w:p>
               </w:tc>
+              <w:tc>
+                <w:tcPr/>
+                <w:p>
+                  <w:pPr>
+                    <w:pStyle w:val="Compact"/>
+                    <w:jc w:val="center"/>
+                  </w:pPr>
+                  <w:r>
+                    <w:t xml:space="preserve">1.50</w:t>
+                  </w:r>
+                </w:p>
+              </w:tc>
+              <w:tc>
+                <w:tcPr/>
+                <w:p>
+                  <w:pPr>
+                    <w:pStyle w:val="Compact"/>
+                    <w:jc w:val="center"/>
+                  </w:pPr>
+                  <w:r>
+                    <w:t xml:space="preserve">1.26</w:t>
+                  </w:r>
+                </w:p>
+              </w:tc>
             </w:tr>
             <w:tr>
               <w:tc>
@@ -18485,6 +19119,30 @@
                   </w:r>
                 </w:p>
               </w:tc>
+              <w:tc>
+                <w:tcPr/>
+                <w:p>
+                  <w:pPr>
+                    <w:pStyle w:val="Compact"/>
+                    <w:jc w:val="center"/>
+                  </w:pPr>
+                  <w:r>
+                    <w:t xml:space="preserve">1.57</w:t>
+                  </w:r>
+                </w:p>
+              </w:tc>
+              <w:tc>
+                <w:tcPr/>
+                <w:p>
+                  <w:pPr>
+                    <w:pStyle w:val="Compact"/>
+                    <w:jc w:val="center"/>
+                  </w:pPr>
+                  <w:r>
+                    <w:t xml:space="preserve">1.40</w:t>
+                  </w:r>
+                </w:p>
+              </w:tc>
             </w:tr>
             <w:tr>
               <w:tc>
@@ -18553,6 +19211,30 @@
                   </w:r>
                 </w:p>
               </w:tc>
+              <w:tc>
+                <w:tcPr/>
+                <w:p>
+                  <w:pPr>
+                    <w:pStyle w:val="Compact"/>
+                    <w:jc w:val="center"/>
+                  </w:pPr>
+                  <w:r>
+                    <w:t xml:space="preserve">1.49</w:t>
+                  </w:r>
+                </w:p>
+              </w:tc>
+              <w:tc>
+                <w:tcPr/>
+                <w:p>
+                  <w:pPr>
+                    <w:pStyle w:val="Compact"/>
+                    <w:jc w:val="center"/>
+                  </w:pPr>
+                  <w:r>
+                    <w:t xml:space="preserve">1.28</w:t>
+                  </w:r>
+                </w:p>
+              </w:tc>
             </w:tr>
             <w:tr>
               <w:tc>
@@ -18628,6 +19310,30 @@
                   </w:pPr>
                   <w:r>
                     <w:t xml:space="preserve">2.88</w:t>
+                  </w:r>
+                </w:p>
+              </w:tc>
+              <w:tc>
+                <w:tcPr/>
+                <w:p>
+                  <w:pPr>
+                    <w:pStyle w:val="Compact"/>
+                    <w:jc w:val="center"/>
+                  </w:pPr>
+                  <w:r>
+                    <w:t xml:space="preserve">n.t.</w:t>
+                  </w:r>
+                </w:p>
+              </w:tc>
+              <w:tc>
+                <w:tcPr/>
+                <w:p>
+                  <w:pPr>
+                    <w:pStyle w:val="Compact"/>
+                    <w:jc w:val="center"/>
+                  </w:pPr>
+                  <w:r>
+                    <w:t xml:space="preserve">n.t.</w:t>
                   </w:r>
                 </w:p>
               </w:tc>
@@ -18699,6 +19405,30 @@
                   </w:r>
                 </w:p>
               </w:tc>
+              <w:tc>
+                <w:tcPr/>
+                <w:p>
+                  <w:pPr>
+                    <w:pStyle w:val="Compact"/>
+                    <w:jc w:val="center"/>
+                  </w:pPr>
+                  <w:r>
+                    <w:t xml:space="preserve">n.t.</w:t>
+                  </w:r>
+                </w:p>
+              </w:tc>
+              <w:tc>
+                <w:tcPr/>
+                <w:p>
+                  <w:pPr>
+                    <w:pStyle w:val="Compact"/>
+                    <w:jc w:val="center"/>
+                  </w:pPr>
+                  <w:r>
+                    <w:t xml:space="preserve">n.t.</w:t>
+                  </w:r>
+                </w:p>
+              </w:tc>
             </w:tr>
             <w:tr>
               <w:tc>
@@ -18767,11 +19497,35 @@
                   </w:r>
                 </w:p>
               </w:tc>
+              <w:tc>
+                <w:tcPr/>
+                <w:p>
+                  <w:pPr>
+                    <w:pStyle w:val="Compact"/>
+                    <w:jc w:val="center"/>
+                  </w:pPr>
+                  <w:r>
+                    <w:t xml:space="preserve">n.t.</w:t>
+                  </w:r>
+                </w:p>
+              </w:tc>
+              <w:tc>
+                <w:tcPr/>
+                <w:p>
+                  <w:pPr>
+                    <w:pStyle w:val="Compact"/>
+                    <w:jc w:val="center"/>
+                  </w:pPr>
+                  <w:r>
+                    <w:t xml:space="preserve">n.t.</w:t>
+                  </w:r>
+                </w:p>
+              </w:tc>
             </w:tr>
             <w:tr>
               <w:tc>
                 <w:tcPr>
-                  <w:gridSpan w:val="6"/>
+                  <w:gridSpan w:val="8"/>
                 </w:tcPr>
                 <w:p>
                   <w:pPr>
@@ -18779,7 +19533,7 @@
                     <w:jc w:val="center"/>
                   </w:pPr>
                   <w:r>
-                    <w:t xml:space="preserve">HCP, pool host cell protein. LPA, leached Protein A. Reference, the set-point runs of the planned qualification study S-PA-SDM.</w:t>
+                    <w:t xml:space="preserve">HCP, pool host cell protein. LPA, leached Protein A. HMW, aggregate by SEC. LMW, fragments by SEC, biased in this matrix and reported for information only under the method decision AMD-001. Reference, the set-point runs of the planned qualification study S-PA-SDM. n.t., not tested. Fragments by nrCE-SDS were not tested in this study.</w:t>
                   </w:r>
                 </w:p>
               </w:tc>
@@ -18795,7 +19549,18 @@
         <w:pStyle w:val="BodyText"/>
       </w:pPr>
       <w:r>
-        <w:t xml:space="preserve">At manufacturing scale every individual result of pool host cell protein and leached Protein A met its criterion. The highest pool host cell protein was 10,488 ng/mg against ≤ 17,069 ng/mg, and the highest leached Protein A was 5.38 ppm against ≤ 158 ppm. For these two attributes the range studied of each parameter is supported with the other parameters at their set-points. The study gives no result for fragments, and it supports no range of operating temperature or bed height for them.</w:t>
+        <w:t xml:space="preserve">At manufacturing scale every individual result of pool host cell protein and leached Protein A met its criterion. The highest pool host cell protein was 10,488 ng/mg against ≤ 17,069 ng/mg, and the highest leached Protein A was 5.38 ppm against ≤ 158 ppm. For these two attributes the range studied of each parameter is supported with the other parameters at their set-points. The study gives no fragment result by nrCE-SDS, and it supports no range of operating temperature or bed height for fragments (</w:t>
+      </w:r>
+      <w:hyperlink w:anchor="sec-class">
+        <w:r>
+          <w:rPr>
+            <w:rStyle w:val="Hyperlink"/>
+          </w:rPr>
+          <w:t xml:space="preserve">Section 9</w:t>
+        </w:r>
+      </w:hyperlink>
+      <w:r>
+        <w:t xml:space="preserve">).</w:t>
       </w:r>
     </w:p>
     <w:p>
@@ -18803,7 +19568,26 @@
         <w:pStyle w:val="BodyText"/>
       </w:pPr>
       <w:r>
-        <w:t xml:space="preserve">Every confidence interval includes zero. The largest difference in pool host cell protein, 2,005 ng/mg at 15 °C of operating temperature, is not significant. With 2 runs at each end the intervals are wide, so the study excludes only effects larger than their upper bounds. Step yield was 2.4 to 4.1 percentage points higher than the reference at every end. The difference has the same sign at both ends of both parameters. It is therefore more likely a difference between the reference runs and the univariate runs than an effect of either parameter.</w:t>
+        <w:t xml:space="preserve">Every confidence interval includes zero. The largest difference in pool host cell protein, 2,005 ng/mg at 15 °C of operating temperature, is not significant. With 2 runs at each end the intervals are wide, so the study excludes only effects larger than their upper bounds. Step yield was 2.4 to 4.1 percentage points higher than the reference at every end. The difference has the same sign at both ends of both parameters. It is therefore more likely a difference between the reference runs and the univariate runs than an effect of either parameter (</w:t>
+      </w:r>
+      <w:hyperlink w:anchor="sec-dev03">
+        <w:r>
+          <w:rPr>
+            <w:rStyle w:val="Hyperlink"/>
+          </w:rPr>
+          <w:t xml:space="preserve">Section 13.3</w:t>
+        </w:r>
+      </w:hyperlink>
+      <w:r>
+        <w:t xml:space="preserve">).</w:t>
+      </w:r>
+    </w:p>
+    <w:p>
+      <w:pPr>
+        <w:pStyle w:val="BodyText"/>
+      </w:pPr>
+      <w:r>
+        <w:t xml:space="preserve">Aggregate by SEC ranged from 1.49 to 1.60 % HMW across the 8 runs of the study, within the range of the pools of both designs and below the ≤ 6.46 % that applies to the held eluate. Fragments by SEC ranged from 1.24 to 1.42 %. In the Protein A pool SEC reads part of the host cell protein as fragment, so this result is biased and is reported for information only (AMD-001). Neither SEC result has a difference from the set-point, because the reference runs of study S-PA-SDM were not tested by SEC.</w:t>
       </w:r>
     </w:p>
     <w:bookmarkEnd w:id="93"/>
@@ -20770,7 +21554,7 @@
         <w:pStyle w:val="BodyText"/>
       </w:pPr>
       <w:r>
-        <w:t xml:space="preserve">For operation, the risk to pool host cell protein lies at high protein load combined with low elution buffer pH, never with both inside their NORs (</w:t>
+        <w:t xml:space="preserve">For operation, the risk to pool host cell protein lies at high protein load combined with low elution buffer pH, and never with every parameter of the multivariate design inside its NOR (</w:t>
       </w:r>
       <w:hyperlink w:anchor="sec-ds">
         <w:r>
@@ -20800,7 +21584,24 @@
         <w:pStyle w:val="FirstParagraph"/>
       </w:pPr>
       <w:r>
-        <w:t xml:space="preserve">The design space of this step is the region in protein load and elution buffer pH, the 2 WC-CPPs, over which the median prediction of pool host cell protein meets its intermediate acceptance criterion at manufacturing scale. Leached Protein A and fragments meet their criteria everywhere in the range studied on their selected models, and step yield has no criterion, so they do not constrain it. The fractions below are of a grid of 41 points per factor over the range studied.</w:t>
+        <w:t xml:space="preserve">The design space of this step is the region in protein load and elution buffer pH, the 2 WC-CPPs, over which a single batch is predicted to meet every intermediate acceptance criterion of the step. A point lies inside it when both ends of the 95 % prediction interval of a single run lie within the criterion of each quality attribute, at manufacturing scale where an offset applies. The criteria of this step are upper limits, so the upper prediction limit of</w:t>
+      </w:r>
+      <w:r>
+        <w:t xml:space="preserve"> </w:t>
+      </w:r>
+      <w:hyperlink w:anchor="sec-stats">
+        <w:r>
+          <w:rPr>
+            <w:rStyle w:val="Hyperlink"/>
+          </w:rPr>
+          <w:t xml:space="preserve">Section 3.5</w:t>
+        </w:r>
+      </w:hyperlink>
+      <w:r>
+        <w:t xml:space="preserve"> </w:t>
+      </w:r>
+      <w:r>
+        <w:t xml:space="preserve">decides, and at the boundary of the region a single batch is predicted to exceed the criterion with a probability of 2.5 %. Leached Protein A and fragments meet their criteria on this statistic everywhere in the range studied, and step yield has no criterion, so pool host cell protein alone bounds the region. The fractions below are of a grid of 41 points per factor over the range studied, with the offset of pool host cell protein at its estimate.</w:t>
       </w:r>
     </w:p>
     <w:p>
@@ -20808,7 +21609,7 @@
         <w:pStyle w:val="BodyText"/>
       </w:pPr>
       <w:r>
-        <w:t xml:space="preserve">With load flow rate and end of pool collect at their set-points, the median meets the criterion over 98.3 % of the region of protein load and elution buffer pH studied. It exceeds the criterion in one corner, at a protein load above 42.4 g/L resin at pH 3.2 and at a pH below 3.30 at 50 g/L resin, outside both NORs. At the corner itself the median is 20,217 ng/mg, and the upper prediction limit of a single run is 25,690 ng/mg. At the corner of the two NORs the median is 11,269 ng/mg. With load flow rate and end of pool collect at the corners of their NORs, between 96.6 and 98.8 % of the region meets the criterion, and with the two at the corners of their ranges studied, between 92.7 and 98.5 %.</w:t>
+        <w:t xml:space="preserve">With load flow rate and end of pool collect at their set-points, the upper prediction limit meets the criterion over 91.7 % of the plane of protein load and elution buffer pH studied. It exceeds the criterion in the corner of high load and low pH, above a protein load of 31.8 g/L resin at pH 3.2 and below pH 3.44 at 50 g/L resin. The excluded corner reaches into the protein load NOR and into the pH NOR, but never into both at once. It begins below pH 3.29 at the upper edge of the protein load NOR, 39 g/L resin, and above 47.2 g/L resin at the lower edge of the pH NOR, 3.4. The upper prediction limit is 25,690 ng/mg at the corner of high load and low pH of the range studied, and 14,196 ng/mg at that corner of the two NORs. With load flow rate and end of pool collect at the corners of their NORs, between 88.5 and 92.8 % of the plane meets the criterion, and at the corners of their ranges studied between 81.4 and 91.9 %.</w:t>
       </w:r>
     </w:p>
     <w:p>
@@ -20816,7 +21617,7 @@
         <w:pStyle w:val="BodyText"/>
       </w:pPr>
       <w:r>
-        <w:t xml:space="preserve">Over the whole range studied of all 4 factors, 97.5 % of the grid meets the criterion. The excluded points lie at a protein load of 33 g/L resin or more with elution buffer pH 3.41 or less. None of them lies inside both the protein load NOR of 20–39 g/L resin and the elution buffer pH NOR of 3.4–3.7. With load flow rate and end of pool collect within their NORs, the excluded points lie at a protein load of 39 g/L resin or more with pH 3.34 or less, below the pH NOR.</w:t>
+        <w:t xml:space="preserve">Over the whole range studied of all 4 factors, 90.2 % of the grid lies inside the design space. The excluded points lie at a protein load of 23 g/L resin or more with elution buffer pH 3.55 or less. No point is excluded with every factor inside its NOR. With load flow rate and end of pool collect within their NORs, each excluded point lies outside the protein load NOR of 20–39 g/L resin or outside the pH NOR of 3.4–3.7. Inside both the protein load NOR and the pH NOR, a point is excluded only where load flow rate is at most 105 cm/hr and end of pool collect at most 2.09 CV, both below their NORs.</w:t>
       </w:r>
     </w:p>
     <w:p>
@@ -20824,30 +21625,7 @@
         <w:pStyle w:val="BodyText"/>
       </w:pPr>
       <w:r>
-        <w:t xml:space="preserve">A region defined on median predictions is not a claim for a single batch. At its boundary a single batch meets the criterion only about half the time</w:t>
-      </w:r>
-      <w:r>
-        <w:t xml:space="preserve"> </w:t>
-      </w:r>
-      <w:r>
-        <w:t xml:space="preserve">(CMC Biotech Working Group 2009)</w:t>
-      </w:r>
-      <w:r>
-        <w:t xml:space="preserve">. The claim for a single batch is made through the PARs of</w:t>
-      </w:r>
-      <w:r>
-        <w:t xml:space="preserve"> </w:t>
-      </w:r>
-      <w:hyperlink w:anchor="sec-par">
-        <w:r>
-          <w:rPr>
-            <w:rStyle w:val="Hyperlink"/>
-          </w:rPr>
-          <w:t xml:space="preserve">Section 7</w:t>
-        </w:r>
-      </w:hyperlink>
-      <w:r>
-        <w:t xml:space="preserve">, which use the 95 % prediction interval of a single run.</w:t>
+        <w:t xml:space="preserve">Drawn on the median prediction, for comparison only, the region would cover 97.5 % of the grid. A median can meet the criterion where a single batch does not.</w:t>
       </w:r>
     </w:p>
     <w:p>
@@ -20901,7 +21679,7 @@
         <w:pStyle w:val="BodyText"/>
       </w:pPr>
       <w:r>
-        <w:t xml:space="preserve">PCMP-001 §7.5 then checks each platform worst case against the A-Mab results of its step. The check uses the one-sided 95 % prediction bound of a single batch, at the least favourable combination of NOR low, set-point and NOR high of the response-surface factors of the downstream step, on its unfavourable side. These are the NORs as characterized. Where the worst case that the model predicts within the NOR is worse than the platform value, the bound replaces the platform value and the criteria upstream become stricter. Where the bound is better than the platform value and the model passes the adequacy tests of PCMP-001 §7.2 on lack of fit and predictive power, the bound replaces the platform value and the criteria upstream become wider. Otherwise the platform value stands. A point prediction never replaces it.</w:t>
+        <w:t xml:space="preserve">PCMP-001 §7.5 then checks each platform worst case against the A-Mab results of its step. The check uses the one-sided 95 % prediction bound of a single batch, at the least favourable combination of NOR low, set-point and NOR high of the response-surface factors of the downstream step, on its unfavourable side. These are the NORs as characterized. Where the worst case that the model predicts within the NOR is worse than the platform value, the bound replaces the platform value and the criteria upstream become stricter. Where the bound is better than the platform value, and the model behind it meets the first three adequacy criteria of PCMP-001 §7.2 (a significant model, no significant lack of fit and the limit on overfitting) and is not an exact fit, the bound replaces the platform value and the criteria upstream become wider. The fourth criterion, on the residuals and on influential runs, does not decide the change, and the report that gives the bound examines whether the bound depends on a single run. Otherwise the platform value stands. A point prediction never replaces it.</w:t>
       </w:r>
     </w:p>
     <w:p>
@@ -22158,7 +22936,7 @@
         <w:pStyle w:val="BodyText"/>
       </w:pPr>
       <w:r>
-        <w:t xml:space="preserve">At anion exchange the single-batch bound for host cell protein clearance replaced the platform worst case. The anion exchange model predicts a lowest clearance within its NOR of 5.51-fold, and its single-batch bound, 4.27-fold, is better than the platform value of 4-fold. The model passes the adequacy tests, with predicted R² 0.02 below R² and a lack of fit test of p = 0.824. The bound comes from the 28 runs of the planned anion exchange design, with 4 centre points. The criteria of this report were fixed when INV-001 closed on 2026-09-18, before the 12 runs that INV-002 added to that design were complete (study S-AEX-AUG, 2026-09-10 to 2026-09-24). On all 40 runs the bound is the same to three significant figures, 4.27-fold. For these reasons the clearance of anion exchange for A-Mab is known well enough to replace the platform value. The 40-fold of cation exchange and the 4.27-fold of anion exchange give a combined clearance of 171-fold and the criterion in force of ≤ 17,069 ng/mg, 7 % wider than the a priori value. At the edges of their ranges studied, outside their NORs, the lowest clearance measured in a run was 30.3-fold at cation exchange and 3.63-fold at anion exchange, both below their platform values. The criterion therefore relies on both steps running within their NORs (PCR-007, PCR-008).</w:t>
+        <w:t xml:space="preserve">At anion exchange the single-batch bound for host cell protein clearance replaced the platform worst case. The anion exchange model predicts a lowest clearance within its NOR of 5.51-fold, and its single-batch bound, 4.27-fold, is better than the platform value of 4-fold. The model behind the bound meets the first three adequacy criteria of PCMP-001 §7.2. Its F-test is significant (p &lt; 0.001), its lack of fit test is not (p = 0.824), and its predicted R² falls short of R² by 0.02, within the limit of 0.20. The model is not an exact fit, and it meets the fourth criterion, because no run has a Cook’s distance above the median of F(p, n − p), 0.81. Runs 2 and 9 lie above 4/n and were examined. With each of runs 2 and 9 deleted in turn, and the model selection and the bound computed again, the selected model still met the three criteria and the bound stayed better than the platform value, at 4.33 to 4.56-fold (INV-002 §8.4). The bound therefore does not depend on a single run. The bound comes from the 28 runs of the planned anion exchange design, with 4 centre points. The criteria of this report were fixed when INV-001 closed on 2026-09-18, before the 12 runs that INV-002 added to that design were complete (study S-AEX-AUG, 2026-09-10 to 2026-09-24). On all 40 runs the bound is the same to three significant figures, 4.27-fold. For these reasons the clearance of anion exchange for A-Mab is known well enough to replace the platform value. The 40-fold of cation exchange and the 4.27-fold of anion exchange give a combined clearance of 171-fold and the criterion in force of ≤ 17,069 ng/mg, 7 % wider than the a priori value. At the edges of their ranges studied, outside their NORs, the lowest clearance measured in a run was 30.3-fold at cation exchange and 3.63-fold at anion exchange, both below their platform values. The criterion therefore relies on both steps running within their NORs (PCR-007, PCR-008).</w:t>
       </w:r>
     </w:p>
     <w:p>
@@ -22190,7 +22968,7 @@
         </w:numPr>
       </w:pPr>
       <w:r>
-        <w:t xml:space="preserve">An excursion would be detected at release of the drug substance, where host cell protein is tested by ELISA (AMV-3012). The limit of quantitation of the ELISA, 1 ng/mg, is far below the criterion of ≤ 100 ng/mg. No figure is available to this report for the coverage of the ELISA, the share of the host cell proteins that its antibodies recognise.</w:t>
+        <w:t xml:space="preserve">An excursion would be detected at release of the drug substance, where host cell protein is tested by ELISA (AMV-3012). The limit of quantitation of the ELISA, 1 ng/mg, is far below the criterion of ≤ 100 ng/mg. The coverage of the ELISA, the share of the host cell proteins that its antibodies recognise, is 80 %, measured by 2D western blot against the platform CHO host cell protein antigen (AMV-3012). A host cell protein outside that share would not be detected by the release test.</w:t>
       </w:r>
     </w:p>
     <w:p>
@@ -22233,7 +23011,7 @@
         <w:pStyle w:val="FirstParagraph"/>
       </w:pPr>
       <w:r>
-        <w:t xml:space="preserve">The widening of the criterion for pool host cell protein rests on the model selection of INV-002 corrective action CA3. Without the model selection, the full quadratic model of anion exchange fails the adequacy tests of PCMP-001 §7.2, no bound replaces a platform value, and the criterion would be the a priori value of ≤ 16,000 ng/mg. Against that criterion the scale-down model would not be qualified for pool host cell protein (</w:t>
+        <w:t xml:space="preserve">The widening of the criterion for pool host cell protein rests on the model selection of INV-002 corrective action CA3. Without the model selection, the full quadratic model of anion exchange fails the limit on overfitting of PCMP-001 §7.2, with predicted R² 0.27 below R², so no bound replaces a platform value, and the criterion would be the a priori value of ≤ 16,000 ng/mg. Against that criterion the scale-down model would not be qualified for pool host cell protein (</w:t>
       </w:r>
       <w:hyperlink w:anchor="sec-sdm">
         <w:r>
@@ -23461,7 +24239,7 @@
         <w:pStyle w:val="BodyText"/>
       </w:pPr>
       <w:r>
-        <w:t xml:space="preserve">A PAR that reaches the edge of the range studied is reported as reaching it, and no claim is made beyond it (PCMP-001 §7.6). Each NOR-propagated PAR holds while the other parameters stay within their NORs. It does not cover two parameters at the edges of their ranges together. Where protein load and elution buffer pH both lie near the edges of their ranges studied, outside both NORs, the median of pool host cell protein exceeds its criterion even with load flow rate and end of pool collect at their set-points (</w:t>
+        <w:t xml:space="preserve">A PAR that reaches the edge of the range studied is reported as reaching it, and no claim is made beyond it (PCMP-001 §7.6). Each NOR-propagated PAR holds while the other parameters stay within their NORs. It does not cover two parameters at the edges of their ranges together. Towards the corner of high protein load and low elution buffer pH, beyond the NOR of at least one of the two, the upper prediction limit of pool host cell protein exceeds its criterion even with load flow rate and end of pool collect at their set-points (</w:t>
       </w:r>
       <w:hyperlink w:anchor="sec-ds">
         <w:r>
@@ -24188,19 +24966,19 @@
                     <w:jc w:val="center"/>
                   </w:pPr>
                   <w:r>
-                    <w:t xml:space="preserve">0.0001</w:t>
-                  </w:r>
-                </w:p>
-              </w:tc>
-              <w:tc>
-                <w:tcPr/>
-                <w:p>
-                  <w:pPr>
-                    <w:pStyle w:val="Compact"/>
-                    <w:jc w:val="center"/>
-                  </w:pPr>
-                  <w:r>
-                    <w:t xml:space="preserve">0.0001–0.0003</w:t>
+                    <w:t xml:space="preserve">0.0002</w:t>
+                  </w:r>
+                </w:p>
+              </w:tc>
+              <w:tc>
+                <w:tcPr/>
+                <w:p>
+                  <w:pPr>
+                    <w:pStyle w:val="Compact"/>
+                    <w:jc w:val="center"/>
+                  </w:pPr>
+                  <w:r>
+                    <w:t xml:space="preserve">0.0001–0.0004</w:t>
                   </w:r>
                 </w:p>
               </w:tc>
@@ -24224,7 +25002,7 @@
                     <w:jc w:val="center"/>
                   </w:pPr>
                   <w:r>
-                    <w:t xml:space="preserve">10.81</w:t>
+                    <w:t xml:space="preserve">7.30</w:t>
                   </w:r>
                 </w:p>
               </w:tc>
@@ -24366,7 +25144,27 @@
         <w:pStyle w:val="BodyText"/>
       </w:pPr>
       <w:r>
-        <w:t xml:space="preserve">Host cell protein and fragments have Cpk values of 6.17 and 10.62, above the target of 1.33 of PCMP-001 §7.9. Residual DNA has no intermediate acceptance criterion, and it reaches a Cpk of 10.81 in the drug substance. The integrated process model carries a nominal DNA reduction for each chromatography step, 2.5 log10 at Protein A, 1.5 at cation exchange and 4 at anion exchange. The platform history gives no worst-case DNA clearance for these steps (</w:t>
+        <w:t xml:space="preserve">Host cell protein and fragments have Cpk values of 6.17 and 10.62, above the target of 1.33 of PCMP-001 §7.9.</w:t>
+      </w:r>
+    </w:p>
+    <w:p>
+      <w:pPr>
+        <w:pStyle w:val="BodyText"/>
+      </w:pPr>
+      <w:r>
+        <w:t xml:space="preserve">Residual DNA has no intermediate acceptance criterion. It is carried through the train in pg per mg of antibody and judged in the drug substance in ng per dose. The dose is the 10 mg/kg of the A-Mab case study</w:t>
+      </w:r>
+      <w:r>
+        <w:t xml:space="preserve"> </w:t>
+      </w:r>
+      <w:r>
+        <w:t xml:space="preserve">(CMC Biotech Working Group 2009)</w:t>
+      </w:r>
+      <w:r>
+        <w:t xml:space="preserve"> </w:t>
+      </w:r>
+      <w:r>
+        <w:t xml:space="preserve">for an adult of 70 kg, 700 mg of antibody. The body weight is an assumption of this report. In the simulation the drug substance carries at most 0.0004 ng per dose against the criterion of ≤ 0.001 ng per dose, a Cpk of 7.30. The integrated process model carries a nominal DNA reduction for each chromatography step, 2.5 log10 at Protein A, 1.5 at cation exchange and 5 at anion exchange. The platform history gives no worst-case DNA clearance for these steps (</w:t>
       </w:r>
       <w:hyperlink w:anchor="sec-prior">
         <w:r>
@@ -24377,7 +25175,7 @@
         </w:r>
       </w:hyperlink>
       <w:r>
-        <w:t xml:space="preserve">), so the Cpk of residual DNA rests on these nominal values. At this step the reduction measured at the centre points, 2.2 to 2.5 log10, is at or below the nominal value.</w:t>
+        <w:t xml:space="preserve">), so the Cpk of residual DNA rests on these nominal values. At this step the reduction measured at the centre points, 2.2 to 2.5 log10, is at or below the nominal value. At anion exchange every pool of the response-surface design was below the limit of quantitation of the qPCR, 1 pg/mg (AMV-3014), so the reduction there is not measured. Each run shows only that it exceeds the DNA in its load over that limit, between 1.2 and 1.5 log10 (PCR-008). The Cpk of residual DNA therefore rests on a nominal anion exchange reduction that the data of this campaign do not measure.</w:t>
       </w:r>
     </w:p>
     <w:p>
@@ -24441,18 +25239,7 @@
         <w:pStyle w:val="FirstParagraph"/>
       </w:pPr>
       <w:r>
-        <w:t xml:space="preserve">Parameters were classified under SOP-4001 by the decision logic of PCMP-001 §7.7. A parameter whose effect on a CQA is significant and practically relevant is critical. A critical parameter is a WC-CPP when it has a low risk of leaving its acceptable range in operation, and a CPP otherwise. A KPP affects only process performance, and a GPP has no relevant effect. The practical-relevance rule of PCP-005 §7, part of its classification criterion (criterion 7), states that an effect on an attribute is practically relevant when the NOR-propagated PAR of the parameter is narrower than its range studied. It also states that a significant effect whose PAR spans the whole range studied does not by itself make the parameter critical. The rule identifies the effect of elution buffer pH on pool host cell protein as practically relevant, because its NOR-propagated PAR, 3.21–3.9, is narrower than its range studied (</w:t>
-      </w:r>
-      <w:hyperlink w:anchor="sec-par">
-        <w:r>
-          <w:rPr>
-            <w:rStyle w:val="Hyperlink"/>
-          </w:rPr>
-          <w:t xml:space="preserve">Section 7</w:t>
-        </w:r>
-      </w:hyperlink>
-      <w:r>
-        <w:t xml:space="preserve">). Every other NOR-propagated PAR spans its range studied, so the rule identifies no other parameter on its own. The class of each parameter therefore also rests on the size of its effects, on whether an effect takes an attribute beyond its criterion within the range studied, and on how readily the parameter is controlled. The classes and the reason for each are the following.</w:t>
+        <w:t xml:space="preserve">Parameters were classified under SOP-4001 by the decision logic of PCMP-001 §7.7, as PCP-005 §7 applies it (criterion 7). An attribute is affected by a parameter when a term of the selected model that contains the parameter is significant at α = 0.05 (PCMP-001 §6.2). A parameter whose effect on a CQA is significant and practically relevant is critical. A critical parameter is a WC-CPP when it has a low risk of leaving its acceptable range in operation, because it is readily controlled and its PAR is wide against its NOR, and a CPP otherwise. A KPP affects process performance and has no relevant effect on a CQA, and a GPP has no relevant effect on either. A significant effect that is too small to move the attribute appreciably within the PAR does not by itself make a parameter critical. Neither PCMP-001 nor SOP-4001 sets a numerical threshold for a practically relevant effect or for a low risk. Each class below is therefore argued from the size of each effect across the PAR, stated beside its significance, and from the margin of the PAR to the NOR. The effect on pool host cell protein is given at manufacturing scale with the other parameters at their set-points, and as a share of its criterion of ≤ 17,069 ng/mg.</w:t>
       </w:r>
     </w:p>
     <w:p>
@@ -24464,7 +25251,7 @@
         </w:numPr>
       </w:pPr>
       <w:r>
-        <w:t xml:space="preserve">Protein load was classified as a WC-CPP. It raises pool host cell protein by a factor of 2.43 across its range studied. Together with elution buffer pH it takes pool host cell protein above its criterion within the range studied, and 7 results of the designs at the corner of high load and low pH exceeded the criterion (</w:t>
+        <w:t xml:space="preserve">Protein load was classified as a WC-CPP. Its terms are significant for pool host cell protein, A (p &lt; 0.001), and for step yield, A (p &lt; 0.001) and AC (p = 0.027), but not for fragments (p = 0.079). Across its PAR for pool host cell protein, which is its range studied of 10–50 g/L resin, pool host cell protein rises from 4,590 to 11,137 ng/mg, a change of 38 % of the criterion. Together with elution buffer pH it takes pool host cell protein above its criterion within the range studied, and 7 results of the designs at the corner of high load and low pH exceeded the criterion (</w:t>
       </w:r>
       <w:hyperlink w:anchor="sec-rsm-hcp">
         <w:r>
@@ -24475,7 +25262,7 @@
         </w:r>
       </w:hyperlink>
       <w:r>
-        <w:t xml:space="preserve">). The load is set from the load volume and the titre of the clarified harvest by Protein A affinity HPLC (AMV-3021). It is readily controlled within its NOR of 20–39 g/L resin, inside a PAR that spans the range studied of 10–50 g/L resin. The NOR in force was narrowed in this revision from 20–40 g/L resin, the NOR as characterized, because over that NOR the scale-down model is not qualified for pool host cell protein (</w:t>
+        <w:t xml:space="preserve">). The effect is therefore practically relevant, and protein load is critical. The load is set from the load volume and the titre of the clarified harvest by Protein A affinity HPLC (AMV-3021), so it is readily controlled, and its PAR extends 10 g/L resin below and 11 g/L resin above its NOR of 20–39 g/L resin. The NOR in force was narrowed in this revision from 20–40 g/L resin, the NOR as characterized, because over that NOR the scale-down model is not qualified for pool host cell protein (</w:t>
       </w:r>
       <w:hyperlink w:anchor="sec-sdm">
         <w:r>
@@ -24498,7 +25285,7 @@
         </w:numPr>
       </w:pPr>
       <w:r>
-        <w:t xml:space="preserve">Elution buffer pH was classified as a WC-CPP. It has the largest effect on pool host cell protein, a factor of 3.30 across its range studied, which the practical-relevance rule identifies as practically relevant, and fragments fall slightly as it rises. With protein load it bounds the design space. Buffer pH is controlled at preparation and verified at release. Its NOR-propagated PAR for pool host cell protein, 3.21–3.9, is wide against its NOR of 3.4–3.7, whose lower edge lies 0.19 pH units inside the PAR. The deviation DEV-005-01 showed that a buffer below the NOR can pass release when the pH meter is incorrectly calibrated (</w:t>
+        <w:t xml:space="preserve">Elution buffer pH was classified as a WC-CPP. Its terms are significant for pool host cell protein, B (p &lt; 0.001), and for fragments, B (p = 0.001), and step yield has no term in it. Across its PAR for pool host cell protein, 3.21–3.9, pool host cell protein falls from 12,787 to 3,939 ng/mg as the pH rises, a change of 52 % of the criterion. Fragments fall by 0.11 percentage points across their PAR, the range studied, 4 % of their criterion. The effect on pool host cell protein is practically relevant, and with protein load it bounds the design space. Buffer pH is controlled at preparation and verified at release, and the PAR for pool host cell protein extends 0.19 pH units below and 0.20 above the NOR of 3.4–3.7. The deviation DEV-005-01 showed that a buffer below the NOR can pass release when the pH meter is incorrectly calibrated (</w:t>
       </w:r>
       <w:hyperlink w:anchor="sec-dev01">
         <w:r>
@@ -24509,7 +25296,7 @@
         </w:r>
       </w:hyperlink>
       <w:r>
-        <w:t xml:space="preserve">).</w:t>
+        <w:t xml:space="preserve">). The buffer of that deviation, at pH 3.38, lay below the NOR and inside the PAR.</w:t>
       </w:r>
     </w:p>
     <w:p>
@@ -24521,7 +25308,7 @@
         </w:numPr>
       </w:pPr>
       <w:r>
-        <w:t xml:space="preserve">Load flow rate was classified as a KPP. It lowers step yield at high load, because a faster load shortens the residence time and lowers the dynamic binding capacity. Its only effect on a CQA is the curvature of pool host cell protein, a rise of at most 4 % within its NOR and 14 % across its range studied. Within the NOR that does not move pool host cell protein appreciably against its criterion. Its NOR-propagated PAR spans the range studied for every output, so the practical-relevance rule does not make it critical. No effect of load flow rate on leached Protein A or fragments was detected within the range studied.</w:t>
+        <w:t xml:space="preserve">Load flow rate was classified as a KPP. Its terms are significant for step yield, C (p = 0.023) and AC (p = 0.027), and for pool host cell protein, C² (p = 0.025). It costs step yield at high load, up to 3.6 percentage points across its range studied at 50 g/L resin, because a faster load shortens the residence time and lowers the dynamic binding capacity. Its effect on pool host cell protein is the curvature, a change of at most 979 ng/mg across its PAR, the range studied of 100–300 cm/hr, or 6 % of the criterion, and of at most 4 % within the NOR. That effect is significant but too small to move pool host cell protein appreciably within the PAR, so it does not make load flow rate critical. The PAR extends 50 cm/hr below and 50 cm/hr above the NOR of 150–250 cm/hr. No effect of load flow rate on leached Protein A or fragments was detected within the range studied.</w:t>
       </w:r>
     </w:p>
     <w:p>
@@ -24533,7 +25320,7 @@
         </w:numPr>
       </w:pPr>
       <w:r>
-        <w:t xml:space="preserve">End of pool collect was classified as a KPP. It has the largest effect on step yield. It also lowers pool host cell protein, by 15 % across its range studied and 8 % across its NOR, and the sign of that effect differs between the designs (finding F11). The effect does not take pool host cell protein beyond its criterion with the other parameters within their NORs, and its PAR spans the range studied. The class would be revisited if a later study confirmed the screening sign.</w:t>
+        <w:t xml:space="preserve">End of pool collect was classified as a KPP. Its terms are significant for step yield, D (p &lt; 0.001) and D² (p = 0.035), and for pool host cell protein, D (p = 0.003). It has the largest effect on step yield, a gain of 7.3 percentage points across its range studied. Across its PAR for pool host cell protein, the range studied of 2–3.2 CV, it lowers pool host cell protein from 7,761 to 6,587 ng/mg, a change of 7 % of the criterion, and the sign of that effect differs between the designs (finding F11). That effect is significant but too small to move pool host cell protein appreciably within the PAR, so it does not make end of pool collect critical. The PAR extends 0.3 CV below and 0.3 CV above the NOR of 2.3–2.9 CV. The class would be revisited if a later study confirmed the screening sign.</w:t>
       </w:r>
     </w:p>
     <w:p>
@@ -24556,7 +25343,29 @@
         </w:r>
       </w:hyperlink>
       <w:r>
-        <w:t xml:space="preserve">). The class rests on the attributes measured. Fragments were not measured in the univariate study, and a higher temperature could speed hinge hydrolysis during elution.</w:t>
+        <w:t xml:space="preserve">). The range studied of 15–30 °C, which these results support, extends 3 °C below and 4 °C above the NOR of 18–26 °C. The class rests on the attributes measured. Fragments were not measured by nrCE-SDS in the univariate study (</w:t>
+      </w:r>
+      <w:hyperlink w:anchor="sec-uni">
+        <w:r>
+          <w:rPr>
+            <w:rStyle w:val="Hyperlink"/>
+          </w:rPr>
+          <w:t xml:space="preserve">Section 5.6</w:t>
+        </w:r>
+      </w:hyperlink>
+      <w:r>
+        <w:t xml:space="preserve">), so for fragments the class rests on the mechanism and on the response-surface model. A higher temperature is expected to speed acid-catalysed hinge hydrolysis during elution. In the response-surface design fragments changed by 0.11 percentage points across the whole range of elution buffer pH, the condition that drives that hydrolysis (</w:t>
+      </w:r>
+      <w:hyperlink w:anchor="sec-rsm-frag">
+        <w:r>
+          <w:rPr>
+            <w:rStyle w:val="Hyperlink"/>
+          </w:rPr>
+          <w:t xml:space="preserve">Section 5.3.4</w:t>
+        </w:r>
+      </w:hyperlink>
+      <w:r>
+        <w:t xml:space="preserve">). Their upper prediction limit over the NOR lies 1.36 points below the criterion. The class assumes that a change of temperature within its range studied does not use up that margin, and this was not tested.</w:t>
       </w:r>
     </w:p>
     <w:p>
@@ -24579,7 +25388,29 @@
         </w:r>
       </w:hyperlink>
       <w:r>
-        <w:t xml:space="preserve">). Bed height is fixed by the packing specification of the commercial column and does not vary in operation. A short bed at the upper end of the load range was not characterized, and no claim is made for it. The class rests on the attributes measured. Fragments were not measured in the univariate study, and a shorter bed shortens the residence time, which could change the capture of fragments.</w:t>
+        <w:t xml:space="preserve">). The range studied of 10–30 cm, which these results support, extends 5 cm below and 5 cm above the NOR of 15–25 cm. Bed height is fixed by the packing specification of the commercial column and does not vary in operation. A short bed at the upper end of the load range was not characterized, and no claim is made for it. The class rests on the attributes measured. Fragments were not measured by nrCE-SDS in the univariate study (</w:t>
+      </w:r>
+      <w:hyperlink w:anchor="sec-uni">
+        <w:r>
+          <w:rPr>
+            <w:rStyle w:val="Hyperlink"/>
+          </w:rPr>
+          <w:t xml:space="preserve">Section 5.6</w:t>
+        </w:r>
+      </w:hyperlink>
+      <w:r>
+        <w:t xml:space="preserve">), so for fragments the class rests on the mechanism and on the response-surface model. A fragment that carries Fc binds the ligand as the intact antibody does, so a shorter residence time is expected to lower the capture of both alike. In the response-surface design no effect of load flow rate on fragments was detected over residence times from 4 to 12 min, at the set-point bed height (</w:t>
+      </w:r>
+      <w:hyperlink w:anchor="sec-rsm-frag">
+        <w:r>
+          <w:rPr>
+            <w:rStyle w:val="Hyperlink"/>
+          </w:rPr>
+          <w:t xml:space="preserve">Section 5.3.4</w:t>
+        </w:r>
+      </w:hyperlink>
+      <w:r>
+        <w:t xml:space="preserve">). The shortest bed gives 3 min, below that span, and no fragment result supports the class there.</w:t>
       </w:r>
     </w:p>
     <w:p>
@@ -24587,7 +25418,7 @@
         <w:pStyle w:val="FirstParagraph"/>
       </w:pPr>
       <w:r>
-        <w:t xml:space="preserve">In summary the step has 2 WC-CPPs, 2 KPPs and 2 GPPs. No parameter is in the class CPP. The two WC-CPPs are critical parameters that are well controlled. The classes of protein load and elution buffer pH rest on the size of their effects on pool host cell protein, on the practical-relevance rule for elution buffer pH, and on the corner where the two together take it above its criterion. Both effects agree in direction with the A-Mab case study. The KPP classes rest on the model for step yield, on the direction of the yield effects in both designs, and on the mechanism of breakthrough and of peak collection.</w:t>
+        <w:t xml:space="preserve">In summary the step has 2 WC-CPPs, 2 KPPs and 2 GPPs. No parameter is in the class CPP. The two WC-CPPs are critical parameters that are well controlled. The classes of protein load and elution buffer pH rest on the size of their effects on pool host cell protein within the PAR and on the corner where the two together take it above its criterion. Both effects agree in direction with the A-Mab case study. Load flow rate and end of pool collect also have significant effects on pool host cell protein, each too small to make the parameter critical. The KPP classes rest on the model for step yield, on the direction of the yield effects in both designs, and on the mechanism of breakthrough and of peak collection.</w:t>
       </w:r>
     </w:p>
     <w:bookmarkEnd w:id="117"/>
@@ -24768,7 +25599,7 @@
         <w:pStyle w:val="BodyText"/>
       </w:pPr>
       <w:r>
-        <w:t xml:space="preserve">The qualification of the scale-down model for pool host cell protein holds over the NOR in force and not over the protein load NOR as characterized. It rests on the widened criterion, on the 6 set-point runs added after the planned runs had been analysed, and on the choice of the selected model (</w:t>
+        <w:t xml:space="preserve">The qualification of the scale-down model for pool host cell protein holds over the NOR in force and not over the protein load NOR as characterized. It rests on the widened criterion and on the 6 set-point runs added after the planned runs had been analysed (</w:t>
       </w:r>
       <w:hyperlink w:anchor="sec-sdm">
         <w:r>
@@ -24779,6 +25610,17 @@
         </w:r>
       </w:hyperlink>
       <w:r>
+        <w:t xml:space="preserve">). The selected model decides it (</w:t>
+      </w:r>
+      <w:hyperlink w:anchor="sec-rsm-hcp">
+        <w:r>
+          <w:rPr>
+            <w:rStyle w:val="Hyperlink"/>
+          </w:rPr>
+          <w:t xml:space="preserve">Section 5.3.1</w:t>
+        </w:r>
+      </w:hyperlink>
+      <w:r>
         <w:t xml:space="preserve">). The offsets were estimated at set-point only. The report therefore assumes that the ratio for pool host cell protein and the difference for leached Protein A are the same across the ranges studied, and this assumption is not tested. Fragments have no measured offset. Their conclusions assume no difference between the scales, on the mechanism of capture and on the bound from the hold study of the clarified harvest (</w:t>
       </w:r>
       <w:hyperlink w:anchor="sec-sdm">
@@ -24817,7 +25659,7 @@
         <w:pStyle w:val="BodyText"/>
       </w:pPr>
       <w:r>
-        <w:t xml:space="preserve">No selected model meets criterion 5, and the conclusions rest on the influence analysis and on the size of the two residual trends (PD-005-02). The re-assay of run 11 decides whether leached Protein A depends on end of pool collect, but not its judgement against the criterion (</w:t>
+        <w:t xml:space="preserve">The models of leached Protein A and fragments fail criterion 5 on a residual trend, and their conclusions rest on its size (PD-005-02). The re-assay of run 11 decides whether leached Protein A depends on end of pool collect, but not its judgement against the criterion (</w:t>
       </w:r>
       <w:hyperlink w:anchor="sec-dev02">
         <w:r>
@@ -24828,7 +25670,7 @@
         </w:r>
       </w:hyperlink>
       <w:r>
-        <w:t xml:space="preserve">). Each design used one feed, so the effect of feed quality was not estimated. The univariate study cannot detect interactions, has 2 runs at each end, takes its reference from the qualification study and did not measure fragments. The hold study held one eluate, made at set-point.</w:t>
+        <w:t xml:space="preserve">). Each design used one feed, so the effect of feed quality was not estimated. The univariate study cannot detect interactions, has 2 runs at each end and no centre run (DEV-005-03), and did not measure fragments by nrCE-SDS. The hold study held one eluate, made at set-point.</w:t>
       </w:r>
     </w:p>
     <w:bookmarkEnd w:id="119"/>
@@ -24862,7 +25704,18 @@
         </w:numPr>
       </w:pPr>
       <w:r>
-        <w:t xml:space="preserve">The scale-down model is qualified by its offset for leached Protein A and, over the NOR in force, for pool host cell protein. Over the protein load NOR as characterized, 20–40 g/L resin, it is not qualified for pool host cell protein, and the NOR of protein load in force was narrowed to 20–39 g/L resin. The qualification for pool host cell protein also rests on the widened criterion, on all 9 set-point runs and on the selected model.</w:t>
+        <w:t xml:space="preserve">The scale-down model is qualified by its offset for leached Protein A and, over the NOR in force, for pool host cell protein. Over the protein load NOR as characterized, 20–40 g/L resin, it is not qualified for pool host cell protein, and the NOR of protein load in force was narrowed to 20–39 g/L resin. The qualification for pool host cell protein also rests on the widened criterion and on all 9 set-point runs. It is decided on the selected model (</w:t>
+      </w:r>
+      <w:hyperlink w:anchor="sec-rsm-hcp">
+        <w:r>
+          <w:rPr>
+            <w:rStyle w:val="Hyperlink"/>
+          </w:rPr>
+          <w:t xml:space="preserve">Section 5.3.1</w:t>
+        </w:r>
+      </w:hyperlink>
+      <w:r>
+        <w:t xml:space="preserve">).</w:t>
       </w:r>
     </w:p>
     <w:p>
@@ -24874,7 +25727,7 @@
         </w:numPr>
       </w:pPr>
       <w:r>
-        <w:t xml:space="preserve">Each selected model of the response-surface outputs meets the adequacy criteria on lack of fit and predictive power, and each model with a term is significant. No model meets criterion 5, and the conclusions rest on the analyses of PD-005-02.</w:t>
+        <w:t xml:space="preserve">Each selected model of the response-surface outputs meets the adequacy criteria on lack of fit and predictive power, and each model with a term is significant. Criterion 5 is met except for leached Protein A and fragments, whose residual trends are small against their criteria (PD-005-02).</w:t>
       </w:r>
     </w:p>
     <w:p>
@@ -24910,7 +25763,7 @@
         </w:numPr>
       </w:pPr>
       <w:r>
-        <w:t xml:space="preserve">Each output with a criterion met it across the NOR in force. Every NOR-propagated PAR spans the range studied of its parameter, except that of elution buffer pH for pool host cell protein, 3.21–3.9. On its median predictions pool host cell protein exceeds its criterion only at high protein load combined with low elution buffer pH, never with both inside their NORs.</w:t>
+        <w:t xml:space="preserve">Each output with a criterion met it across the NOR in force. Every NOR-propagated PAR spans the range studied of its parameter, except that of elution buffer pH for pool host cell protein, 3.21–3.9. The design space, drawn on the upper prediction limit of a single run, covers 90.2 % of the range studied and excludes no point with every parameter inside its NOR.</w:t>
       </w:r>
     </w:p>
     <w:p>
@@ -24970,11 +25823,11 @@
         </w:numPr>
       </w:pPr>
       <w:r>
-        <w:t xml:space="preserve">The 2 deviations were investigated and their runs retained. The results roll up into PCMR-001.</w:t>
+        <w:t xml:space="preserve">None of the 5 deviations changes the judgement of an output against its criterion. The results roll up into PCMR-001.</w:t>
       </w:r>
     </w:p>
     <w:bookmarkEnd w:id="120"/>
-    <w:bookmarkStart w:id="130" w:name="sec-dev"/>
+    <w:bookmarkStart w:id="133" w:name="sec-dev"/>
     <w:p>
       <w:pPr>
         <w:pStyle w:val="Heading1"/>
@@ -24988,7 +25841,7 @@
         <w:pStyle w:val="FirstParagraph"/>
       </w:pPr>
       <w:r>
-        <w:t xml:space="preserve">A deviation is a departure from an approved procedure or a GMP requirement, or an unplanned event during execution. A discrepancy from the plan is work that the approved plan did not foresee and that was done under approved procedures, such as further runs or a further analysis. The deviation register lists 2 deviations for the studies of the step (</w:t>
+        <w:t xml:space="preserve">A deviation is a departure from the approved plan, from an approved procedure or from a GMP requirement, or an unplanned event during execution. A discrepancy from the plan is work that the approved plan did not foresee and that was done under approved procedures, such as further runs or a further analysis. The deviation register lists 5 deviations for the studies of the step (</w:t>
       </w:r>
       <w:hyperlink w:anchor="tbl-dev">
         <w:r>
@@ -24999,7 +25852,18 @@
         </w:r>
       </w:hyperlink>
       <w:r>
-        <w:t xml:space="preserve">). Both were investigated, and their runs were retained.</w:t>
+        <w:t xml:space="preserve">). The runs that DEV-005-01, DEV-005-02, DEV-005-03 and DEV-005-05 concern were retained. DEV-005-04 concerns the qualification of the scale-down model, and the output it concerns is judged through its offset (</w:t>
+      </w:r>
+      <w:hyperlink w:anchor="sec-dev04">
+        <w:r>
+          <w:rPr>
+            <w:rStyle w:val="Hyperlink"/>
+          </w:rPr>
+          <w:t xml:space="preserve">Section 13.4</w:t>
+        </w:r>
+      </w:hyperlink>
+      <w:r>
+        <w:t xml:space="preserve">).</w:t>
       </w:r>
     </w:p>
     <w:tbl>
@@ -25178,6 +26042,156 @@
                   </w:pPr>
                   <w:r>
                     <w:t xml:space="preserve">analytical review</w:t>
+                  </w:r>
+                </w:p>
+              </w:tc>
+              <w:tc>
+                <w:tcPr/>
+                <w:p>
+                  <w:pPr>
+                    <w:pStyle w:val="Compact"/>
+                    <w:jc w:val="center"/>
+                  </w:pPr>
+                  <w:r>
+                    <w:t xml:space="preserve">retained</w:t>
+                  </w:r>
+                </w:p>
+              </w:tc>
+            </w:tr>
+            <w:tr>
+              <w:tc>
+                <w:tcPr/>
+                <w:p>
+                  <w:pPr>
+                    <w:pStyle w:val="Compact"/>
+                    <w:jc w:val="center"/>
+                  </w:pPr>
+                  <w:r>
+                    <w:t xml:space="preserve">DEV-005-03</w:t>
+                  </w:r>
+                </w:p>
+              </w:tc>
+              <w:tc>
+                <w:tcPr/>
+                <w:p>
+                  <w:pPr>
+                    <w:pStyle w:val="Compact"/>
+                    <w:jc w:val="center"/>
+                  </w:pPr>
+                  <w:r>
+                    <w:t xml:space="preserve">Univariate study run in duplicate at both ends of each range, without the runs at the centre that PCP-005 requires</w:t>
+                  </w:r>
+                </w:p>
+              </w:tc>
+              <w:tc>
+                <w:tcPr/>
+                <w:p>
+                  <w:pPr>
+                    <w:pStyle w:val="Compact"/>
+                    <w:jc w:val="center"/>
+                  </w:pPr>
+                  <w:r>
+                    <w:t xml:space="preserve">Version 2.0 review of the study record against PCP-005</w:t>
+                  </w:r>
+                </w:p>
+              </w:tc>
+              <w:tc>
+                <w:tcPr/>
+                <w:p>
+                  <w:pPr>
+                    <w:pStyle w:val="Compact"/>
+                    <w:jc w:val="center"/>
+                  </w:pPr>
+                  <w:r>
+                    <w:t xml:space="preserve">retained</w:t>
+                  </w:r>
+                </w:p>
+              </w:tc>
+            </w:tr>
+            <w:tr>
+              <w:tc>
+                <w:tcPr/>
+                <w:p>
+                  <w:pPr>
+                    <w:pStyle w:val="Compact"/>
+                    <w:jc w:val="center"/>
+                  </w:pPr>
+                  <w:r>
+                    <w:t xml:space="preserve">DEV-005-04</w:t>
+                  </w:r>
+                </w:p>
+              </w:tc>
+              <w:tc>
+                <w:tcPr/>
+                <w:p>
+                  <w:pPr>
+                    <w:pStyle w:val="Compact"/>
+                    <w:jc w:val="center"/>
+                  </w:pPr>
+                  <w:r>
+                    <w:t xml:space="preserve">Leached Protein A differed between the scales in the qualification, and the investigation PCP-005 requires was not made</w:t>
+                  </w:r>
+                </w:p>
+              </w:tc>
+              <w:tc>
+                <w:tcPr/>
+                <w:p>
+                  <w:pPr>
+                    <w:pStyle w:val="Compact"/>
+                    <w:jc w:val="center"/>
+                  </w:pPr>
+                  <w:r>
+                    <w:t xml:space="preserve">Version 2.0 re-analysis of the qualification against the Version 1.0 rule</w:t>
+                  </w:r>
+                </w:p>
+              </w:tc>
+              <w:tc>
+                <w:tcPr/>
+                <w:p>
+                  <w:pPr>
+                    <w:pStyle w:val="Compact"/>
+                    <w:jc w:val="center"/>
+                  </w:pPr>
+                  <w:r>
+                    <w:t xml:space="preserve">judged through its offset under the offset rule of PCMP-001 Version 2.0</w:t>
+                  </w:r>
+                </w:p>
+              </w:tc>
+            </w:tr>
+            <w:tr>
+              <w:tc>
+                <w:tcPr/>
+                <w:p>
+                  <w:pPr>
+                    <w:pStyle w:val="Compact"/>
+                    <w:jc w:val="center"/>
+                  </w:pPr>
+                  <w:r>
+                    <w:t xml:space="preserve">DEV-005-05</w:t>
+                  </w:r>
+                </w:p>
+              </w:tc>
+              <w:tc>
+                <w:tcPr/>
+                <w:p>
+                  <w:pPr>
+                    <w:pStyle w:val="Compact"/>
+                    <w:jc w:val="center"/>
+                  </w:pPr>
+                  <w:r>
+                    <w:t xml:space="preserve">Univariate study made before the response-surface design, against the sequence of PCP-005</w:t>
+                  </w:r>
+                </w:p>
+              </w:tc>
+              <w:tc>
+                <w:tcPr/>
+                <w:p>
+                  <w:pPr>
+                    <w:pStyle w:val="Compact"/>
+                    <w:jc w:val="center"/>
+                  </w:pPr>
+                  <w:r>
+                    <w:t xml:space="preserve">Version 2.0 review of the execution dates (INV-001 finding 5)</w:t>
                   </w:r>
                 </w:p>
               </w:tc>
@@ -25653,7 +26667,7 @@
         <w:pStyle w:val="FirstParagraph"/>
       </w:pPr>
       <w:r>
-        <w:t xml:space="preserve">The leached Protein A result of run 11 of the response-surface design was out of trend at analytical review. The first result was 3.82 ppm in the scale-down model, 5.00 ppm at manufacturing scale. The sample was re-assayed under AMV-3016, and the re-assay gave 2.12 ppm, 3.30 ppm at manufacturing scale. The first result was 1.8 times the re-assay. The investigation suspected carryover in the ELISA, which would add analyte from a preceding sample, and did not confirm it. The re-assay result is the one reported in Appendix B and used in the analysis, because the investigation attributed the first result to that suspected cause. The first result was kept in the record with its status marked. Both results lie inside the range of the other runs of the design, and both are far below the criterion of ≤ 158 ppm.</w:t>
+        <w:t xml:space="preserve">The leached Protein A result of run 11 of the response-surface design was out of trend at analytical review. By the rule in the deviation record, a result is out of trend when it lies outside the two-sided 99 % prediction interval of a single result from the full quadratic model of the response-surface design, fitted to the other runs of the design without the result under review, at the settings of the run. The review was made when the design ran, before model selection was adopted on 2026-09-15, so it used the model that PCP-005 specifies. For run 11 the interval, from the other 27 runs with 12 residual degrees of freedom, runs from −1.46 to 5.38 ppm in the scale-down model. Its lower end lies below zero, so at this run only a high result could be out of trend. The first result, 6.37 ppm (7.55 ppm at manufacturing scale), lay above the interval and above every other result of the two designs. The sample was re-assayed under AMV-3016. The re-assay, 2.12 ppm (3.30 ppm at manufacturing scale), lay inside the interval and inside the range of the other runs of the response-surface design, 1.70 to 4.61 ppm. The first result was 3 times the re-assay. The investigation suspected carryover in the ELISA, which would add analyte from a preceding sample, and did not confirm it. The re-assay result is the one reported in Appendix B and used in the analysis, because the investigation attributed the first result to that suspected cause. The first result was kept in the record with its status marked. Both results are far below the criterion of ≤ 158 ppm.</w:t>
       </w:r>
     </w:p>
     <w:p>
@@ -25661,17 +26675,146 @@
         <w:pStyle w:val="BodyText"/>
       </w:pPr>
       <w:r>
-        <w:t xml:space="preserve">With the first result in place of the re-assay, the analysis changes. The model selection then keeps end of pool collect, and that model is not significant (p = 0.052). It fails criterion 2, so leached Protein A would be judged on its measured results. Every result of both designs then meets the criterion, the highest at 5.79 ppm at manufacturing scale. The trend of the residuals on run order is then not significant (p = 0.064). The judgement of leached Protein A against its criterion is therefore the same with either result. Whether leached Protein A depends on end of pool collect, and whether its residuals drift with run order, depends on which result is used.</w:t>
+        <w:t xml:space="preserve">With the first result in place of the re-assay, the analysis changes. The model selection then puts leached Protein A on the log scale and keeps end of pool collect, and that model meets criteria 2 to 4. Its F-test is significant (p = 0.0495), its lack of fit test is not (p = 0.894), and its predicted R² falls short of R² by 0.137. On that model leached Protein A would fall by 22 % across the range of end of pool collect. Its upper prediction limit over the NOR would be 6.60 ppm at manufacturing scale, against 5.52 ppm with the re-assay, and every PAR would still span the range studied of its parameter. The trend of the residuals on run order would not be significant (p = 0.198). The judgement of leached Protein A against its criterion is therefore the same with either result. The class of end of pool collect would not change, because that effect, 0.74 ppm across its range against the criterion of ≤ 158 ppm, is too small to move leached Protein A appreciably (</w:t>
+      </w:r>
+      <w:hyperlink w:anchor="sec-class">
+        <w:r>
+          <w:rPr>
+            <w:rStyle w:val="Hyperlink"/>
+          </w:rPr>
+          <w:t xml:space="preserve">Section 9</w:t>
+        </w:r>
+      </w:hyperlink>
+      <w:r>
+        <w:t xml:space="preserve">). Whether leached Protein A depends on end of pool collect, and whether its residuals drift with run order, depends on which result is used.</w:t>
       </w:r>
     </w:p>
     <w:bookmarkEnd w:id="124"/>
-    <w:bookmarkStart w:id="129" w:name="discrepancies-from-the-plan"/>
+    <w:bookmarkStart w:id="125" w:name="sec-dev03"/>
     <w:p>
       <w:pPr>
         <w:pStyle w:val="Heading2"/>
       </w:pPr>
       <w:r>
-        <w:t xml:space="preserve">13.3 Discrepancies from the plan</w:t>
+        <w:t xml:space="preserve">13.3 DEV-005-03. Univariate study without its centre runs</w:t>
+      </w:r>
+    </w:p>
+    <w:p>
+      <w:pPr>
+        <w:pStyle w:val="FirstParagraph"/>
+      </w:pPr>
+      <w:r>
+        <w:t xml:space="preserve">PCP-005 §6.4 requires each parameter of the univariate study to be run at the low edge, the centre and the high edge of its range studied, with the same responses as in the multivariate designs. Study S-PA-UNI (2025-12-08 to 2025-12-12) ran each end of each range 2 times and made no run at the centre. The 3 set-point runs of the qualification study S-PA-SDM (2025-11-05 to 2025-11-14) served as the reference instead. The departure was found in the Version 2.0 review of the study record against PCP-005, and the runs were retained. Without the centre runs the study has no set-point reference of its own. A difference from the reference therefore combines the effect of the parameter with any difference between the two studies. Step yield was higher than the reference at every end of both ranges (</w:t>
+      </w:r>
+      <w:hyperlink w:anchor="sec-uni">
+        <w:r>
+          <w:rPr>
+            <w:rStyle w:val="Hyperlink"/>
+          </w:rPr>
+          <w:t xml:space="preserve">Section 5.6</w:t>
+        </w:r>
+      </w:hyperlink>
+      <w:r>
+        <w:t xml:space="preserve">), which is consistent with such a difference. The judgement of pool host cell protein and leached Protein A rests on the individual results at both ends, each against its criterion, and does not depend on the reference.</w:t>
+      </w:r>
+    </w:p>
+    <w:bookmarkEnd w:id="125"/>
+    <w:bookmarkStart w:id="126" w:name="sec-dev04"/>
+    <w:p>
+      <w:pPr>
+        <w:pStyle w:val="Heading2"/>
+      </w:pPr>
+      <w:r>
+        <w:t xml:space="preserve">13.4 DEV-005-04. Difference between the scales in leached Protein A not investigated</w:t>
+      </w:r>
+    </w:p>
+    <w:p>
+      <w:pPr>
+        <w:pStyle w:val="FirstParagraph"/>
+      </w:pPr>
+      <w:r>
+        <w:t xml:space="preserve">PCP-005 Version 1.0 accepted the scale-down model for an output only where the qualification showed no difference between the scales significant at α = 0.05, and it required any difference to be investigated. On the 3 scale-down runs of study S-PA-SDM against the 5 manufacturing-scale batches, leached Protein A differs between the scales (p = 0.037, two-sided Student t test with pooled variance). No other output that the qualification compared differs at that level. No investigation is recorded, and Version 1.0 of this report called the scale-down model qualified. The departure was found in the Version 2.0 re-analysis of the qualification against the Version 1.0 rule. PCMP-001 Version 2.0 qualifies a scale-down model by the offset between the scales and not by a test of equivalence (PCMP-001 §7.1). Under that rule leached Protein A is judged through its offset, and the model is qualified for it on the planned runs and on all runs (</w:t>
+      </w:r>
+      <w:hyperlink w:anchor="sec-sdm">
+        <w:r>
+          <w:rPr>
+            <w:rStyle w:val="Hyperlink"/>
+          </w:rPr>
+          <w:t xml:space="preserve">Section 3.1</w:t>
+        </w:r>
+      </w:hyperlink>
+      <w:r>
+        <w:t xml:space="preserve">,</w:t>
+      </w:r>
+      <w:r>
+        <w:t xml:space="preserve"> </w:t>
+      </w:r>
+      <w:hyperlink w:anchor="sec-pd01">
+        <w:r>
+          <w:rPr>
+            <w:rStyle w:val="Hyperlink"/>
+          </w:rPr>
+          <w:t xml:space="preserve">Section 13.6.1</w:t>
+        </w:r>
+      </w:hyperlink>
+      <w:r>
+        <w:t xml:space="preserve">). The expected cause of the difference, the longer hold of the load at manufacturing scale, is stated in</w:t>
+      </w:r>
+      <w:r>
+        <w:t xml:space="preserve"> </w:t>
+      </w:r>
+      <w:hyperlink w:anchor="sec-sdm">
+        <w:r>
+          <w:rPr>
+            <w:rStyle w:val="Hyperlink"/>
+          </w:rPr>
+          <w:t xml:space="preserve">Section 3.1</w:t>
+        </w:r>
+      </w:hyperlink>
+      <w:r>
+        <w:t xml:space="preserve"> </w:t>
+      </w:r>
+      <w:r>
+        <w:t xml:space="preserve">and was not tested.</w:t>
+      </w:r>
+    </w:p>
+    <w:bookmarkEnd w:id="126"/>
+    <w:bookmarkStart w:id="127" w:name="sec-dev05"/>
+    <w:p>
+      <w:pPr>
+        <w:pStyle w:val="Heading2"/>
+      </w:pPr>
+      <w:r>
+        <w:t xml:space="preserve">13.5 DEV-005-05. Univariate study made before the response-surface design</w:t>
+      </w:r>
+    </w:p>
+    <w:p>
+      <w:pPr>
+        <w:pStyle w:val="FirstParagraph"/>
+      </w:pPr>
+      <w:r>
+        <w:t xml:space="preserve">PCP-005 §11 sets the order of the work. The qualification runs come first, the screening design second and the response-surface design third, and the univariate assessments come fourth and may run in parallel with the response-surface design. Study S-PA-UNI ran from 2025-12-08 to 2025-12-12, after the screening design ended on 2025-12-05 and before the response-surface design began on 2026-01-12 (</w:t>
+      </w:r>
+      <w:hyperlink w:anchor="tbl-chronology">
+        <w:r>
+          <w:rPr>
+            <w:rStyle w:val="Hyperlink"/>
+          </w:rPr>
+          <w:t xml:space="preserve">Table 8</w:t>
+        </w:r>
+      </w:hyperlink>
+      <w:r>
+        <w:t xml:space="preserve">). The departure was found in the Version 2.0 review of the execution dates (INV-001 finding 5), and the runs were retained. The univariate study is judged on its own runs and on the set-point runs of the qualification study, and no result of the response-surface design depends on it, so the order changes no conclusion of this report.</w:t>
+      </w:r>
+    </w:p>
+    <w:bookmarkEnd w:id="127"/>
+    <w:bookmarkStart w:id="132" w:name="discrepancies-from-the-plan"/>
+    <w:p>
+      <w:pPr>
+        <w:pStyle w:val="Heading2"/>
+      </w:pPr>
+      <w:r>
+        <w:t xml:space="preserve">13.6 Discrepancies from the plan</w:t>
       </w:r>
     </w:p>
     <w:p>
@@ -25696,7 +26839,7 @@
         <w:t xml:space="preserve"> </w:t>
       </w:r>
       <w:r>
-        <w:t xml:space="preserve">lists with what PCP-005 planned, what was done and why. They are judged against PCP-005 Version 2.0, the plan this report is written against. That version includes the retest of retained samples, S-PA-RET, made under the method decision AMD-001, so S-PA-RET is not a discrepancy. Four discrepancies change how the runs are analysed or measured and are described where their results are reported. They are the influence analysis on which the conclusions rest because no selected model meets criterion 5 (PD-005-02,</w:t>
+        <w:t xml:space="preserve">lists with what PCP-005 planned, what was done and why. They are judged against PCP-005 Version 2.0, the plan this report is written against. That version includes the retest of retained samples, S-PA-RET, made under the method decision AMD-001, so S-PA-RET is not a discrepancy. Four discrepancies change how the runs are analysed or measured and are described where their results are reported. They are the use for the ranges and the design space of the models of leached Protein A and fragments, which do not meet criterion 5 (PD-005-02,</w:t>
       </w:r>
       <w:r>
         <w:t xml:space="preserve"> </w:t>
@@ -25755,13 +26898,13 @@
         <w:t xml:space="preserve">). The other two are further studies, described below.</w:t>
       </w:r>
     </w:p>
-    <w:bookmarkStart w:id="126" w:name="sec-pd01"/>
+    <w:bookmarkStart w:id="129" w:name="sec-pd01"/>
     <w:p>
       <w:pPr>
         <w:pStyle w:val="Heading3"/>
       </w:pPr>
       <w:r>
-        <w:t xml:space="preserve">13.3.1 PD-005-01. Supplementary set-point runs in the scale-down model qualification</w:t>
+        <w:t xml:space="preserve">13.6.1 PD-005-01. Supplementary set-point runs in the scale-down model qualification</w:t>
       </w:r>
     </w:p>
     <w:p>
@@ -25810,7 +26953,7 @@
       <w:tr>
         <w:tc>
           <w:tcPr/>
-          <w:bookmarkStart w:id="125" w:name="tbl-sdm-offsets-planned"/>
+          <w:bookmarkStart w:id="128" w:name="tbl-sdm-offsets-planned"/>
           <w:p>
             <w:pPr>
               <w:jc w:val="center"/>
@@ -26236,19 +27379,19 @@
                     <w:jc w:val="center"/>
                   </w:pPr>
                   <w:r>
-                    <w:t xml:space="preserve">-1.60</w:t>
-                  </w:r>
-                </w:p>
-              </w:tc>
-              <w:tc>
-                <w:tcPr/>
-                <w:p>
-                  <w:pPr>
-                    <w:pStyle w:val="Compact"/>
-                    <w:jc w:val="center"/>
-                  </w:pPr>
-                  <w:r>
-                    <w:t xml:space="preserve">-2.76 to -0.43</w:t>
+                    <w:t xml:space="preserve">−1.60</w:t>
+                  </w:r>
+                </w:p>
+              </w:tc>
+              <w:tc>
+                <w:tcPr/>
+                <w:p>
+                  <w:pPr>
+                    <w:pStyle w:val="Compact"/>
+                    <w:jc w:val="center"/>
+                  </w:pPr>
+                  <w:r>
+                    <w:t xml:space="preserve">−2.76 to −0.43</w:t>
                   </w:r>
                 </w:p>
               </w:tc>
@@ -26340,19 +27483,19 @@
                     <w:jc w:val="center"/>
                   </w:pPr>
                   <w:r>
-                    <w:t xml:space="preserve">-0.8</w:t>
-                  </w:r>
-                </w:p>
-              </w:tc>
-              <w:tc>
-                <w:tcPr/>
-                <w:p>
-                  <w:pPr>
-                    <w:pStyle w:val="Compact"/>
-                    <w:jc w:val="center"/>
-                  </w:pPr>
-                  <w:r>
-                    <w:t xml:space="preserve">-4.5 to 2.9</w:t>
+                    <w:t xml:space="preserve">−0.8</w:t>
+                  </w:r>
+                </w:p>
+              </w:tc>
+              <w:tc>
+                <w:tcPr/>
+                <w:p>
+                  <w:pPr>
+                    <w:pStyle w:val="Compact"/>
+                    <w:jc w:val="center"/>
+                  </w:pPr>
+                  <w:r>
+                    <w:t xml:space="preserve">−4.5 to 2.9</w:t>
                   </w:r>
                 </w:p>
               </w:tc>
@@ -26456,19 +27599,19 @@
                     <w:jc w:val="center"/>
                   </w:pPr>
                   <w:r>
-                    <w:t xml:space="preserve">-188</w:t>
-                  </w:r>
-                </w:p>
-              </w:tc>
-              <w:tc>
-                <w:tcPr/>
-                <w:p>
-                  <w:pPr>
-                    <w:pStyle w:val="Compact"/>
-                    <w:jc w:val="center"/>
-                  </w:pPr>
-                  <w:r>
-                    <w:t xml:space="preserve">-390 to 13</w:t>
+                    <w:t xml:space="preserve">−188</w:t>
+                  </w:r>
+                </w:p>
+              </w:tc>
+              <w:tc>
+                <w:tcPr/>
+                <w:p>
+                  <w:pPr>
+                    <w:pStyle w:val="Compact"/>
+                    <w:jc w:val="center"/>
+                  </w:pPr>
+                  <w:r>
+                    <w:t xml:space="preserve">−390 to 13</w:t>
                   </w:r>
                 </w:p>
               </w:tc>
@@ -26584,7 +27727,7 @@
                     <w:jc w:val="center"/>
                   </w:pPr>
                   <w:r>
-                    <w:t xml:space="preserve">-0.11 to 0.11</w:t>
+                    <w:t xml:space="preserve">−0.11 to 0.11</w:t>
                   </w:r>
                 </w:p>
               </w:tc>
@@ -26692,7 +27835,7 @@
               </w:tc>
             </w:tr>
           </w:tbl>
-          <w:bookmarkEnd w:id="125"/>
+          <w:bookmarkEnd w:id="128"/>
           <w:p/>
         </w:tc>
       </w:tr>
@@ -26705,14 +27848,14 @@
         <w:t xml:space="preserve">The decision to make the runs was taken during the re-analysis, after the result on the planned runs was known. The qualification for pool host cell protein therefore rests on runs added after a result was seen. Runs added until a test passes raise the chance that it passes, and this is a limitation of that qualification. The rule of qualification and the criterion were not changed because of the further runs. Only the number of runs grew. The centre points of the designs are also set-point runs of the scale-down model. They were not added to the offset, because PCP-005 §5.1 defines the qualification on the runs of the qualification study.</w:t>
       </w:r>
     </w:p>
-    <w:bookmarkEnd w:id="126"/>
-    <w:bookmarkStart w:id="128" w:name="sec-pd05"/>
+    <w:bookmarkEnd w:id="129"/>
+    <w:bookmarkStart w:id="131" w:name="sec-pd05"/>
     <w:p>
       <w:pPr>
         <w:pStyle w:val="Heading3"/>
       </w:pPr>
       <w:r>
-        <w:t xml:space="preserve">13.3.2 PD-005-05. Hold study of the Protein A eluate</w:t>
+        <w:t xml:space="preserve">13.6.2 PD-005-05. Hold study of the Protein A eluate</w:t>
       </w:r>
     </w:p>
     <w:p>
@@ -26767,7 +27910,7 @@
       <w:tr>
         <w:tc>
           <w:tcPr/>
-          <w:bookmarkStart w:id="127" w:name="tbl-pd"/>
+          <w:bookmarkStart w:id="130" w:name="tbl-pd"/>
           <w:p>
             <w:pPr>
               <w:jc w:val="center"/>
@@ -26942,43 +28085,43 @@
                     <w:jc w:val="center"/>
                   </w:pPr>
                   <w:r>
-                    <w:t xml:space="preserve">Conclusions resting on an influence analysis</w:t>
-                  </w:r>
-                </w:p>
-              </w:tc>
-              <w:tc>
-                <w:tcPr/>
-                <w:p>
-                  <w:pPr>
-                    <w:pStyle w:val="Compact"/>
-                    <w:jc w:val="center"/>
-                  </w:pPr>
-                  <w:r>
-                    <w:t xml:space="preserve">PCP-005: response-surface models meeting every model-adequacy criterion of the plan, used for the ranges and the design space</w:t>
-                  </w:r>
-                </w:p>
-              </w:tc>
-              <w:tc>
-                <w:tcPr/>
-                <w:p>
-                  <w:pPr>
-                    <w:pStyle w:val="Compact"/>
-                    <w:jc w:val="center"/>
-                  </w:pPr>
-                  <w:r>
-                    <w:t xml:space="preserve">an influence analysis for every output with a criterion (each run with a Cook's distance above 4/n deleted in turn, the model selection repeated and the output judged over the NOR again), and the size of each residual trend against the criterion of its output</w:t>
-                  </w:r>
-                </w:p>
-              </w:tc>
-              <w:tc>
-                <w:tcPr/>
-                <w:p>
-                  <w:pPr>
-                    <w:pStyle w:val="Compact"/>
-                    <w:jc w:val="center"/>
-                  </w:pPr>
-                  <w:r>
-                    <w:t xml:space="preserve">no selected model meets criterion 5 of the plan, on influential runs and residual trends</w:t>
+                    <w:t xml:space="preserve">Conclusions resting on models that do not meet the criterion on residuals and influential runs</w:t>
+                  </w:r>
+                </w:p>
+              </w:tc>
+              <w:tc>
+                <w:tcPr/>
+                <w:p>
+                  <w:pPr>
+                    <w:pStyle w:val="Compact"/>
+                    <w:jc w:val="center"/>
+                  </w:pPr>
+                  <w:r>
+                    <w:t xml:space="preserve">PCP-005: response-surface models meeting every model-adequacy criterion of the plan (criterion 5), used for the ranges and the design space, and each run with a Cook's distance above 4/n examined by deleting it and repeating the judgement</w:t>
+                  </w:r>
+                </w:p>
+              </w:tc>
+              <w:tc>
+                <w:tcPr/>
+                <w:p>
+                  <w:pPr>
+                    <w:pStyle w:val="Compact"/>
+                    <w:jc w:val="center"/>
+                  </w:pPr>
+                  <w:r>
+                    <w:t xml:space="preserve">the models of the outputs that do not meet the criterion on residual patterns and influential runs (a residual trend at the level of the residual tests, or a run with a Cook's distance above the median of F(p, n - p)) used for the ranges and the design space, with the size of each trend stated against the criterion of its output and each run above the limit deleted in turn, the model selection repeated and the output judged over the NOR again</w:t>
+                  </w:r>
+                </w:p>
+              </w:tc>
+              <w:tc>
+                <w:tcPr/>
+                <w:p>
+                  <w:pPr>
+                    <w:pStyle w:val="Compact"/>
+                    <w:jc w:val="center"/>
+                  </w:pPr>
+                  <w:r>
+                    <w:t xml:space="preserve">selected models of this step do not meet the criterion of PCMP-001 §7.2 on residual patterns and influential runs (doe_report.residual_influence); whether a conclusion depends on the trend or on the run is shown by the size of the trend and by the deletion</w:t>
                   </w:r>
                 </w:p>
               </w:tc>
@@ -27232,15 +28375,15 @@
               </w:tc>
             </w:tr>
           </w:tbl>
-          <w:bookmarkEnd w:id="127"/>
+          <w:bookmarkEnd w:id="130"/>
           <w:p/>
         </w:tc>
       </w:tr>
     </w:tbl>
-    <w:bookmarkEnd w:id="128"/>
-    <w:bookmarkEnd w:id="129"/>
-    <w:bookmarkEnd w:id="130"/>
-    <w:bookmarkStart w:id="141" w:name="appendices"/>
+    <w:bookmarkEnd w:id="131"/>
+    <w:bookmarkEnd w:id="132"/>
+    <w:bookmarkEnd w:id="133"/>
+    <w:bookmarkStart w:id="144" w:name="appendices"/>
     <w:p>
       <w:pPr>
         <w:pStyle w:val="Heading1"/>
@@ -27249,7 +28392,7 @@
         <w:t xml:space="preserve">Appendices</w:t>
       </w:r>
     </w:p>
-    <w:bookmarkStart w:id="133" w:name="X3eb0dc32945a2e53c94598b2756dbf9ce86c7a7"/>
+    <w:bookmarkStart w:id="136" w:name="X3eb0dc32945a2e53c94598b2756dbf9ce86c7a7"/>
     <w:p>
       <w:pPr>
         <w:pStyle w:val="Heading2"/>
@@ -27307,7 +28450,7 @@
       <w:tr>
         <w:tc>
           <w:tcPr/>
-          <w:bookmarkStart w:id="131" w:name="tbl-doe-protein-a-screening"/>
+          <w:bookmarkStart w:id="134" w:name="tbl-doe-protein-a-screening"/>
           <w:p>
             <w:pPr>
               <w:jc w:val="center"/>
@@ -29986,7 +31129,7 @@
               </w:tc>
             </w:tr>
           </w:tbl>
-          <w:bookmarkEnd w:id="131"/>
+          <w:bookmarkEnd w:id="134"/>
           <w:p/>
         </w:tc>
       </w:tr>
@@ -30012,7 +31155,7 @@
       <w:tr>
         <w:tc>
           <w:tcPr/>
-          <w:bookmarkStart w:id="132" w:name="tbl-app-scr-info"/>
+          <w:bookmarkStart w:id="135" w:name="tbl-app-scr-info"/>
           <w:p>
             <w:pPr>
               <w:jc w:val="center"/>
@@ -31324,13 +32467,13 @@
               </w:tc>
             </w:tr>
           </w:tbl>
-          <w:bookmarkEnd w:id="132"/>
+          <w:bookmarkEnd w:id="135"/>
           <w:p/>
         </w:tc>
       </w:tr>
     </w:tbl>
-    <w:bookmarkEnd w:id="133"/>
-    <w:bookmarkStart w:id="136" w:name="X4125de861a1edaf509f699b4c84c2434921439f"/>
+    <w:bookmarkEnd w:id="136"/>
+    <w:bookmarkStart w:id="139" w:name="X4125de861a1edaf509f699b4c84c2434921439f"/>
     <w:p>
       <w:pPr>
         <w:pStyle w:val="Heading2"/>
@@ -31388,7 +32531,7 @@
       <w:tr>
         <w:tc>
           <w:tcPr/>
-          <w:bookmarkStart w:id="134" w:name="tbl-doe-protein-a-rsm"/>
+          <w:bookmarkStart w:id="137" w:name="tbl-doe-protein-a-rsm"/>
           <w:p>
             <w:pPr>
               <w:jc w:val="center"/>
@@ -35552,7 +36695,7 @@
               </w:tc>
             </w:tr>
           </w:tbl>
-          <w:bookmarkEnd w:id="134"/>
+          <w:bookmarkEnd w:id="137"/>
           <w:p/>
         </w:tc>
       </w:tr>
@@ -35578,7 +36721,7 @@
       <w:tr>
         <w:tc>
           <w:tcPr/>
-          <w:bookmarkStart w:id="135" w:name="tbl-app-rsm-info"/>
+          <w:bookmarkStart w:id="138" w:name="tbl-app-rsm-info"/>
           <w:p>
             <w:pPr>
               <w:jc w:val="center"/>
@@ -37803,13 +38946,13 @@
               </w:tc>
             </w:tr>
           </w:tbl>
-          <w:bookmarkEnd w:id="135"/>
+          <w:bookmarkEnd w:id="138"/>
           <w:p/>
         </w:tc>
       </w:tr>
     </w:tbl>
-    <w:bookmarkEnd w:id="136"/>
-    <w:bookmarkStart w:id="138" w:name="X36bf6f5778a70498f998897bcaba6cd1608671a"/>
+    <w:bookmarkEnd w:id="139"/>
+    <w:bookmarkStart w:id="141" w:name="X36bf6f5778a70498f998897bcaba6cd1608671a"/>
     <w:p>
       <w:pPr>
         <w:pStyle w:val="Heading2"/>
@@ -37926,7 +39069,7 @@
       <w:tr>
         <w:tc>
           <w:tcPr/>
-          <w:bookmarkStart w:id="137" w:name="tbl-scr-lpa"/>
+          <w:bookmarkStart w:id="140" w:name="tbl-scr-lpa"/>
           <w:p>
             <w:pPr>
               <w:jc w:val="center"/>
@@ -38772,13 +39915,13 @@
               </w:tc>
             </w:tr>
           </w:tbl>
-          <w:bookmarkEnd w:id="137"/>
+          <w:bookmarkEnd w:id="140"/>
           <w:p/>
         </w:tc>
       </w:tr>
     </w:tbl>
-    <w:bookmarkEnd w:id="138"/>
-    <w:bookmarkStart w:id="140" w:name="appendix-d.-analytical-methods-summary"/>
+    <w:bookmarkEnd w:id="141"/>
+    <w:bookmarkStart w:id="143" w:name="appendix-d.-analytical-methods-summary"/>
     <w:p>
       <w:pPr>
         <w:pStyle w:val="Heading2"/>
@@ -38819,7 +39962,7 @@
       <w:tr>
         <w:tc>
           <w:tcPr/>
-          <w:bookmarkStart w:id="139" w:name="tbl-methods-summary"/>
+          <w:bookmarkStart w:id="142" w:name="tbl-methods-summary"/>
           <w:p>
             <w:pPr>
               <w:jc w:val="center"/>
@@ -39468,14 +40611,14 @@
               </w:tc>
             </w:tr>
           </w:tbl>
-          <w:bookmarkEnd w:id="139"/>
+          <w:bookmarkEnd w:id="142"/>
           <w:p/>
         </w:tc>
       </w:tr>
     </w:tbl>
-    <w:bookmarkEnd w:id="140"/>
-    <w:bookmarkEnd w:id="141"/>
-    <w:bookmarkStart w:id="152" w:name="references"/>
+    <w:bookmarkEnd w:id="143"/>
+    <w:bookmarkEnd w:id="144"/>
+    <w:bookmarkStart w:id="155" w:name="references"/>
     <w:p>
       <w:pPr>
         <w:pStyle w:val="Heading1"/>
@@ -39484,8 +40627,8 @@
         <w:t xml:space="preserve">References</w:t>
       </w:r>
     </w:p>
-    <w:bookmarkStart w:id="151" w:name="refs"/>
-    <w:bookmarkStart w:id="142" w:name="ref-boxcox1964"/>
+    <w:bookmarkStart w:id="154" w:name="refs"/>
+    <w:bookmarkStart w:id="145" w:name="ref-boxcox1964"/>
     <w:p>
       <w:pPr>
         <w:pStyle w:val="Bibliography"/>
@@ -39516,8 +40659,8 @@
         <w:t xml:space="preserve">26 (2): 211–52.</w:t>
       </w:r>
     </w:p>
-    <w:bookmarkEnd w:id="142"/>
-    <w:bookmarkStart w:id="143" w:name="ref-burnham2002"/>
+    <w:bookmarkEnd w:id="145"/>
+    <w:bookmarkStart w:id="146" w:name="ref-burnham2002"/>
     <w:p>
       <w:pPr>
         <w:pStyle w:val="Bibliography"/>
@@ -39539,8 +40682,8 @@
         <w:t xml:space="preserve">. 2nd ed. New York: Springer.</w:t>
       </w:r>
     </w:p>
-    <w:bookmarkEnd w:id="143"/>
-    <w:bookmarkStart w:id="144" w:name="ref-amab2009"/>
+    <w:bookmarkEnd w:id="146"/>
+    <w:bookmarkStart w:id="147" w:name="ref-amab2009"/>
     <w:p>
       <w:pPr>
         <w:pStyle w:val="Bibliography"/>
@@ -39561,8 +40704,8 @@
         <w:t xml:space="preserve">CASSS.</w:t>
       </w:r>
     </w:p>
-    <w:bookmarkEnd w:id="144"/>
-    <w:bookmarkStart w:id="145" w:name="ref-hurvich1989"/>
+    <w:bookmarkEnd w:id="147"/>
+    <w:bookmarkStart w:id="148" w:name="ref-hurvich1989"/>
     <w:p>
       <w:pPr>
         <w:pStyle w:val="Bibliography"/>
@@ -39593,8 +40736,8 @@
         <w:t xml:space="preserve">76 (2): 297–307.</w:t>
       </w:r>
     </w:p>
-    <w:bookmarkEnd w:id="145"/>
-    <w:bookmarkStart w:id="146" w:name="ref-ichq8"/>
+    <w:bookmarkEnd w:id="148"/>
+    <w:bookmarkStart w:id="149" w:name="ref-ichq8"/>
     <w:p>
       <w:pPr>
         <w:pStyle w:val="Bibliography"/>
@@ -39615,8 +40758,8 @@
         <w:t xml:space="preserve">ICH.</w:t>
       </w:r>
     </w:p>
-    <w:bookmarkEnd w:id="146"/>
-    <w:bookmarkStart w:id="147" w:name="ref-ichq11"/>
+    <w:bookmarkEnd w:id="149"/>
+    <w:bookmarkStart w:id="150" w:name="ref-ichq11"/>
     <w:p>
       <w:pPr>
         <w:pStyle w:val="Bibliography"/>
@@ -39637,8 +40780,8 @@
         <w:t xml:space="preserve">ICH.</w:t>
       </w:r>
     </w:p>
-    <w:bookmarkEnd w:id="147"/>
-    <w:bookmarkStart w:id="148" w:name="ref-ichq9"/>
+    <w:bookmarkEnd w:id="150"/>
+    <w:bookmarkStart w:id="151" w:name="ref-ichq9"/>
     <w:p>
       <w:pPr>
         <w:pStyle w:val="Bibliography"/>
@@ -39659,8 +40802,8 @@
         <w:t xml:space="preserve">ICH.</w:t>
       </w:r>
     </w:p>
-    <w:bookmarkEnd w:id="148"/>
-    <w:bookmarkStart w:id="149" w:name="ref-montgomery2017"/>
+    <w:bookmarkEnd w:id="151"/>
+    <w:bookmarkStart w:id="152" w:name="ref-montgomery2017"/>
     <w:p>
       <w:pPr>
         <w:pStyle w:val="Bibliography"/>
@@ -39682,8 +40825,8 @@
         <w:t xml:space="preserve">. 9th ed. Hoboken, NJ: Wiley.</w:t>
       </w:r>
     </w:p>
-    <w:bookmarkEnd w:id="149"/>
-    <w:bookmarkStart w:id="150" w:name="ref-fda2011"/>
+    <w:bookmarkEnd w:id="152"/>
+    <w:bookmarkStart w:id="153" w:name="ref-fda2011"/>
     <w:p>
       <w:pPr>
         <w:pStyle w:val="Bibliography"/>
@@ -39704,9 +40847,9 @@
         <w:t xml:space="preserve">FDA.</w:t>
       </w:r>
     </w:p>
-    <w:bookmarkEnd w:id="150"/>
-    <w:bookmarkEnd w:id="151"/>
-    <w:bookmarkEnd w:id="152"/>
+    <w:bookmarkEnd w:id="153"/>
+    <w:bookmarkEnd w:id="154"/>
+    <w:bookmarkEnd w:id="155"/>
     <w:sectPr>
       <w:footnotePr>
         <w:numRestart w:val="eachSect"/>

</xml_diff>

<commit_message>
PCR-005 record pass (75 pp): two study events and nine discrepancies, single-run limits in the criteria table; promote PCR-006 Version 2.0 (81 pp) after its final pass
Co-Authored-By: Claude Opus 5.5 <noreply@anthropic.com>
</commit_message>
<xml_diff>
--- a/pc_package/PCR-005_protein_a.docx
+++ b/pc_package/PCR-005_protein_a.docx
@@ -2520,7 +2520,7 @@
         <w:pStyle w:val="BodyText"/>
       </w:pPr>
       <w:r>
-        <w:t xml:space="preserve">The 5 deviations of the step (DEV-005-01 to DEV-005-05) were assessed, and none changes the judgement of an output against its criterion. The report also records 6 discrepancies from the plan (</w:t>
+        <w:t xml:space="preserve">The 2 study events of the step (DEV-005-01 and DEV-005-02) change no judgement of an output against its criterion. The report also records 9 discrepancies from the plan (</w:t>
       </w:r>
       <w:hyperlink w:anchor="sec-dev">
         <w:r>
@@ -2835,7 +2835,7 @@
           <w:rPr>
             <w:rStyle w:val="Hyperlink"/>
           </w:rPr>
-          <w:t xml:space="preserve">Section 13.6.2</w:t>
+          <w:t xml:space="preserve">Section 13.3.2</w:t>
         </w:r>
       </w:hyperlink>
       <w:r>
@@ -3994,7 +3994,7 @@
           <w:rPr>
             <w:rStyle w:val="Hyperlink"/>
           </w:rPr>
-          <w:t xml:space="preserve">Section 13.6.2</w:t>
+          <w:t xml:space="preserve">Section 13.3.2</w:t>
         </w:r>
       </w:hyperlink>
       <w:r>
@@ -4033,7 +4033,7 @@
         </w:numPr>
       </w:pPr>
       <w:r>
-        <w:t xml:space="preserve">The deviations DEV-005-03 to DEV-005-05, on the univariate study and on the qualification of the scale-down model, are recorded (</w:t>
+        <w:t xml:space="preserve">The events that Version 1.0 numbered as deviations, DEV-005-01 and DEV-005-02, are recorded as study events under their numbers, because a process characterization study is not GMP manufacture. The departures from the plan found in the re-analysis are recorded as discrepancies from the plan (</w:t>
       </w:r>
       <w:hyperlink w:anchor="sec-dev">
         <w:r>
@@ -4873,7 +4873,7 @@
           <w:rPr>
             <w:rStyle w:val="Hyperlink"/>
           </w:rPr>
-          <w:t xml:space="preserve">Section 13.6.1</w:t>
+          <w:t xml:space="preserve">Section 13.3.1</w:t>
         </w:r>
       </w:hyperlink>
       <w:r>
@@ -5855,7 +5855,7 @@
           <w:rPr>
             <w:rStyle w:val="Hyperlink"/>
           </w:rPr>
-          <w:t xml:space="preserve">Section 13.6.1</w:t>
+          <w:t xml:space="preserve">Section 13.3.1</w:t>
         </w:r>
       </w:hyperlink>
       <w:r>
@@ -5890,17 +5890,17 @@
         <w:pStyle w:val="FirstParagraph"/>
       </w:pPr>
       <w:r>
-        <w:t xml:space="preserve">Leached Protein A is 1.18 ppm lower in the scale-down model. The 90 % confidence interval of the difference, 0.39 to 1.97 ppm lower, excludes zero, and each scale-down run was below the manufacturing mean. The expected cause is cleavage of the ligand by harvest proteases. At manufacturing scale the clarified harvest is held longer before capture. Proteolytic activity in the harvest is expected to rise while it is held, and the load then cleaves more ligand from the resin during loading. This study does not test that cause. With the offset at either end of its interval the conclusion for leached Protein A is the same, and the model is qualified for it. On the 3 runs of the planned study S-PA-SDM alone, the two scales differ in leached Protein A (p = 0.037). PCP-005 Version 1.0 required such a difference to be investigated, and no investigation is recorded (deviation DEV-005-04,</w:t>
+        <w:t xml:space="preserve">Leached Protein A is 1.18 ppm lower in the scale-down model. The 90 % confidence interval of the difference, 0.39 to 1.97 ppm lower, excludes zero, and each scale-down run was below the manufacturing mean. The expected cause is cleavage of the ligand by harvest proteases. At manufacturing scale the clarified harvest is held longer before capture. Proteolytic activity in the harvest is expected to rise while it is held, and the load then cleaves more ligand from the resin during loading. This study does not test that cause. With the offset at either end of its interval the conclusion for leached Protein A is the same, and the model is qualified for it. On the 3 runs of the planned study S-PA-SDM alone, the two scales differ in leached Protein A (p = 0.037). PCP-005 Version 1.0 required such a difference to be investigated before the characterization studies, and it was not (discrepancy PD-005-08,</w:t>
       </w:r>
       <w:r>
         <w:t xml:space="preserve"> </w:t>
       </w:r>
-      <w:hyperlink w:anchor="sec-dev04">
+      <w:hyperlink w:anchor="sec-pd08">
         <w:r>
           <w:rPr>
             <w:rStyle w:val="Hyperlink"/>
           </w:rPr>
-          <w:t xml:space="preserve">Section 13.4</w:t>
+          <w:t xml:space="preserve">Section 13.3.4</w:t>
         </w:r>
       </w:hyperlink>
       <w:r>
@@ -8401,17 +8401,17 @@
         </w:r>
       </w:hyperlink>
       <w:r>
-        <w:t xml:space="preserve">. Each study began after PCP-005 Version 1.0 was approved on 2025-11-03. Study S-PA-UNI ran before the response-surface design began, against the order of PCP-005 §11, in which the univariate assessments come fourth (deviation DEV-005-05,</w:t>
+        <w:t xml:space="preserve">. Each study began after PCP-005 Version 1.0 was approved on 2025-11-03. Study S-PA-UNI ran before the response-surface design began, against the order of PCP-005 §11, in which the univariate assessments come fourth (discrepancy PD-005-09,</w:t>
       </w:r>
       <w:r>
         <w:t xml:space="preserve"> </w:t>
       </w:r>
-      <w:hyperlink w:anchor="sec-dev05">
+      <w:hyperlink w:anchor="sec-pd09">
         <w:r>
           <w:rPr>
             <w:rStyle w:val="Hyperlink"/>
           </w:rPr>
-          <w:t xml:space="preserve">Section 13.5</w:t>
+          <w:t xml:space="preserve">Section 13.3.5</w:t>
         </w:r>
       </w:hyperlink>
       <w:r>
@@ -9173,17 +9173,17 @@
         <w:pStyle w:val="FirstParagraph"/>
       </w:pPr>
       <w:r>
-        <w:t xml:space="preserve">Operating temperature and bed height were studied one factor at a time in the univariate study S-PA-UNI (2025-12-08 to 2025-12-12), with the other parameters at their set-points. Each was run 2 times at the low and the high end of its range studied. The 3 set-point runs of the planned qualification study S-PA-SDM served as the reference, in place of the runs at the centre of each range that PCP-005 §6.4 requires (deviation DEV-005-03,</w:t>
+        <w:t xml:space="preserve">Operating temperature and bed height were studied one factor at a time in the univariate study S-PA-UNI (2025-12-08 to 2025-12-12), with the other parameters at their set-points. Each was run 2 times at the low and the high end of its range studied. The 3 set-point runs of the planned qualification study S-PA-SDM served as the reference, in place of the runs at the centre of each range that PCP-005 §6.4 requires (discrepancy PD-005-07,</w:t>
       </w:r>
       <w:r>
         <w:t xml:space="preserve"> </w:t>
       </w:r>
-      <w:hyperlink w:anchor="sec-dev03">
+      <w:hyperlink w:anchor="sec-pd07">
         <w:r>
           <w:rPr>
             <w:rStyle w:val="Hyperlink"/>
           </w:rPr>
-          <w:t xml:space="preserve">Section 13.3</w:t>
+          <w:t xml:space="preserve">Section 13.3.3</w:t>
         </w:r>
       </w:hyperlink>
       <w:r>
@@ -9223,7 +9223,7 @@
           <w:rPr>
             <w:rStyle w:val="Hyperlink"/>
           </w:rPr>
-          <w:t xml:space="preserve">Section 13.6.2</w:t>
+          <w:t xml:space="preserve">Section 13.3.2</w:t>
         </w:r>
       </w:hyperlink>
       <w:r>
@@ -12790,7 +12790,7 @@
                     <w:jc w:val="center"/>
                   </w:pPr>
                   <w:r>
-                    <w:t xml:space="preserve">Gap: R² minus predicted R², at most 0.20 under PCMP-001 §7.2. Model used: the scale chosen by the Box-Cox profile and the model with the lowest AICc among the hierarchical submodels of the full quadratic, a block term kept (INV-002).</w:t>
+                    <w:t xml:space="preserve">Gap: R² minus predicted R², at most 0.20 under PCMP-001 §7.2. Model used: the scale chosen by the Box-Cox profile and the model with the lowest AICc among the hierarchical submodels of the full quadratic, on one block of runs (INV-002).</w:t>
                   </w:r>
                 </w:p>
               </w:tc>
@@ -17617,17 +17617,17 @@
         <w:t xml:space="preserve"> </w:t>
       </w:r>
       <w:r>
-        <w:t xml:space="preserve">gives the results of the univariate study S-PA-UNI for pool host cell protein, step yield and leached Protein A. Each end of each range is the arithmetic mean of 2 runs. The difference is taken from the arithmetic mean of the 3 set-point runs of the planned qualification study S-PA-SDM, with its 95 % confidence interval (Student t, pooled variance). The qualification runs are the reference because the univariate study made no run at the centre of each range (DEV-005-03,</w:t>
+        <w:t xml:space="preserve">gives the results of the univariate study S-PA-UNI for pool host cell protein, step yield and leached Protein A. Each end of each range is the arithmetic mean of 2 runs. The difference is taken from the arithmetic mean of the 3 set-point runs of the planned qualification study S-PA-SDM, with its 95 % confidence interval (Student t, pooled variance). The qualification runs are the reference because the univariate study made no run at the centre of each range (PD-005-07,</w:t>
       </w:r>
       <w:r>
         <w:t xml:space="preserve"> </w:t>
       </w:r>
-      <w:hyperlink w:anchor="sec-dev03">
+      <w:hyperlink w:anchor="sec-pd07">
         <w:r>
           <w:rPr>
             <w:rStyle w:val="Hyperlink"/>
           </w:rPr>
-          <w:t xml:space="preserve">Section 13.3</w:t>
+          <w:t xml:space="preserve">Section 13.3.3</w:t>
         </w:r>
       </w:hyperlink>
       <w:r>
@@ -19570,12 +19570,12 @@
       <w:r>
         <w:t xml:space="preserve">Every confidence interval includes zero. The largest difference in pool host cell protein, 2,005 ng/mg at 15 °C of operating temperature, is not significant. With 2 runs at each end the intervals are wide, so the study excludes only effects larger than their upper bounds. Step yield was 2.4 to 4.1 percentage points higher than the reference at every end. The difference has the same sign at both ends of both parameters. It is therefore more likely a difference between the reference runs and the univariate runs than an effect of either parameter (</w:t>
       </w:r>
-      <w:hyperlink w:anchor="sec-dev03">
+      <w:hyperlink w:anchor="sec-pd07">
         <w:r>
           <w:rPr>
             <w:rStyle w:val="Hyperlink"/>
           </w:rPr>
-          <w:t xml:space="preserve">Section 13.3</w:t>
+          <w:t xml:space="preserve">Section 13.3.3</w:t>
         </w:r>
       </w:hyperlink>
       <w:r>
@@ -23089,7 +23089,7 @@
         <w:t xml:space="preserve"> </w:t>
       </w:r>
       <w:r>
-        <w:t xml:space="preserve">gives each output at the set-point and over the NOR, as predicted by its selected model. Pool host cell protein and leached Protein A are at manufacturing scale. Fragments are in the scale-down model, because they carry no offset.</w:t>
+        <w:t xml:space="preserve">gives each output at the set-point and over the NOR, as predicted by its selected model, and the 95 % limits of a single run over the NOR, which decide the verdict. Pool host cell protein and leached Protein A are at manufacturing scale. Fragments are in the scale-down model, because they carry no offset.</w:t>
       </w:r>
     </w:p>
     <w:tbl>
@@ -23127,11 +23127,12 @@
               <w:tblLook w:firstRow="1" w:lastRow="1" w:firstColumn="0" w:lastColumn="0" w:noHBand="0" w:noVBand="0" w:val="0020"/>
             </w:tblPr>
             <w:tblGrid>
-              <w:gridCol w:w="1584"/>
-              <w:gridCol w:w="1584"/>
-              <w:gridCol w:w="1584"/>
-              <w:gridCol w:w="1584"/>
-              <w:gridCol w:w="1584"/>
+              <w:gridCol w:w="1320"/>
+              <w:gridCol w:w="1320"/>
+              <w:gridCol w:w="1320"/>
+              <w:gridCol w:w="1320"/>
+              <w:gridCol w:w="1320"/>
+              <w:gridCol w:w="1320"/>
             </w:tblGrid>
             <w:tr>
               <w:trPr>
@@ -23195,6 +23196,38 @@
                     <w:jc w:val="center"/>
                   </w:pPr>
                   <w:r>
+                    <w:t xml:space="preserve">95 % limits of a</w:t>
+                  </w:r>
+                  <w:r>
+                    <w:br/>
+                  </w:r>
+                  <w:r>
+                    <w:t xml:space="preserve">single run over</w:t>
+                  </w:r>
+                  <w:r>
+                    <w:br/>
+                  </w:r>
+                  <w:r>
+                    <w:t xml:space="preserve">the NOR</w:t>
+                  </w:r>
+                  <w:r>
+                    <w:rPr>
+                      <w:vertAlign w:val="superscript"/>
+                    </w:rPr>
+                    <w:t xml:space="preserve">a)</w:t>
+                  </w:r>
+                </w:p>
+              </w:tc>
+              <w:tc>
+                <w:tcPr>
+                  <w:vMerge w:val="restart"/>
+                </w:tcPr>
+                <w:p>
+                  <w:pPr>
+                    <w:pStyle w:val="Compact"/>
+                    <w:jc w:val="center"/>
+                  </w:pPr>
+                  <w:r>
                     <w:t xml:space="preserve">Met across</w:t>
                   </w:r>
                   <w:r>
@@ -23267,6 +23300,15 @@
                   <w:pPr/>
                 </w:p>
               </w:tc>
+              <w:tc>
+                <w:tcPr>
+                  <w:gridSpan w:val="1"/>
+                  <w:vMerge w:val="continue"/>
+                </w:tcPr>
+                <w:p>
+                  <w:pPr/>
+                </w:p>
+              </w:tc>
             </w:tr>
             <w:tr>
               <w:tc>
@@ -23337,6 +23379,24 @@
                     <w:jc w:val="center"/>
                   </w:pPr>
                   <w:r>
+                    <w:t xml:space="preserve">3,374 to 15,349</w:t>
+                  </w:r>
+                  <w:r>
+                    <w:rPr>
+                      <w:vertAlign w:val="superscript"/>
+                    </w:rPr>
+                    <w:t xml:space="preserve">c)</w:t>
+                  </w:r>
+                </w:p>
+              </w:tc>
+              <w:tc>
+                <w:tcPr/>
+                <w:p>
+                  <w:pPr>
+                    <w:pStyle w:val="Compact"/>
+                    <w:jc w:val="center"/>
+                  </w:pPr>
+                  <w:r>
                     <w:t xml:space="preserve">Yes</w:t>
                   </w:r>
                 </w:p>
@@ -23399,6 +23459,18 @@
                     <w:jc w:val="center"/>
                   </w:pPr>
                   <w:r>
+                    <w:t xml:space="preserve">2.72 to 5.52</w:t>
+                  </w:r>
+                </w:p>
+              </w:tc>
+              <w:tc>
+                <w:tcPr/>
+                <w:p>
+                  <w:pPr>
+                    <w:pStyle w:val="Compact"/>
+                    <w:jc w:val="center"/>
+                  </w:pPr>
+                  <w:r>
                     <w:t xml:space="preserve">Yes</w:t>
                   </w:r>
                 </w:p>
@@ -23461,6 +23533,18 @@
                     <w:jc w:val="center"/>
                   </w:pPr>
                   <w:r>
+                    <w:t xml:space="preserve">0.75 to 1.09</w:t>
+                  </w:r>
+                </w:p>
+              </w:tc>
+              <w:tc>
+                <w:tcPr/>
+                <w:p>
+                  <w:pPr>
+                    <w:pStyle w:val="Compact"/>
+                    <w:jc w:val="center"/>
+                  </w:pPr>
+                  <w:r>
                     <w:t xml:space="preserve">Yes</w:t>
                   </w:r>
                 </w:p>
@@ -23469,7 +23553,7 @@
             <w:tr>
               <w:tc>
                 <w:tcPr>
-                  <w:gridSpan w:val="5"/>
+                  <w:gridSpan w:val="6"/>
                 </w:tcPr>
                 <w:p>
                   <w:pPr>
@@ -23494,7 +23578,7 @@
             <w:tr>
               <w:tc>
                 <w:tcPr>
-                  <w:gridSpan w:val="5"/>
+                  <w:gridSpan w:val="6"/>
                 </w:tcPr>
                 <w:p>
                   <w:pPr>
@@ -23519,7 +23603,7 @@
             <w:tr>
               <w:tc>
                 <w:tcPr>
-                  <w:gridSpan w:val="5"/>
+                  <w:gridSpan w:val="6"/>
                 </w:tcPr>
                 <w:p>
                   <w:pPr>
@@ -23544,7 +23628,7 @@
             <w:tr>
               <w:tc>
                 <w:tcPr>
-                  <w:gridSpan w:val="5"/>
+                  <w:gridSpan w:val="6"/>
                 </w:tcPr>
                 <w:p>
                   <w:pPr>
@@ -23568,7 +23652,7 @@
         <w:pStyle w:val="BodyText"/>
       </w:pPr>
       <w:r>
-        <w:t xml:space="preserve">The 3 outputs with a criterion all meet it at the set-point and across the NOR in force. The value judged is the upper prediction limit of a single run over the NOR. It is 15,349 ng/mg for pool host cell protein against ≤ 17,069 ng/mg, 5.52 ppm for leached Protein A against ≤ 158 ppm, and 1.09 % for fragments against ≤ 2.45 %. The table gives medians for pool host cell protein, because its model is on the log scale. The model of leached Protein A has no term, so its prediction is the same at every setting.</w:t>
+        <w:t xml:space="preserve">The 3 outputs with a criterion all meet it at the set-point and across the NOR in force. Each verdict rests on the upper end of those limits, the upper prediction limit of a single run over the NOR. It is 15,349 ng/mg for pool host cell protein against ≤ 17,069 ng/mg, 5.52 ppm for leached Protein A against ≤ 158 ppm, and 1.09 % for fragments against ≤ 2.45 %. The table gives medians for pool host cell protein, because its model is on the log scale. The model of leached Protein A has no term, so its prediction is the same at every setting.</w:t>
       </w:r>
     </w:p>
     <w:bookmarkEnd w:id="103"/>
@@ -25285,7 +25369,7 @@
         </w:numPr>
       </w:pPr>
       <w:r>
-        <w:t xml:space="preserve">Elution buffer pH was classified as a WC-CPP. Its terms are significant for pool host cell protein, B (p &lt; 0.001), and for fragments, B (p = 0.001), and step yield has no term in it. Across its PAR for pool host cell protein, 3.21–3.9, pool host cell protein falls from 12,787 to 3,939 ng/mg as the pH rises, a change of 52 % of the criterion. Fragments fall by 0.11 percentage points across their PAR, the range studied, 4 % of their criterion. The effect on pool host cell protein is practically relevant, and with protein load it bounds the design space. Buffer pH is controlled at preparation and verified at release, and the PAR for pool host cell protein extends 0.19 pH units below and 0.20 above the NOR of 3.4–3.7. The deviation DEV-005-01 showed that a buffer below the NOR can pass release when the pH meter is incorrectly calibrated (</w:t>
+        <w:t xml:space="preserve">Elution buffer pH was classified as a WC-CPP. Its terms are significant for pool host cell protein, B (p &lt; 0.001), and for fragments, B (p = 0.001), and step yield has no term in it. Across its PAR for pool host cell protein, 3.21–3.9, pool host cell protein falls from 12,787 to 3,939 ng/mg as the pH rises, a change of 52 % of the criterion. Fragments fall by 0.11 percentage points across their PAR, the range studied, 4 % of their criterion. The effect on pool host cell protein is practically relevant, and with protein load it bounds the design space. Buffer pH is controlled at preparation and verified at release, and the PAR for pool host cell protein extends 0.19 pH units below and 0.20 above the NOR of 3.4–3.7. The study event DEV-005-01 showed that a buffer below the NOR can pass release when the pH meter is incorrectly calibrated (</w:t>
       </w:r>
       <w:hyperlink w:anchor="sec-dev01">
         <w:r>
@@ -25296,7 +25380,7 @@
         </w:r>
       </w:hyperlink>
       <w:r>
-        <w:t xml:space="preserve">). The buffer of that deviation, at pH 3.38, lay below the NOR and inside the PAR.</w:t>
+        <w:t xml:space="preserve">). The buffer of that event, at pH 3.38, lay below the NOR and inside the PAR.</w:t>
       </w:r>
     </w:p>
     <w:p>
@@ -25670,7 +25754,7 @@
         </w:r>
       </w:hyperlink>
       <w:r>
-        <w:t xml:space="preserve">). Each design used one feed, so the effect of feed quality was not estimated. The univariate study cannot detect interactions, has 2 runs at each end and no centre run (DEV-005-03), and did not measure fragments by nrCE-SDS. The hold study held one eluate, made at set-point.</w:t>
+        <w:t xml:space="preserve">). Each design used one feed, so the effect of feed quality was not estimated. The univariate study cannot detect interactions, has 2 runs at each end and no centre run (PD-005-07), and did not measure fragments by nrCE-SDS. The hold study held one eluate, made at set-point.</w:t>
       </w:r>
     </w:p>
     <w:bookmarkEnd w:id="119"/>
@@ -25823,17 +25907,17 @@
         </w:numPr>
       </w:pPr>
       <w:r>
-        <w:t xml:space="preserve">None of the 5 deviations changes the judgement of an output against its criterion. The results roll up into PCMR-001.</w:t>
+        <w:t xml:space="preserve">Neither study event changes the judgement of an output against its criterion. The results roll up into PCMR-001.</w:t>
       </w:r>
     </w:p>
     <w:bookmarkEnd w:id="120"/>
-    <w:bookmarkStart w:id="133" w:name="sec-dev"/>
+    <w:bookmarkStart w:id="134" w:name="sec-dev"/>
     <w:p>
       <w:pPr>
         <w:pStyle w:val="Heading1"/>
       </w:pPr>
       <w:r>
-        <w:t xml:space="preserve">13. Deviations and discrepancies from the plan</w:t>
+        <w:t xml:space="preserve">13. Study events and discrepancies from the plan</w:t>
       </w:r>
     </w:p>
     <w:p>
@@ -25841,7 +25925,10 @@
         <w:pStyle w:val="FirstParagraph"/>
       </w:pPr>
       <w:r>
-        <w:t xml:space="preserve">A deviation is a departure from the approved plan, from an approved procedure or from a GMP requirement, or an unplanned event during execution. A discrepancy from the plan is work that the approved plan did not foresee and that was done under approved procedures, such as further runs or a further analysis. The deviation register lists 5 deviations for the studies of the step (</w:t>
+        <w:t xml:space="preserve">PCP-005 calls a departure from the plan a deviation, but a process characterization study is not GMP manufacture, so this report records the events of execution as study events, under the numbers Version 1.0 gave them, and every departure from the plan as a discrepancy from the plan.</w:t>
+      </w:r>
+      <w:r>
+        <w:t xml:space="preserve"> </w:t>
       </w:r>
       <w:hyperlink w:anchor="tbl-dev">
         <w:r>
@@ -25852,18 +25939,10 @@
         </w:r>
       </w:hyperlink>
       <w:r>
-        <w:t xml:space="preserve">). The runs that DEV-005-01, DEV-005-02, DEV-005-03 and DEV-005-05 concern were retained. DEV-005-04 concerns the qualification of the scale-down model, and the output it concerns is judged through its offset (</w:t>
-      </w:r>
-      <w:hyperlink w:anchor="sec-dev04">
-        <w:r>
-          <w:rPr>
-            <w:rStyle w:val="Hyperlink"/>
-          </w:rPr>
-          <w:t xml:space="preserve">Section 13.4</w:t>
-        </w:r>
-      </w:hyperlink>
-      <w:r>
-        <w:t xml:space="preserve">).</w:t>
+        <w:t xml:space="preserve"> </w:t>
+      </w:r>
+      <w:r>
+        <w:t xml:space="preserve">lists the 2 study events of the step. Each was investigated, and its run was retained in the analysis.</w:t>
       </w:r>
     </w:p>
     <w:tbl>
@@ -25890,7 +25969,7 @@
               <w:pStyle w:val="ImageCaption"/>
             </w:pPr>
             <w:r>
-              <w:t xml:space="preserve">Table 31: Deviations recorded for the studies of the Protein A step.</w:t>
+              <w:t xml:space="preserve">Table 31: Study events recorded for the studies of the Protein A step.</w:t>
             </w:r>
           </w:p>
           <w:tbl>
@@ -25917,7 +25996,7 @@
                     <w:jc w:val="center"/>
                   </w:pPr>
                   <w:r>
-                    <w:t xml:space="preserve">Deviation</w:t>
+                    <w:t xml:space="preserve">Event</w:t>
                   </w:r>
                 </w:p>
               </w:tc>
@@ -25953,7 +26032,7 @@
                     <w:jc w:val="center"/>
                   </w:pPr>
                   <w:r>
-                    <w:t xml:space="preserve">Disposition</w:t>
+                    <w:t xml:space="preserve">Outcome</w:t>
                   </w:r>
                 </w:p>
               </w:tc>
@@ -26003,7 +26082,7 @@
                     <w:jc w:val="center"/>
                   </w:pPr>
                   <w:r>
-                    <w:t xml:space="preserve">retained</w:t>
+                    <w:t xml:space="preserve">run retained in the analysis</w:t>
                   </w:r>
                 </w:p>
               </w:tc>
@@ -26053,157 +26132,7 @@
                     <w:jc w:val="center"/>
                   </w:pPr>
                   <w:r>
-                    <w:t xml:space="preserve">retained</w:t>
-                  </w:r>
-                </w:p>
-              </w:tc>
-            </w:tr>
-            <w:tr>
-              <w:tc>
-                <w:tcPr/>
-                <w:p>
-                  <w:pPr>
-                    <w:pStyle w:val="Compact"/>
-                    <w:jc w:val="center"/>
-                  </w:pPr>
-                  <w:r>
-                    <w:t xml:space="preserve">DEV-005-03</w:t>
-                  </w:r>
-                </w:p>
-              </w:tc>
-              <w:tc>
-                <w:tcPr/>
-                <w:p>
-                  <w:pPr>
-                    <w:pStyle w:val="Compact"/>
-                    <w:jc w:val="center"/>
-                  </w:pPr>
-                  <w:r>
-                    <w:t xml:space="preserve">Univariate study run in duplicate at both ends of each range, without the runs at the centre that PCP-005 requires</w:t>
-                  </w:r>
-                </w:p>
-              </w:tc>
-              <w:tc>
-                <w:tcPr/>
-                <w:p>
-                  <w:pPr>
-                    <w:pStyle w:val="Compact"/>
-                    <w:jc w:val="center"/>
-                  </w:pPr>
-                  <w:r>
-                    <w:t xml:space="preserve">Version 2.0 review of the study record against PCP-005</w:t>
-                  </w:r>
-                </w:p>
-              </w:tc>
-              <w:tc>
-                <w:tcPr/>
-                <w:p>
-                  <w:pPr>
-                    <w:pStyle w:val="Compact"/>
-                    <w:jc w:val="center"/>
-                  </w:pPr>
-                  <w:r>
-                    <w:t xml:space="preserve">retained</w:t>
-                  </w:r>
-                </w:p>
-              </w:tc>
-            </w:tr>
-            <w:tr>
-              <w:tc>
-                <w:tcPr/>
-                <w:p>
-                  <w:pPr>
-                    <w:pStyle w:val="Compact"/>
-                    <w:jc w:val="center"/>
-                  </w:pPr>
-                  <w:r>
-                    <w:t xml:space="preserve">DEV-005-04</w:t>
-                  </w:r>
-                </w:p>
-              </w:tc>
-              <w:tc>
-                <w:tcPr/>
-                <w:p>
-                  <w:pPr>
-                    <w:pStyle w:val="Compact"/>
-                    <w:jc w:val="center"/>
-                  </w:pPr>
-                  <w:r>
-                    <w:t xml:space="preserve">Leached Protein A differed between the scales in the qualification, and the investigation PCP-005 requires was not made</w:t>
-                  </w:r>
-                </w:p>
-              </w:tc>
-              <w:tc>
-                <w:tcPr/>
-                <w:p>
-                  <w:pPr>
-                    <w:pStyle w:val="Compact"/>
-                    <w:jc w:val="center"/>
-                  </w:pPr>
-                  <w:r>
-                    <w:t xml:space="preserve">Version 2.0 re-analysis of the qualification against the Version 1.0 rule</w:t>
-                  </w:r>
-                </w:p>
-              </w:tc>
-              <w:tc>
-                <w:tcPr/>
-                <w:p>
-                  <w:pPr>
-                    <w:pStyle w:val="Compact"/>
-                    <w:jc w:val="center"/>
-                  </w:pPr>
-                  <w:r>
-                    <w:t xml:space="preserve">judged through its offset under the offset rule of PCMP-001 Version 2.0</w:t>
-                  </w:r>
-                </w:p>
-              </w:tc>
-            </w:tr>
-            <w:tr>
-              <w:tc>
-                <w:tcPr/>
-                <w:p>
-                  <w:pPr>
-                    <w:pStyle w:val="Compact"/>
-                    <w:jc w:val="center"/>
-                  </w:pPr>
-                  <w:r>
-                    <w:t xml:space="preserve">DEV-005-05</w:t>
-                  </w:r>
-                </w:p>
-              </w:tc>
-              <w:tc>
-                <w:tcPr/>
-                <w:p>
-                  <w:pPr>
-                    <w:pStyle w:val="Compact"/>
-                    <w:jc w:val="center"/>
-                  </w:pPr>
-                  <w:r>
-                    <w:t xml:space="preserve">Univariate study made before the response-surface design, against the sequence of PCP-005</w:t>
-                  </w:r>
-                </w:p>
-              </w:tc>
-              <w:tc>
-                <w:tcPr/>
-                <w:p>
-                  <w:pPr>
-                    <w:pStyle w:val="Compact"/>
-                    <w:jc w:val="center"/>
-                  </w:pPr>
-                  <w:r>
-                    <w:t xml:space="preserve">Version 2.0 review of the execution dates (INV-001 finding 5)</w:t>
-                  </w:r>
-                </w:p>
-              </w:tc>
-              <w:tc>
-                <w:tcPr/>
-                <w:p>
-                  <w:pPr>
-                    <w:pStyle w:val="Compact"/>
-                    <w:jc w:val="center"/>
-                  </w:pPr>
-                  <w:r>
-                    <w:t xml:space="preserve">retained</w:t>
+                    <w:t xml:space="preserve">run retained in the analysis</w:t>
                   </w:r>
                 </w:p>
               </w:tc>
@@ -26667,7 +26596,7 @@
         <w:pStyle w:val="FirstParagraph"/>
       </w:pPr>
       <w:r>
-        <w:t xml:space="preserve">The leached Protein A result of run 11 of the response-surface design was out of trend at analytical review. By the rule in the deviation record, a result is out of trend when it lies outside the two-sided 99 % prediction interval of a single result from the full quadratic model of the response-surface design, fitted to the other runs of the design without the result under review, at the settings of the run. The review was made when the design ran, before model selection was adopted on 2026-09-15, so it used the model that PCP-005 specifies. For run 11 the interval, from the other 27 runs with 12 residual degrees of freedom, runs from −1.46 to 5.38 ppm in the scale-down model. Its lower end lies below zero, so at this run only a high result could be out of trend. The first result, 6.37 ppm (7.55 ppm at manufacturing scale), lay above the interval and above every other result of the two designs. The sample was re-assayed under AMV-3016. The re-assay, 2.12 ppm (3.30 ppm at manufacturing scale), lay inside the interval and inside the range of the other runs of the response-surface design, 1.70 to 4.61 ppm. The first result was 3 times the re-assay. The investigation suspected carryover in the ELISA, which would add analyte from a preceding sample, and did not confirm it. The re-assay result is the one reported in Appendix B and used in the analysis, because the investigation attributed the first result to that suspected cause. The first result was kept in the record with its status marked. Both results are far below the criterion of ≤ 158 ppm.</w:t>
+        <w:t xml:space="preserve">The leached Protein A result of run 11 of the response-surface design was out of trend at analytical review. By the rule in the record of the event, a result is out of trend when it lies outside the two-sided 99 % prediction interval of a single result from the full quadratic model of the response-surface design, fitted to the other runs of the design without the result under review, at the settings of the run. The review was made when the design ran, before model selection was adopted on 2026-09-15, so it used the model that PCP-005 specifies. For run 11 the interval, from the other 27 runs with 12 residual degrees of freedom, runs from −1.46 to 5.38 ppm in the scale-down model. Its lower end lies below zero, so at this run only a high result could be out of trend. The first result, 6.37 ppm (7.55 ppm at manufacturing scale), lay above the interval and above every other result of the two designs. The sample was re-assayed under AMV-3016. The re-assay, 2.12 ppm (3.30 ppm at manufacturing scale), lay inside the interval and inside the range of the other runs of the response-surface design, 1.70 to 4.61 ppm. The first result was 3 times the re-assay. The investigation suspected carryover in the ELISA, which would add analyte from a preceding sample, and did not confirm it. The re-assay result is the one reported in Appendix B and used in the analysis, because the investigation attributed the first result to that suspected cause. The first result was kept in the record with its status marked. Both results are far below the criterion of ≤ 158 ppm.</w:t>
       </w:r>
     </w:p>
     <w:p>
@@ -26690,13 +26619,13 @@
       </w:r>
     </w:p>
     <w:bookmarkEnd w:id="124"/>
-    <w:bookmarkStart w:id="125" w:name="sec-dev03"/>
+    <w:bookmarkStart w:id="133" w:name="discrepancies-from-the-plan"/>
     <w:p>
       <w:pPr>
         <w:pStyle w:val="Heading2"/>
       </w:pPr>
       <w:r>
-        <w:t xml:space="preserve">13.3 DEV-005-03. Univariate study without its centre runs</w:t>
+        <w:t xml:space="preserve">13.3 Discrepancies from the plan</w:t>
       </w:r>
     </w:p>
     <w:p>
@@ -26704,125 +26633,7 @@
         <w:pStyle w:val="FirstParagraph"/>
       </w:pPr>
       <w:r>
-        <w:t xml:space="preserve">PCP-005 §6.4 requires each parameter of the univariate study to be run at the low edge, the centre and the high edge of its range studied, with the same responses as in the multivariate designs. Study S-PA-UNI (2025-12-08 to 2025-12-12) ran each end of each range 2 times and made no run at the centre. The 3 set-point runs of the qualification study S-PA-SDM (2025-11-05 to 2025-11-14) served as the reference instead. The departure was found in the Version 2.0 review of the study record against PCP-005, and the runs were retained. Without the centre runs the study has no set-point reference of its own. A difference from the reference therefore combines the effect of the parameter with any difference between the two studies. Step yield was higher than the reference at every end of both ranges (</w:t>
-      </w:r>
-      <w:hyperlink w:anchor="sec-uni">
-        <w:r>
-          <w:rPr>
-            <w:rStyle w:val="Hyperlink"/>
-          </w:rPr>
-          <w:t xml:space="preserve">Section 5.6</w:t>
-        </w:r>
-      </w:hyperlink>
-      <w:r>
-        <w:t xml:space="preserve">), which is consistent with such a difference. The judgement of pool host cell protein and leached Protein A rests on the individual results at both ends, each against its criterion, and does not depend on the reference.</w:t>
-      </w:r>
-    </w:p>
-    <w:bookmarkEnd w:id="125"/>
-    <w:bookmarkStart w:id="126" w:name="sec-dev04"/>
-    <w:p>
-      <w:pPr>
-        <w:pStyle w:val="Heading2"/>
-      </w:pPr>
-      <w:r>
-        <w:t xml:space="preserve">13.4 DEV-005-04. Difference between the scales in leached Protein A not investigated</w:t>
-      </w:r>
-    </w:p>
-    <w:p>
-      <w:pPr>
-        <w:pStyle w:val="FirstParagraph"/>
-      </w:pPr>
-      <w:r>
-        <w:t xml:space="preserve">PCP-005 Version 1.0 accepted the scale-down model for an output only where the qualification showed no difference between the scales significant at α = 0.05, and it required any difference to be investigated. On the 3 scale-down runs of study S-PA-SDM against the 5 manufacturing-scale batches, leached Protein A differs between the scales (p = 0.037, two-sided Student t test with pooled variance). No other output that the qualification compared differs at that level. No investigation is recorded, and Version 1.0 of this report called the scale-down model qualified. The departure was found in the Version 2.0 re-analysis of the qualification against the Version 1.0 rule. PCMP-001 Version 2.0 qualifies a scale-down model by the offset between the scales and not by a test of equivalence (PCMP-001 §7.1). Under that rule leached Protein A is judged through its offset, and the model is qualified for it on the planned runs and on all runs (</w:t>
-      </w:r>
-      <w:hyperlink w:anchor="sec-sdm">
-        <w:r>
-          <w:rPr>
-            <w:rStyle w:val="Hyperlink"/>
-          </w:rPr>
-          <w:t xml:space="preserve">Section 3.1</w:t>
-        </w:r>
-      </w:hyperlink>
-      <w:r>
-        <w:t xml:space="preserve">,</w:t>
-      </w:r>
-      <w:r>
-        <w:t xml:space="preserve"> </w:t>
-      </w:r>
-      <w:hyperlink w:anchor="sec-pd01">
-        <w:r>
-          <w:rPr>
-            <w:rStyle w:val="Hyperlink"/>
-          </w:rPr>
-          <w:t xml:space="preserve">Section 13.6.1</w:t>
-        </w:r>
-      </w:hyperlink>
-      <w:r>
-        <w:t xml:space="preserve">). The expected cause of the difference, the longer hold of the load at manufacturing scale, is stated in</w:t>
-      </w:r>
-      <w:r>
-        <w:t xml:space="preserve"> </w:t>
-      </w:r>
-      <w:hyperlink w:anchor="sec-sdm">
-        <w:r>
-          <w:rPr>
-            <w:rStyle w:val="Hyperlink"/>
-          </w:rPr>
-          <w:t xml:space="preserve">Section 3.1</w:t>
-        </w:r>
-      </w:hyperlink>
-      <w:r>
-        <w:t xml:space="preserve"> </w:t>
-      </w:r>
-      <w:r>
-        <w:t xml:space="preserve">and was not tested.</w:t>
-      </w:r>
-    </w:p>
-    <w:bookmarkEnd w:id="126"/>
-    <w:bookmarkStart w:id="127" w:name="sec-dev05"/>
-    <w:p>
-      <w:pPr>
-        <w:pStyle w:val="Heading2"/>
-      </w:pPr>
-      <w:r>
-        <w:t xml:space="preserve">13.5 DEV-005-05. Univariate study made before the response-surface design</w:t>
-      </w:r>
-    </w:p>
-    <w:p>
-      <w:pPr>
-        <w:pStyle w:val="FirstParagraph"/>
-      </w:pPr>
-      <w:r>
-        <w:t xml:space="preserve">PCP-005 §11 sets the order of the work. The qualification runs come first, the screening design second and the response-surface design third, and the univariate assessments come fourth and may run in parallel with the response-surface design. Study S-PA-UNI ran from 2025-12-08 to 2025-12-12, after the screening design ended on 2025-12-05 and before the response-surface design began on 2026-01-12 (</w:t>
-      </w:r>
-      <w:hyperlink w:anchor="tbl-chronology">
-        <w:r>
-          <w:rPr>
-            <w:rStyle w:val="Hyperlink"/>
-          </w:rPr>
-          <w:t xml:space="preserve">Table 8</w:t>
-        </w:r>
-      </w:hyperlink>
-      <w:r>
-        <w:t xml:space="preserve">). The departure was found in the Version 2.0 review of the execution dates (INV-001 finding 5), and the runs were retained. The univariate study is judged on its own runs and on the set-point runs of the qualification study, and no result of the response-surface design depends on it, so the order changes no conclusion of this report.</w:t>
-      </w:r>
-    </w:p>
-    <w:bookmarkEnd w:id="127"/>
-    <w:bookmarkStart w:id="132" w:name="discrepancies-from-the-plan"/>
-    <w:p>
-      <w:pPr>
-        <w:pStyle w:val="Heading2"/>
-      </w:pPr>
-      <w:r>
-        <w:t xml:space="preserve">13.6 Discrepancies from the plan</w:t>
-      </w:r>
-    </w:p>
-    <w:p>
-      <w:pPr>
-        <w:pStyle w:val="FirstParagraph"/>
-      </w:pPr>
-      <w:r>
-        <w:t xml:space="preserve">The report records 6 discrepancies from the plan, which</w:t>
+        <w:t xml:space="preserve">The report records 9 discrepancies from the plan, which</w:t>
       </w:r>
       <w:r>
         <w:t xml:space="preserve"> </w:t>
@@ -26839,7 +26650,24 @@
         <w:t xml:space="preserve"> </w:t>
       </w:r>
       <w:r>
-        <w:t xml:space="preserve">lists with what PCP-005 planned, what was done and why. They are judged against PCP-005 Version 2.0, the plan this report is written against. That version includes the retest of retained samples, S-PA-RET, made under the method decision AMD-001, so S-PA-RET is not a discrepancy. Four discrepancies change how the runs are analysed or measured and are described where their results are reported. They are the use for the ranges and the design space of the models of leached Protein A and fragments, which do not meet criterion 5 (PD-005-02,</w:t>
+        <w:t xml:space="preserve">and</w:t>
+      </w:r>
+      <w:r>
+        <w:t xml:space="preserve"> </w:t>
+      </w:r>
+      <w:hyperlink w:anchor="tbl-pd-b">
+        <w:r>
+          <w:rPr>
+            <w:rStyle w:val="Hyperlink"/>
+          </w:rPr>
+          <w:t xml:space="preserve">Table 35</w:t>
+        </w:r>
+      </w:hyperlink>
+      <w:r>
+        <w:t xml:space="preserve"> </w:t>
+      </w:r>
+      <w:r>
+        <w:t xml:space="preserve">list with what PCP-005 planned, what was done and why. They are judged against PCP-005 Version 2.0, the plan this report is written against. That version includes the retest of retained samples, S-PA-RET, made under the method decision AMD-001, so S-PA-RET is not a discrepancy. Four discrepancies change how the runs are analysed or measured and are described where their results are reported. They are the use for the ranges and the design space of the models of leached Protein A and fragments, which do not meet criterion 5 (PD-005-02,</w:t>
       </w:r>
       <w:r>
         <w:t xml:space="preserve"> </w:t>
@@ -26895,16 +26723,16 @@
         </w:r>
       </w:hyperlink>
       <w:r>
-        <w:t xml:space="preserve">). The other two are further studies, described below.</w:t>
+        <w:t xml:space="preserve">). Two are further studies, and three are departures from the plan found in the Version 2.0 review of the record. These five are described below.</w:t>
       </w:r>
     </w:p>
-    <w:bookmarkStart w:id="129" w:name="sec-pd01"/>
+    <w:bookmarkStart w:id="126" w:name="sec-pd01"/>
     <w:p>
       <w:pPr>
         <w:pStyle w:val="Heading3"/>
       </w:pPr>
       <w:r>
-        <w:t xml:space="preserve">13.6.1 PD-005-01. Supplementary set-point runs in the scale-down model qualification</w:t>
+        <w:t xml:space="preserve">13.3.1 PD-005-01. Supplementary set-point runs in the scale-down model qualification</w:t>
       </w:r>
     </w:p>
     <w:p>
@@ -26953,7 +26781,7 @@
       <w:tr>
         <w:tc>
           <w:tcPr/>
-          <w:bookmarkStart w:id="128" w:name="tbl-sdm-offsets-planned"/>
+          <w:bookmarkStart w:id="125" w:name="tbl-sdm-offsets-planned"/>
           <w:p>
             <w:pPr>
               <w:jc w:val="center"/>
@@ -27835,7 +27663,7 @@
               </w:tc>
             </w:tr>
           </w:tbl>
-          <w:bookmarkEnd w:id="128"/>
+          <w:bookmarkEnd w:id="125"/>
           <w:p/>
         </w:tc>
       </w:tr>
@@ -27848,14 +27676,14 @@
         <w:t xml:space="preserve">The decision to make the runs was taken during the re-analysis, after the result on the planned runs was known. The qualification for pool host cell protein therefore rests on runs added after a result was seen. Runs added until a test passes raise the chance that it passes, and this is a limitation of that qualification. The rule of qualification and the criterion were not changed because of the further runs. Only the number of runs grew. The centre points of the designs are also set-point runs of the scale-down model. They were not added to the offset, because PCP-005 §5.1 defines the qualification on the runs of the qualification study.</w:t>
       </w:r>
     </w:p>
-    <w:bookmarkEnd w:id="129"/>
-    <w:bookmarkStart w:id="131" w:name="sec-pd05"/>
+    <w:bookmarkEnd w:id="126"/>
+    <w:bookmarkStart w:id="127" w:name="sec-pd05"/>
     <w:p>
       <w:pPr>
         <w:pStyle w:val="Heading3"/>
       </w:pPr>
       <w:r>
-        <w:t xml:space="preserve">13.6.2 PD-005-05. Hold study of the Protein A eluate</w:t>
+        <w:t xml:space="preserve">13.3.2 PD-005-05. Hold study of the Protein A eluate</w:t>
       </w:r>
     </w:p>
     <w:p>
@@ -27895,6 +27723,124 @@
       </w:hyperlink>
       <w:r>
         <w:t xml:space="preserve">. They support a hold of 7 days at 2-8 °C or 21 °C for an eluate made at set-point.</w:t>
+      </w:r>
+    </w:p>
+    <w:bookmarkEnd w:id="127"/>
+    <w:bookmarkStart w:id="128" w:name="sec-pd07"/>
+    <w:p>
+      <w:pPr>
+        <w:pStyle w:val="Heading3"/>
+      </w:pPr>
+      <w:r>
+        <w:t xml:space="preserve">13.3.3 PD-005-07. Univariate study without runs at the centre</w:t>
+      </w:r>
+    </w:p>
+    <w:p>
+      <w:pPr>
+        <w:pStyle w:val="FirstParagraph"/>
+      </w:pPr>
+      <w:r>
+        <w:t xml:space="preserve">PCP-005 §6.4 requires each parameter of the univariate study to be run at the low edge, the centre and the high edge of its range studied, with the same responses as in the multivariate designs. Study S-PA-UNI (2025-12-08 to 2025-12-12) ran each end of each range 2 times and made no run at the centre. The 3 set-point runs of the qualification study S-PA-SDM (2025-11-05 to 2025-11-14) served as the reference instead. The departure was found in the Version 2.0 review of the study record against PCP-005, and the runs were retained. Without the centre runs the study has no set-point reference of its own. A difference from the reference therefore combines the effect of the parameter with any difference between the two studies. Step yield was higher than the reference at every end of both ranges (</w:t>
+      </w:r>
+      <w:hyperlink w:anchor="sec-uni">
+        <w:r>
+          <w:rPr>
+            <w:rStyle w:val="Hyperlink"/>
+          </w:rPr>
+          <w:t xml:space="preserve">Section 5.6</w:t>
+        </w:r>
+      </w:hyperlink>
+      <w:r>
+        <w:t xml:space="preserve">), which is consistent with such a difference. The judgement of pool host cell protein and leached Protein A rests on the individual results at both ends, each against its criterion, and does not depend on the reference.</w:t>
+      </w:r>
+    </w:p>
+    <w:bookmarkEnd w:id="128"/>
+    <w:bookmarkStart w:id="129" w:name="sec-pd08"/>
+    <w:p>
+      <w:pPr>
+        <w:pStyle w:val="Heading3"/>
+      </w:pPr>
+      <w:r>
+        <w:t xml:space="preserve">13.3.4 PD-005-08. Leached Protein A offset of the scale-down model accounted for, not investigated</w:t>
+      </w:r>
+    </w:p>
+    <w:p>
+      <w:pPr>
+        <w:pStyle w:val="FirstParagraph"/>
+      </w:pPr>
+      <w:r>
+        <w:t xml:space="preserve">PCP-005 Version 1.0 accepted the scale-down model for an output only where the qualification showed no difference between the scales significant at α = 0.05, and it required any difference to be investigated and the model modified before the characterization studies. On the 3 scale-down runs of study S-PA-SDM against the 5 manufacturing-scale batches, leached Protein A differs between the scales under that test (p = 0.037, two-sided Student t test with pooled variance). No other output that the qualification compared differs at that level. The difference was not investigated before the characterization studies. The departure was found in the Version 2.0 re-analysis of the qualification against the Version 1.0 rule. PCMP-001 Version 2.0 §7.1 lets a scale-down model differ in mean from manufacturing scale where its offset is known precisely enough, so the Version 1.0 test was stricter than the use of the model needs. Leached Protein A is judged through its offset, and the model is qualified for it on the planned runs and on all runs (</w:t>
+      </w:r>
+      <w:hyperlink w:anchor="sec-sdm">
+        <w:r>
+          <w:rPr>
+            <w:rStyle w:val="Hyperlink"/>
+          </w:rPr>
+          <w:t xml:space="preserve">Section 3.1</w:t>
+        </w:r>
+      </w:hyperlink>
+      <w:r>
+        <w:t xml:space="preserve">,</w:t>
+      </w:r>
+      <w:r>
+        <w:t xml:space="preserve"> </w:t>
+      </w:r>
+      <w:hyperlink w:anchor="sec-pd01">
+        <w:r>
+          <w:rPr>
+            <w:rStyle w:val="Hyperlink"/>
+          </w:rPr>
+          <w:t xml:space="preserve">Section 13.3.1</w:t>
+        </w:r>
+      </w:hyperlink>
+      <w:r>
+        <w:t xml:space="preserve">). The expected cause of the difference, the longer hold of the load at manufacturing scale, is stated in</w:t>
+      </w:r>
+      <w:r>
+        <w:t xml:space="preserve"> </w:t>
+      </w:r>
+      <w:hyperlink w:anchor="sec-sdm">
+        <w:r>
+          <w:rPr>
+            <w:rStyle w:val="Hyperlink"/>
+          </w:rPr>
+          <w:t xml:space="preserve">Section 3.1</w:t>
+        </w:r>
+      </w:hyperlink>
+      <w:r>
+        <w:t xml:space="preserve"> </w:t>
+      </w:r>
+      <w:r>
+        <w:t xml:space="preserve">and was not tested.</w:t>
+      </w:r>
+    </w:p>
+    <w:bookmarkEnd w:id="129"/>
+    <w:bookmarkStart w:id="132" w:name="sec-pd09"/>
+    <w:p>
+      <w:pPr>
+        <w:pStyle w:val="Heading3"/>
+      </w:pPr>
+      <w:r>
+        <w:t xml:space="preserve">13.3.5 PD-005-09. Univariate study made before the response-surface design</w:t>
+      </w:r>
+    </w:p>
+    <w:p>
+      <w:pPr>
+        <w:pStyle w:val="FirstParagraph"/>
+      </w:pPr>
+      <w:r>
+        <w:t xml:space="preserve">PCP-005 §11 sets the order of the work. The qualification runs come first, the screening design second and the response-surface design third, and the univariate assessments come fourth and may run in parallel with the response-surface design. Study S-PA-UNI ran from 2025-12-08 to 2025-12-12, after the screening design ended on 2025-12-05 and before the response-surface design began on 2026-01-12 (</w:t>
+      </w:r>
+      <w:hyperlink w:anchor="tbl-chronology">
+        <w:r>
+          <w:rPr>
+            <w:rStyle w:val="Hyperlink"/>
+          </w:rPr>
+          <w:t xml:space="preserve">Table 8</w:t>
+        </w:r>
+      </w:hyperlink>
+      <w:r>
+        <w:t xml:space="preserve">). The departure was found in the Version 2.0 review of the execution dates (INV-001 finding 5), and the runs were retained. The reason recorded is the scheduling of the laboratory system. The univariate study is judged on its own runs and on the set-point runs of the qualification study, and no result of the response-surface design depends on it, so the order changes no conclusion of this report.</w:t>
       </w:r>
     </w:p>
     <w:tbl>
@@ -27921,7 +27867,7 @@
               <w:pStyle w:val="ImageCaption"/>
             </w:pPr>
             <w:r>
-              <w:t xml:space="preserve">Table 34: Discrepancies of this report from its plan PCP-005.</w:t>
+              <w:t xml:space="preserve">Table 34: Discrepancies of this report from its plan PCP-005, PD-005-01 to PD-005-05.</w:t>
             </w:r>
           </w:p>
           <w:tbl>
@@ -28183,7 +28129,7 @@
                     <w:jc w:val="center"/>
                   </w:pPr>
                   <w:r>
-                    <w:t xml:space="preserve">the deviation record shows the buffer below its target pH; analysing the run at the recorded setting is the conservative reading</w:t>
+                    <w:t xml:space="preserve">the record of study event DEV-005-01 shows the buffer below its target pH; analysing the run at the recorded setting is the conservative reading</w:t>
                   </w:r>
                 </w:p>
               </w:tc>
@@ -28233,7 +28179,7 @@
                     <w:jc w:val="center"/>
                   </w:pPr>
                   <w:r>
-                    <w:t xml:space="preserve">for each output the scale chosen by the Box-Cox profile (the log scale where its 95 % interval contains 0 and excludes 1), the model with the lowest AICc among all hierarchical submodels of the full quadratic, a block term kept, and that model judged against PCMP-001 §7.2; a scale-down offset taken on the scale of the model</w:t>
+                    <w:t xml:space="preserve">for each output the scale chosen by the Box-Cox profile (the log scale where its 95 % interval contains 0 and excludes 1), the model with the lowest AICc among all hierarchical submodels of the full quadratic, a block term kept where the design has a second block, and that model judged against PCMP-001 §7.2; a scale-down offset taken on the scale of the model</w:t>
                   </w:r>
                 </w:p>
               </w:tc>
@@ -28295,7 +28241,7 @@
                     <w:jc w:val="center"/>
                   </w:pPr>
                   <w:r>
-                    <w:t xml:space="preserve">the Protein A eluate held at two temperatures for seven days, aggregate by SEC, acidic variants by icIEF and fragments by nrCE-SDS at every time point (study S-PA-HLD)</w:t>
+                    <w:t xml:space="preserve">the Protein A eluate held at two temperatures for seven days, aggregate by SEC, acidic variants by icIEF and fragments by nrCE-SDS at every time point (study S-PA-HLD); the report states how a held pool is judged, an approach no plan set, chosen after the results were known</w:t>
                   </w:r>
                 </w:p>
               </w:tc>
@@ -28308,68 +28254,6 @@
                   </w:pPr>
                   <w:r>
                     <w:t xml:space="preserve">Version 2.0 judges a held intermediate against its intermediate acceptance criteria, and Version 1.0 had no hold result to judge</w:t>
-                  </w:r>
-                </w:p>
-              </w:tc>
-            </w:tr>
-            <w:tr>
-              <w:tc>
-                <w:tcPr/>
-                <w:p>
-                  <w:pPr>
-                    <w:pStyle w:val="Compact"/>
-                    <w:jc w:val="center"/>
-                  </w:pPr>
-                  <w:r>
-                    <w:t xml:space="preserve">PD-005-06</w:t>
-                  </w:r>
-                </w:p>
-              </w:tc>
-              <w:tc>
-                <w:tcPr/>
-                <w:p>
-                  <w:pPr>
-                    <w:pStyle w:val="Compact"/>
-                    <w:jc w:val="center"/>
-                  </w:pPr>
-                  <w:r>
-                    <w:t xml:space="preserve">Loaded antibody mass from the titre assay</w:t>
-                  </w:r>
-                </w:p>
-              </w:tc>
-              <w:tc>
-                <w:tcPr/>
-                <w:p>
-                  <w:pPr>
-                    <w:pStyle w:val="Compact"/>
-                    <w:jc w:val="center"/>
-                  </w:pPr>
-                  <w:r>
-                    <w:t xml:space="preserve">PCP-005: step yield from the antibody mass in the load and in the pool, both by absorbance at 280 nm</w:t>
-                  </w:r>
-                </w:p>
-              </w:tc>
-              <w:tc>
-                <w:tcPr/>
-                <w:p>
-                  <w:pPr>
-                    <w:pStyle w:val="Compact"/>
-                    <w:jc w:val="center"/>
-                  </w:pPr>
-                  <w:r>
-                    <w:t xml:space="preserve">the load mass from the product titre by Protein A affinity HPLC (SOP-3016), the pool mass by absorbance at 280 nm</w:t>
-                  </w:r>
-                </w:p>
-              </w:tc>
-              <w:tc>
-                <w:tcPr/>
-                <w:p>
-                  <w:pPr>
-                    <w:pStyle w:val="Compact"/>
-                    <w:jc w:val="center"/>
-                  </w:pPr>
-                  <w:r>
-                    <w:t xml:space="preserve">absorbance at 280 nm measures every protein in a clarified harvest, not the antibody alone; the titre assay measures the antibody</w:t>
                   </w:r>
                 </w:p>
               </w:tc>
@@ -28380,61 +28264,12 @@
         </w:tc>
       </w:tr>
     </w:tbl>
-    <w:bookmarkEnd w:id="131"/>
-    <w:bookmarkEnd w:id="132"/>
-    <w:bookmarkEnd w:id="133"/>
-    <w:bookmarkStart w:id="144" w:name="appendices"/>
     <w:p>
       <w:pPr>
-        <w:pStyle w:val="Heading1"/>
+        <w:pStyle w:val="BodyText"/>
       </w:pPr>
       <w:r>
-        <w:t xml:space="preserve">Appendices</w:t>
-      </w:r>
-    </w:p>
-    <w:bookmarkStart w:id="136" w:name="X3eb0dc32945a2e53c94598b2756dbf9ce86c7a7"/>
-    <w:p>
-      <w:pPr>
-        <w:pStyle w:val="Heading2"/>
-      </w:pPr>
-      <w:r>
-        <w:t xml:space="preserve">Appendix A. Screening design matrix and responses</w:t>
-      </w:r>
-    </w:p>
-    <w:p>
-      <w:pPr>
-        <w:pStyle w:val="FirstParagraph"/>
-      </w:pPr>
-      <w:hyperlink w:anchor="tbl-doe-protein-a-screening">
-        <w:r>
-          <w:rPr>
-            <w:rStyle w:val="Hyperlink"/>
-          </w:rPr>
-          <w:t xml:space="preserve">Table 35</w:t>
-        </w:r>
-      </w:hyperlink>
-      <w:r>
         <w:t xml:space="preserve"> </w:t>
-      </w:r>
-      <w:r>
-        <w:t xml:space="preserve">gives the screening design (study S-PA-SCR) in natural units, with the results as measured in the scale-down model.</w:t>
-      </w:r>
-      <w:r>
-        <w:t xml:space="preserve"> </w:t>
-      </w:r>
-      <w:hyperlink w:anchor="tbl-app-scr-info">
-        <w:r>
-          <w:rPr>
-            <w:rStyle w:val="Hyperlink"/>
-          </w:rPr>
-          <w:t xml:space="preserve">Table 36</w:t>
-        </w:r>
-      </w:hyperlink>
-      <w:r>
-        <w:t xml:space="preserve"> </w:t>
-      </w:r>
-      <w:r>
-        <w:t xml:space="preserve">gives the run order of execution and the results measured for information.</w:t>
       </w:r>
     </w:p>
     <w:tbl>
@@ -28450,7 +28285,7 @@
       <w:tr>
         <w:tc>
           <w:tcPr/>
-          <w:bookmarkStart w:id="134" w:name="tbl-doe-protein-a-screening"/>
+          <w:bookmarkStart w:id="131" w:name="tbl-pd-b"/>
           <w:p>
             <w:pPr>
               <w:jc w:val="center"/>
@@ -28461,7 +28296,423 @@
               <w:pStyle w:val="ImageCaption"/>
             </w:pPr>
             <w:r>
-              <w:t xml:space="preserve">Table 35: Protein A screening design, settings and results.</w:t>
+              <w:t xml:space="preserve">Table 35: Discrepancies of this report from its plan PCP-005, PD-005-06 to PD-005-09.</w:t>
+            </w:r>
+          </w:p>
+          <w:tbl>
+            <w:tblPr>
+              <w:tblStyle w:val="Table"/>
+              <w:tblW w:type="auto" w:w="0"/>
+              <w:tblLook w:firstRow="1" w:lastRow="0" w:firstColumn="0" w:lastColumn="0" w:noHBand="0" w:noVBand="0" w:val="0020"/>
+            </w:tblPr>
+            <w:tblGrid>
+              <w:gridCol w:w="1584"/>
+              <w:gridCol w:w="1584"/>
+              <w:gridCol w:w="1584"/>
+              <w:gridCol w:w="1584"/>
+              <w:gridCol w:w="1584"/>
+            </w:tblGrid>
+            <w:tr>
+              <w:trPr>
+                <w:tblHeader w:val="on"/>
+              </w:trPr>
+              <w:tc>
+                <w:tcPr/>
+                <w:p>
+                  <w:pPr>
+                    <w:pStyle w:val="Compact"/>
+                    <w:jc w:val="center"/>
+                  </w:pPr>
+                  <w:r>
+                    <w:t xml:space="preserve">Discrepancy</w:t>
+                  </w:r>
+                </w:p>
+              </w:tc>
+              <w:tc>
+                <w:tcPr/>
+                <w:p>
+                  <w:pPr>
+                    <w:pStyle w:val="Compact"/>
+                    <w:jc w:val="center"/>
+                  </w:pPr>
+                  <w:r>
+                    <w:t xml:space="preserve">Subject</w:t>
+                  </w:r>
+                </w:p>
+              </w:tc>
+              <w:tc>
+                <w:tcPr/>
+                <w:p>
+                  <w:pPr>
+                    <w:pStyle w:val="Compact"/>
+                    <w:jc w:val="center"/>
+                  </w:pPr>
+                  <w:r>
+                    <w:t xml:space="preserve">Planned</w:t>
+                  </w:r>
+                </w:p>
+              </w:tc>
+              <w:tc>
+                <w:tcPr/>
+                <w:p>
+                  <w:pPr>
+                    <w:pStyle w:val="Compact"/>
+                    <w:jc w:val="center"/>
+                  </w:pPr>
+                  <w:r>
+                    <w:t xml:space="preserve">Done</w:t>
+                  </w:r>
+                </w:p>
+              </w:tc>
+              <w:tc>
+                <w:tcPr/>
+                <w:p>
+                  <w:pPr>
+                    <w:pStyle w:val="Compact"/>
+                    <w:jc w:val="center"/>
+                  </w:pPr>
+                  <w:r>
+                    <w:t xml:space="preserve">Reason</w:t>
+                  </w:r>
+                </w:p>
+              </w:tc>
+            </w:tr>
+            <w:tr>
+              <w:tc>
+                <w:tcPr/>
+                <w:p>
+                  <w:pPr>
+                    <w:pStyle w:val="Compact"/>
+                    <w:jc w:val="center"/>
+                  </w:pPr>
+                  <w:r>
+                    <w:t xml:space="preserve">PD-005-06</w:t>
+                  </w:r>
+                </w:p>
+              </w:tc>
+              <w:tc>
+                <w:tcPr/>
+                <w:p>
+                  <w:pPr>
+                    <w:pStyle w:val="Compact"/>
+                    <w:jc w:val="center"/>
+                  </w:pPr>
+                  <w:r>
+                    <w:t xml:space="preserve">Loaded antibody mass from the titre assay</w:t>
+                  </w:r>
+                </w:p>
+              </w:tc>
+              <w:tc>
+                <w:tcPr/>
+                <w:p>
+                  <w:pPr>
+                    <w:pStyle w:val="Compact"/>
+                    <w:jc w:val="center"/>
+                  </w:pPr>
+                  <w:r>
+                    <w:t xml:space="preserve">PCP-005: step yield from the antibody mass in the load and in the pool, both by absorbance at 280 nm</w:t>
+                  </w:r>
+                </w:p>
+              </w:tc>
+              <w:tc>
+                <w:tcPr/>
+                <w:p>
+                  <w:pPr>
+                    <w:pStyle w:val="Compact"/>
+                    <w:jc w:val="center"/>
+                  </w:pPr>
+                  <w:r>
+                    <w:t xml:space="preserve">the load mass from the product titre by Protein A affinity HPLC (SOP-3016), the pool mass by absorbance at 280 nm</w:t>
+                  </w:r>
+                </w:p>
+              </w:tc>
+              <w:tc>
+                <w:tcPr/>
+                <w:p>
+                  <w:pPr>
+                    <w:pStyle w:val="Compact"/>
+                    <w:jc w:val="center"/>
+                  </w:pPr>
+                  <w:r>
+                    <w:t xml:space="preserve">absorbance at 280 nm measures every protein in a clarified harvest, not the antibody alone; the titre assay measures the antibody</w:t>
+                  </w:r>
+                </w:p>
+              </w:tc>
+            </w:tr>
+            <w:tr>
+              <w:tc>
+                <w:tcPr/>
+                <w:p>
+                  <w:pPr>
+                    <w:pStyle w:val="Compact"/>
+                    <w:jc w:val="center"/>
+                  </w:pPr>
+                  <w:r>
+                    <w:t xml:space="preserve">PD-005-07</w:t>
+                  </w:r>
+                </w:p>
+              </w:tc>
+              <w:tc>
+                <w:tcPr/>
+                <w:p>
+                  <w:pPr>
+                    <w:pStyle w:val="Compact"/>
+                    <w:jc w:val="center"/>
+                  </w:pPr>
+                  <w:r>
+                    <w:t xml:space="preserve">Univariate study without runs at the centre</w:t>
+                  </w:r>
+                </w:p>
+              </w:tc>
+              <w:tc>
+                <w:tcPr/>
+                <w:p>
+                  <w:pPr>
+                    <w:pStyle w:val="Compact"/>
+                    <w:jc w:val="center"/>
+                  </w:pPr>
+                  <w:r>
+                    <w:t xml:space="preserve">PCP-005: each univariate parameter run at the ends of its range and at its centre</w:t>
+                  </w:r>
+                </w:p>
+              </w:tc>
+              <w:tc>
+                <w:tcPr/>
+                <w:p>
+                  <w:pPr>
+                    <w:pStyle w:val="Compact"/>
+                    <w:jc w:val="center"/>
+                  </w:pPr>
+                  <w:r>
+                    <w:t xml:space="preserve">each end of each range run in duplicate, with no run at the centre; the qualification runs at set-point serve as the reference</w:t>
+                  </w:r>
+                </w:p>
+              </w:tc>
+              <w:tc>
+                <w:tcPr/>
+                <w:p>
+                  <w:pPr>
+                    <w:pStyle w:val="Compact"/>
+                    <w:jc w:val="center"/>
+                  </w:pPr>
+                  <w:r>
+                    <w:t xml:space="preserve">the set-point reference was taken from the qualification runs</w:t>
+                  </w:r>
+                </w:p>
+              </w:tc>
+            </w:tr>
+            <w:tr>
+              <w:tc>
+                <w:tcPr/>
+                <w:p>
+                  <w:pPr>
+                    <w:pStyle w:val="Compact"/>
+                    <w:jc w:val="center"/>
+                  </w:pPr>
+                  <w:r>
+                    <w:t xml:space="preserve">PD-005-08</w:t>
+                  </w:r>
+                </w:p>
+              </w:tc>
+              <w:tc>
+                <w:tcPr/>
+                <w:p>
+                  <w:pPr>
+                    <w:pStyle w:val="Compact"/>
+                    <w:jc w:val="center"/>
+                  </w:pPr>
+                  <w:r>
+                    <w:t xml:space="preserve">Leached Protein A offset of the scale-down model accounted for, not investigated</w:t>
+                  </w:r>
+                </w:p>
+              </w:tc>
+              <w:tc>
+                <w:tcPr/>
+                <w:p>
+                  <w:pPr>
+                    <w:pStyle w:val="Compact"/>
+                    <w:jc w:val="center"/>
+                  </w:pPr>
+                  <w:r>
+                    <w:t xml:space="preserve">PCP-005: Version 1.0: no statistically significant difference from the at-scale values at p &lt; 0.05, and any difference investigated and the model modified before the characterization studies</w:t>
+                  </w:r>
+                </w:p>
+              </w:tc>
+              <w:tc>
+                <w:tcPr/>
+                <w:p>
+                  <w:pPr>
+                    <w:pStyle w:val="Compact"/>
+                    <w:jc w:val="center"/>
+                  </w:pPr>
+                  <w:r>
+                    <w:t xml:space="preserve">leached Protein A differed between the scales at that level; it was not investigated before the characterization studies, and it is judged through its offset under PCMP-001 Version 2.0 §7.1</w:t>
+                  </w:r>
+                </w:p>
+              </w:tc>
+              <w:tc>
+                <w:tcPr/>
+                <w:p>
+                  <w:pPr>
+                    <w:pStyle w:val="Compact"/>
+                    <w:jc w:val="center"/>
+                  </w:pPr>
+                  <w:r>
+                    <w:t xml:space="preserve">a scale-down model may differ in mean from manufacturing scale where its offset is known precisely enough, the rule of PCMP-001 Version 2.0 §7.1, so the Version 1.0 test was stricter than the use of the model needs</w:t>
+                  </w:r>
+                </w:p>
+              </w:tc>
+            </w:tr>
+            <w:tr>
+              <w:tc>
+                <w:tcPr/>
+                <w:p>
+                  <w:pPr>
+                    <w:pStyle w:val="Compact"/>
+                    <w:jc w:val="center"/>
+                  </w:pPr>
+                  <w:r>
+                    <w:t xml:space="preserve">PD-005-09</w:t>
+                  </w:r>
+                </w:p>
+              </w:tc>
+              <w:tc>
+                <w:tcPr/>
+                <w:p>
+                  <w:pPr>
+                    <w:pStyle w:val="Compact"/>
+                    <w:jc w:val="center"/>
+                  </w:pPr>
+                  <w:r>
+                    <w:t xml:space="preserve">Univariate study made before the response-surface design</w:t>
+                  </w:r>
+                </w:p>
+              </w:tc>
+              <w:tc>
+                <w:tcPr/>
+                <w:p>
+                  <w:pPr>
+                    <w:pStyle w:val="Compact"/>
+                    <w:jc w:val="center"/>
+                  </w:pPr>
+                  <w:r>
+                    <w:t xml:space="preserve">PCP-005: the univariate assessments executed fourth, in parallel with or after the response-surface design (PCP-005 §11)</w:t>
+                  </w:r>
+                </w:p>
+              </w:tc>
+              <w:tc>
+                <w:tcPr/>
+                <w:p>
+                  <w:pPr>
+                    <w:pStyle w:val="Compact"/>
+                    <w:jc w:val="center"/>
+                  </w:pPr>
+                  <w:r>
+                    <w:t xml:space="preserve">the univariate study S-PA-UNI ran after the screening design and before the response-surface design began</w:t>
+                  </w:r>
+                </w:p>
+              </w:tc>
+              <w:tc>
+                <w:tcPr/>
+                <w:p>
+                  <w:pPr>
+                    <w:pStyle w:val="Compact"/>
+                    <w:jc w:val="center"/>
+                  </w:pPr>
+                  <w:r>
+                    <w:t xml:space="preserve">scheduling of the laboratory system</w:t>
+                  </w:r>
+                </w:p>
+              </w:tc>
+            </w:tr>
+          </w:tbl>
+          <w:bookmarkEnd w:id="131"/>
+          <w:p/>
+        </w:tc>
+      </w:tr>
+    </w:tbl>
+    <w:bookmarkEnd w:id="132"/>
+    <w:bookmarkEnd w:id="133"/>
+    <w:bookmarkEnd w:id="134"/>
+    <w:bookmarkStart w:id="145" w:name="appendices"/>
+    <w:p>
+      <w:pPr>
+        <w:pStyle w:val="Heading1"/>
+      </w:pPr>
+      <w:r>
+        <w:t xml:space="preserve">Appendices</w:t>
+      </w:r>
+    </w:p>
+    <w:bookmarkStart w:id="137" w:name="X3eb0dc32945a2e53c94598b2756dbf9ce86c7a7"/>
+    <w:p>
+      <w:pPr>
+        <w:pStyle w:val="Heading2"/>
+      </w:pPr>
+      <w:r>
+        <w:t xml:space="preserve">Appendix A. Screening design matrix and responses</w:t>
+      </w:r>
+    </w:p>
+    <w:p>
+      <w:pPr>
+        <w:pStyle w:val="FirstParagraph"/>
+      </w:pPr>
+      <w:hyperlink w:anchor="tbl-doe-protein-a-screening">
+        <w:r>
+          <w:rPr>
+            <w:rStyle w:val="Hyperlink"/>
+          </w:rPr>
+          <w:t xml:space="preserve">Table 36</w:t>
+        </w:r>
+      </w:hyperlink>
+      <w:r>
+        <w:t xml:space="preserve"> </w:t>
+      </w:r>
+      <w:r>
+        <w:t xml:space="preserve">gives the screening design (study S-PA-SCR) in natural units, with the results as measured in the scale-down model.</w:t>
+      </w:r>
+      <w:r>
+        <w:t xml:space="preserve"> </w:t>
+      </w:r>
+      <w:hyperlink w:anchor="tbl-app-scr-info">
+        <w:r>
+          <w:rPr>
+            <w:rStyle w:val="Hyperlink"/>
+          </w:rPr>
+          <w:t xml:space="preserve">Table 37</w:t>
+        </w:r>
+      </w:hyperlink>
+      <w:r>
+        <w:t xml:space="preserve"> </w:t>
+      </w:r>
+      <w:r>
+        <w:t xml:space="preserve">gives the run order of execution and the results measured for information.</w:t>
+      </w:r>
+    </w:p>
+    <w:tbl>
+      <w:tblPr>
+        <w:tblStyle w:val="Table"/>
+        <w:tblW w:type="pct" w:w="5000"/>
+        <w:tblLayout w:type="fixed"/>
+        <w:tblLook w:firstRow="0" w:lastRow="0" w:firstColumn="0" w:lastColumn="0" w:noHBand="0" w:noVBand="0" w:val="0000"/>
+      </w:tblPr>
+      <w:tblGrid>
+        <w:gridCol w:w="7920"/>
+      </w:tblGrid>
+      <w:tr>
+        <w:tc>
+          <w:tcPr/>
+          <w:bookmarkStart w:id="135" w:name="tbl-doe-protein-a-screening"/>
+          <w:p>
+            <w:pPr>
+              <w:jc w:val="center"/>
+            </w:pPr>
+            <w:pPr>
+              <w:jc w:val="start"/>
+              <w:spacing w:before="200"/>
+              <w:pStyle w:val="ImageCaption"/>
+            </w:pPr>
+            <w:r>
+              <w:t xml:space="preserve">Table 36: Protein A screening design, settings and results.</w:t>
             </w:r>
           </w:p>
           <w:tbl>
@@ -31129,7 +31380,7 @@
               </w:tc>
             </w:tr>
           </w:tbl>
-          <w:bookmarkEnd w:id="134"/>
+          <w:bookmarkEnd w:id="135"/>
           <w:p/>
         </w:tc>
       </w:tr>
@@ -31155,7 +31406,7 @@
       <w:tr>
         <w:tc>
           <w:tcPr/>
-          <w:bookmarkStart w:id="135" w:name="tbl-app-scr-info"/>
+          <w:bookmarkStart w:id="136" w:name="tbl-app-scr-info"/>
           <w:p>
             <w:pPr>
               <w:jc w:val="center"/>
@@ -31166,7 +31417,7 @@
               <w:pStyle w:val="ImageCaption"/>
             </w:pPr>
             <w:r>
-              <w:t xml:space="preserve">Table 36: Screening design (study S-PA-SCR), run order and results measured for information.</w:t>
+              <w:t xml:space="preserve">Table 37: Screening design (study S-PA-SCR), run order and results measured for information.</w:t>
             </w:r>
           </w:p>
           <w:tbl>
@@ -32467,13 +32718,13 @@
               </w:tc>
             </w:tr>
           </w:tbl>
-          <w:bookmarkEnd w:id="135"/>
+          <w:bookmarkEnd w:id="136"/>
           <w:p/>
         </w:tc>
       </w:tr>
     </w:tbl>
-    <w:bookmarkEnd w:id="136"/>
-    <w:bookmarkStart w:id="139" w:name="X4125de861a1edaf509f699b4c84c2434921439f"/>
+    <w:bookmarkEnd w:id="137"/>
+    <w:bookmarkStart w:id="140" w:name="X4125de861a1edaf509f699b4c84c2434921439f"/>
     <w:p>
       <w:pPr>
         <w:pStyle w:val="Heading2"/>
@@ -32491,7 +32742,7 @@
           <w:rPr>
             <w:rStyle w:val="Hyperlink"/>
           </w:rPr>
-          <w:t xml:space="preserve">Table 37</w:t>
+          <w:t xml:space="preserve">Table 38</w:t>
         </w:r>
       </w:hyperlink>
       <w:r>
@@ -32508,7 +32759,7 @@
           <w:rPr>
             <w:rStyle w:val="Hyperlink"/>
           </w:rPr>
-          <w:t xml:space="preserve">Table 38</w:t>
+          <w:t xml:space="preserve">Table 39</w:t>
         </w:r>
       </w:hyperlink>
       <w:r>
@@ -32531,7 +32782,7 @@
       <w:tr>
         <w:tc>
           <w:tcPr/>
-          <w:bookmarkStart w:id="137" w:name="tbl-doe-protein-a-rsm"/>
+          <w:bookmarkStart w:id="138" w:name="tbl-doe-protein-a-rsm"/>
           <w:p>
             <w:pPr>
               <w:jc w:val="center"/>
@@ -32542,7 +32793,7 @@
               <w:pStyle w:val="ImageCaption"/>
             </w:pPr>
             <w:r>
-              <w:t xml:space="preserve">Table 37: Protein A response-surface design, settings and results.</w:t>
+              <w:t xml:space="preserve">Table 38: Protein A response-surface design, settings and results.</w:t>
             </w:r>
           </w:p>
           <w:tbl>
@@ -36695,7 +36946,7 @@
               </w:tc>
             </w:tr>
           </w:tbl>
-          <w:bookmarkEnd w:id="137"/>
+          <w:bookmarkEnd w:id="138"/>
           <w:p/>
         </w:tc>
       </w:tr>
@@ -36721,7 +36972,7 @@
       <w:tr>
         <w:tc>
           <w:tcPr/>
-          <w:bookmarkStart w:id="138" w:name="tbl-app-rsm-info"/>
+          <w:bookmarkStart w:id="139" w:name="tbl-app-rsm-info"/>
           <w:p>
             <w:pPr>
               <w:jc w:val="center"/>
@@ -36732,7 +36983,7 @@
               <w:pStyle w:val="ImageCaption"/>
             </w:pPr>
             <w:r>
-              <w:t xml:space="preserve">Table 38: Response-surface design (study S-PA-RSM), run order, elution buffer pH as analysed and results measured for information.</w:t>
+              <w:t xml:space="preserve">Table 39: Response-surface design (study S-PA-RSM), run order, elution buffer pH as analysed and results measured for information.</w:t>
             </w:r>
           </w:p>
           <w:tbl>
@@ -38946,13 +39197,13 @@
               </w:tc>
             </w:tr>
           </w:tbl>
-          <w:bookmarkEnd w:id="138"/>
+          <w:bookmarkEnd w:id="139"/>
           <w:p/>
         </w:tc>
       </w:tr>
     </w:tbl>
-    <w:bookmarkEnd w:id="139"/>
-    <w:bookmarkStart w:id="141" w:name="X36bf6f5778a70498f998897bcaba6cd1608671a"/>
+    <w:bookmarkEnd w:id="140"/>
+    <w:bookmarkStart w:id="142" w:name="X36bf6f5778a70498f998897bcaba6cd1608671a"/>
     <w:p>
       <w:pPr>
         <w:pStyle w:val="Heading2"/>
@@ -38970,7 +39221,7 @@
           <w:rPr>
             <w:rStyle w:val="Hyperlink"/>
           </w:rPr>
-          <w:t xml:space="preserve">Table 39</w:t>
+          <w:t xml:space="preserve">Table 40</w:t>
         </w:r>
       </w:hyperlink>
       <w:r>
@@ -39069,7 +39320,7 @@
       <w:tr>
         <w:tc>
           <w:tcPr/>
-          <w:bookmarkStart w:id="140" w:name="tbl-scr-lpa"/>
+          <w:bookmarkStart w:id="141" w:name="tbl-scr-lpa"/>
           <w:p>
             <w:pPr>
               <w:jc w:val="center"/>
@@ -39080,7 +39331,7 @@
               <w:pStyle w:val="ImageCaption"/>
             </w:pPr>
             <w:r>
-              <w:t xml:space="preserve">Table 39: Screening effects on leached Protein A (ppm), sorted by size.</w:t>
+              <w:t xml:space="preserve">Table 40: Screening effects on leached Protein A (ppm), sorted by size.</w:t>
             </w:r>
           </w:p>
           <w:tbl>
@@ -39915,13 +40166,13 @@
               </w:tc>
             </w:tr>
           </w:tbl>
-          <w:bookmarkEnd w:id="140"/>
+          <w:bookmarkEnd w:id="141"/>
           <w:p/>
         </w:tc>
       </w:tr>
     </w:tbl>
-    <w:bookmarkEnd w:id="141"/>
-    <w:bookmarkStart w:id="143" w:name="appendix-d.-analytical-methods-summary"/>
+    <w:bookmarkEnd w:id="142"/>
+    <w:bookmarkStart w:id="144" w:name="appendix-d.-analytical-methods-summary"/>
     <w:p>
       <w:pPr>
         <w:pStyle w:val="Heading2"/>
@@ -39939,7 +40190,7 @@
           <w:rPr>
             <w:rStyle w:val="Hyperlink"/>
           </w:rPr>
-          <w:t xml:space="preserve">Table 40</w:t>
+          <w:t xml:space="preserve">Table 41</w:t>
         </w:r>
       </w:hyperlink>
       <w:r>
@@ -39962,7 +40213,7 @@
       <w:tr>
         <w:tc>
           <w:tcPr/>
-          <w:bookmarkStart w:id="142" w:name="tbl-methods-summary"/>
+          <w:bookmarkStart w:id="143" w:name="tbl-methods-summary"/>
           <w:p>
             <w:pPr>
               <w:jc w:val="center"/>
@@ -39973,7 +40224,7 @@
               <w:pStyle w:val="ImageCaption"/>
             </w:pPr>
             <w:r>
-              <w:t xml:space="preserve">Table 40: Analytical methods used in the studies of the Protein A step.</w:t>
+              <w:t xml:space="preserve">Table 41: Analytical methods used in the studies of the Protein A step.</w:t>
             </w:r>
           </w:p>
           <w:tbl>
@@ -40611,14 +40862,14 @@
               </w:tc>
             </w:tr>
           </w:tbl>
-          <w:bookmarkEnd w:id="142"/>
+          <w:bookmarkEnd w:id="143"/>
           <w:p/>
         </w:tc>
       </w:tr>
     </w:tbl>
-    <w:bookmarkEnd w:id="143"/>
     <w:bookmarkEnd w:id="144"/>
-    <w:bookmarkStart w:id="155" w:name="references"/>
+    <w:bookmarkEnd w:id="145"/>
+    <w:bookmarkStart w:id="156" w:name="references"/>
     <w:p>
       <w:pPr>
         <w:pStyle w:val="Heading1"/>
@@ -40627,8 +40878,8 @@
         <w:t xml:space="preserve">References</w:t>
       </w:r>
     </w:p>
-    <w:bookmarkStart w:id="154" w:name="refs"/>
-    <w:bookmarkStart w:id="145" w:name="ref-boxcox1964"/>
+    <w:bookmarkStart w:id="155" w:name="refs"/>
+    <w:bookmarkStart w:id="146" w:name="ref-boxcox1964"/>
     <w:p>
       <w:pPr>
         <w:pStyle w:val="Bibliography"/>
@@ -40659,8 +40910,8 @@
         <w:t xml:space="preserve">26 (2): 211–52.</w:t>
       </w:r>
     </w:p>
-    <w:bookmarkEnd w:id="145"/>
-    <w:bookmarkStart w:id="146" w:name="ref-burnham2002"/>
+    <w:bookmarkEnd w:id="146"/>
+    <w:bookmarkStart w:id="147" w:name="ref-burnham2002"/>
     <w:p>
       <w:pPr>
         <w:pStyle w:val="Bibliography"/>
@@ -40682,8 +40933,8 @@
         <w:t xml:space="preserve">. 2nd ed. New York: Springer.</w:t>
       </w:r>
     </w:p>
-    <w:bookmarkEnd w:id="146"/>
-    <w:bookmarkStart w:id="147" w:name="ref-amab2009"/>
+    <w:bookmarkEnd w:id="147"/>
+    <w:bookmarkStart w:id="148" w:name="ref-amab2009"/>
     <w:p>
       <w:pPr>
         <w:pStyle w:val="Bibliography"/>
@@ -40704,8 +40955,8 @@
         <w:t xml:space="preserve">CASSS.</w:t>
       </w:r>
     </w:p>
-    <w:bookmarkEnd w:id="147"/>
-    <w:bookmarkStart w:id="148" w:name="ref-hurvich1989"/>
+    <w:bookmarkEnd w:id="148"/>
+    <w:bookmarkStart w:id="149" w:name="ref-hurvich1989"/>
     <w:p>
       <w:pPr>
         <w:pStyle w:val="Bibliography"/>
@@ -40736,8 +40987,8 @@
         <w:t xml:space="preserve">76 (2): 297–307.</w:t>
       </w:r>
     </w:p>
-    <w:bookmarkEnd w:id="148"/>
-    <w:bookmarkStart w:id="149" w:name="ref-ichq8"/>
+    <w:bookmarkEnd w:id="149"/>
+    <w:bookmarkStart w:id="150" w:name="ref-ichq8"/>
     <w:p>
       <w:pPr>
         <w:pStyle w:val="Bibliography"/>
@@ -40758,8 +41009,8 @@
         <w:t xml:space="preserve">ICH.</w:t>
       </w:r>
     </w:p>
-    <w:bookmarkEnd w:id="149"/>
-    <w:bookmarkStart w:id="150" w:name="ref-ichq11"/>
+    <w:bookmarkEnd w:id="150"/>
+    <w:bookmarkStart w:id="151" w:name="ref-ichq11"/>
     <w:p>
       <w:pPr>
         <w:pStyle w:val="Bibliography"/>
@@ -40780,8 +41031,8 @@
         <w:t xml:space="preserve">ICH.</w:t>
       </w:r>
     </w:p>
-    <w:bookmarkEnd w:id="150"/>
-    <w:bookmarkStart w:id="151" w:name="ref-ichq9"/>
+    <w:bookmarkEnd w:id="151"/>
+    <w:bookmarkStart w:id="152" w:name="ref-ichq9"/>
     <w:p>
       <w:pPr>
         <w:pStyle w:val="Bibliography"/>
@@ -40802,8 +41053,8 @@
         <w:t xml:space="preserve">ICH.</w:t>
       </w:r>
     </w:p>
-    <w:bookmarkEnd w:id="151"/>
-    <w:bookmarkStart w:id="152" w:name="ref-montgomery2017"/>
+    <w:bookmarkEnd w:id="152"/>
+    <w:bookmarkStart w:id="153" w:name="ref-montgomery2017"/>
     <w:p>
       <w:pPr>
         <w:pStyle w:val="Bibliography"/>
@@ -40825,8 +41076,8 @@
         <w:t xml:space="preserve">. 9th ed. Hoboken, NJ: Wiley.</w:t>
       </w:r>
     </w:p>
-    <w:bookmarkEnd w:id="152"/>
-    <w:bookmarkStart w:id="153" w:name="ref-fda2011"/>
+    <w:bookmarkEnd w:id="153"/>
+    <w:bookmarkStart w:id="154" w:name="ref-fda2011"/>
     <w:p>
       <w:pPr>
         <w:pStyle w:val="Bibliography"/>
@@ -40847,9 +41098,9 @@
         <w:t xml:space="preserve">FDA.</w:t>
       </w:r>
     </w:p>
-    <w:bookmarkEnd w:id="153"/>
     <w:bookmarkEnd w:id="154"/>
     <w:bookmarkEnd w:id="155"/>
+    <w:bookmarkEnd w:id="156"/>
     <w:sectPr>
       <w:footnotePr>
         <w:numRestart w:val="eachSect"/>

</xml_diff>

<commit_message>
Annexes of PCR-004, PCR-009 and PCR-010 (all quotes grounded, no weak anchors), joining REV2_READY; PD-005-10 (pool host cell protein model used although its conclusion changes across the offset interval, PCMP-001 §7.1; owner) cited in PCR-005, annex re-anchored; graded question-answer set for the doctool tests (pc_package/build_qa.py, qa/, make qa: 170 items, L1-L4, summarization and unanswerable, every quote grounded); readability reviews and final-pass lists
Co-Authored-By: Claude Opus 5.5 <noreply@anthropic.com>
</commit_message>
<xml_diff>
--- a/pc_package/PCR-005_protein_a.docx
+++ b/pc_package/PCR-005_protein_a.docx
@@ -2216,7 +2216,7 @@
         </w:numPr>
       </w:pPr>
       <w:r>
-        <w:t xml:space="preserve">F1. The scale-down model is qualified for leached Protein A. Pool host cell protein in the scale-down model is 0.973 times its value at manufacturing scale (90 % confidence interval 0.891 to 1.063). Over the NOR in force, with protein load at 20–40 g/L resin, the model is not qualified for pool host cell protein. With the ratio at its estimate the upper prediction limit of a single run is 15,697 ng/mg, below the criterion of ≤ 16,719 ng/mg. With the ratio at the low end of its interval it is 17,143 ng/mg, above the criterion. This holds with every model that the data support about as well as the selected one, on the planned runs alone and against the a priori criterion. The NOR is not narrowed, because NORs come from production. The report flags the protein load NOR for discussion with manufacturing on whether it can be improved. With the ratio at the low end of its interval the limit meets the criterion when the upper edge of the protein load NOR is 38.9 g/L resin. Leached Protein A is 1.18 ppm lower in the scale-down model, as expected from the longer hold of the load at manufacturing scale. Fragments were not compared at the two scales (</w:t>
+        <w:t xml:space="preserve">F1. The scale-down model is qualified for leached Protein A. Pool host cell protein in the scale-down model is 0.973 times its value at manufacturing scale (90 % confidence interval 0.891 to 1.063). Over the NOR in force, with protein load at 20–40 g/L resin, the model is not qualified for pool host cell protein. With the ratio at its estimate the upper prediction limit of a single run is 15,697 ng/mg, below the criterion of ≤ 16,719 ng/mg. With the ratio at the low end of its interval it is 17,143 ng/mg, above the criterion. The model is used for pool host cell protein all the same, with the ratio at its estimate (PD-005-10). This holds with every model that the data support about as well as the selected one, on the planned runs alone and against the a priori criterion. The NOR is not narrowed, because NORs come from production. The report flags the protein load NOR for discussion with manufacturing on whether it can be improved. With the ratio at the low end of its interval the limit meets the criterion when the upper edge of the protein load NOR is 38.9 g/L resin. Leached Protein A is 1.18 ppm lower in the scale-down model, as expected from the longer hold of the load at manufacturing scale. Fragments were not compared at the two scales (</w:t>
       </w:r>
       <w:hyperlink w:anchor="sec-sdm">
         <w:r>
@@ -2509,7 +2509,7 @@
         <w:pStyle w:val="BodyText"/>
       </w:pPr>
       <w:r>
-        <w:t xml:space="preserve">The 2 study events of the step (DEV-005-01 and DEV-005-02) change no judgement of an output against its criterion. The report also records 9 discrepancies from the plan (</w:t>
+        <w:t xml:space="preserve">The 2 study events of the step (DEV-005-01 and DEV-005-02) change no judgement of an output against its criterion. The report also records 10 discrepancies from the plan (</w:t>
       </w:r>
       <w:hyperlink w:anchor="sec-dev">
         <w:r>
@@ -3961,6 +3961,17 @@
             <w:rStyle w:val="Hyperlink"/>
           </w:rPr>
           <w:t xml:space="preserve">Section 3.1</w:t>
+        </w:r>
+      </w:hyperlink>
+      <w:r>
+        <w:t xml:space="preserve">). The model of pool host cell protein is used with the ratio at its estimate, against the rule of PCMP-001 §7.1, and this is recorded as the discrepancy PD-005-10 (</w:t>
+      </w:r>
+      <w:hyperlink w:anchor="sec-pd10">
+        <w:r>
+          <w:rPr>
+            <w:rStyle w:val="Hyperlink"/>
+          </w:rPr>
+          <w:t xml:space="preserve">Section 13.3.6</w:t>
         </w:r>
       </w:hyperlink>
       <w:r>
@@ -5809,7 +5820,27 @@
         <w:pStyle w:val="BodyText"/>
       </w:pPr>
       <w:r>
-        <w:t xml:space="preserve">PCMP-001 §5 asks the report to state the consequence. Every judgement of pool host cell protein in this report is made with the ratio at its estimate, as PCMP-001 §7.1 rule 2 requires, and on that basis pool host cell protein meets its criterion across the NOR in force. The study does not show that this holds over the whole interval of the ratio. At the upper end of the protein load NOR, a true ratio near the low end of its interval would put the upper prediction limit of a single run above the criterion. The judgements over the NOR, the design space and the PARs for pool host cell protein carry this limitation.</w:t>
+        <w:t xml:space="preserve">PCMP-001 §5 asks the report to state the consequence. Every judgement of pool host cell protein in this report is made with the ratio at its estimate, as PCMP-001 §7.1 rule 2 requires, and on that basis pool host cell protein meets its criterion across the NOR in force. The study does not show that this holds over the whole interval of the ratio. At the upper end of the protein load NOR, a true ratio near the low end of its interval would put the upper prediction limit of a single run above the criterion. The judgements over the NOR, the design space and the PARs for pool host cell protein carry this limitation. PCMP-001 §7.1 states that</w:t>
+      </w:r>
+      <w:r>
+        <w:t xml:space="preserve"> </w:t>
+      </w:r>
+      <w:r>
+        <w:t xml:space="preserve">“a model whose conclusion for an output changes between the two ends of the offset interval is not used for that output”</w:t>
+      </w:r>
+      <w:r>
+        <w:t xml:space="preserve">. This report uses the model of pool host cell protein all the same, and that departure is the discrepancy PD-005-10 (</w:t>
+      </w:r>
+      <w:hyperlink w:anchor="sec-pd10">
+        <w:r>
+          <w:rPr>
+            <w:rStyle w:val="Hyperlink"/>
+          </w:rPr>
+          <w:t xml:space="preserve">Section 13.3.6</w:t>
+        </w:r>
+      </w:hyperlink>
+      <w:r>
+        <w:t xml:space="preserve">).</w:t>
       </w:r>
     </w:p>
     <w:p>
@@ -26025,7 +26056,7 @@
       </w:r>
     </w:p>
     <w:bookmarkEnd w:id="120"/>
-    <w:bookmarkStart w:id="134" w:name="sec-dev"/>
+    <w:bookmarkStart w:id="136" w:name="sec-dev"/>
     <w:p>
       <w:pPr>
         <w:pStyle w:val="Heading1"/>
@@ -26745,7 +26776,7 @@
       </w:r>
     </w:p>
     <w:bookmarkEnd w:id="124"/>
-    <w:bookmarkStart w:id="133" w:name="discrepancies-from-the-plan"/>
+    <w:bookmarkStart w:id="135" w:name="discrepancies-from-the-plan"/>
     <w:p>
       <w:pPr>
         <w:pStyle w:val="Heading2"/>
@@ -26759,7 +26790,7 @@
         <w:pStyle w:val="FirstParagraph"/>
       </w:pPr>
       <w:r>
-        <w:t xml:space="preserve">The report records 9 discrepancies from the plan, which</w:t>
+        <w:t xml:space="preserve">The report records 10 discrepancies from the plan, which</w:t>
       </w:r>
       <w:r>
         <w:t xml:space="preserve"> </w:t>
@@ -26773,10 +26804,7 @@
         </w:r>
       </w:hyperlink>
       <w:r>
-        <w:t xml:space="preserve"> </w:t>
-      </w:r>
-      <w:r>
-        <w:t xml:space="preserve">and</w:t>
+        <w:t xml:space="preserve">,</w:t>
       </w:r>
       <w:r>
         <w:t xml:space="preserve"> </w:t>
@@ -26793,6 +26821,23 @@
         <w:t xml:space="preserve"> </w:t>
       </w:r>
       <w:r>
+        <w:t xml:space="preserve">and</w:t>
+      </w:r>
+      <w:r>
+        <w:t xml:space="preserve"> </w:t>
+      </w:r>
+      <w:hyperlink w:anchor="tbl-pd-c">
+        <w:r>
+          <w:rPr>
+            <w:rStyle w:val="Hyperlink"/>
+          </w:rPr>
+          <w:t xml:space="preserve">Table 36</w:t>
+        </w:r>
+      </w:hyperlink>
+      <w:r>
+        <w:t xml:space="preserve"> </w:t>
+      </w:r>
+      <w:r>
         <w:t xml:space="preserve">list with what PCP-005 planned, what was done and why. They are judged against PCP-005 Version 2.0, the plan this report is written against. That version includes the retest of retained samples, S-PA-RET, made under the method decision AMD-001, so S-PA-RET is not a discrepancy. Four discrepancies change how the runs are analysed or measured and are described where their results are reported. They are the use for the ranges and the design space of the models of leached Protein A and fragments, which do not meet criterion 5 (PD-005-02,</w:t>
       </w:r>
       <w:r>
@@ -26849,7 +26894,7 @@
         </w:r>
       </w:hyperlink>
       <w:r>
-        <w:t xml:space="preserve">). Two are further studies, and three are departures from the plan found in the Version 2.0 review of the record. These five are described below.</w:t>
+        <w:t xml:space="preserve">). Two are further studies, and three are departures from the plan found in the Version 2.0 review of the record. The sixth is the use of the model of pool host cell protein against a rule of PCMP-001 §7.1. These six are described below.</w:t>
       </w:r>
     </w:p>
     <w:bookmarkStart w:id="126" w:name="sec-pd01"/>
@@ -27952,7 +27997,7 @@
       </w:r>
     </w:p>
     <w:bookmarkEnd w:id="129"/>
-    <w:bookmarkStart w:id="132" w:name="sec-pd09"/>
+    <w:bookmarkStart w:id="130" w:name="sec-pd09"/>
     <w:p>
       <w:pPr>
         <w:pStyle w:val="Heading3"/>
@@ -27978,6 +28023,35 @@
       </w:hyperlink>
       <w:r>
         <w:t xml:space="preserve">). The departure was found in the Version 2.0 review of the execution dates (INV-001 finding 5), and the runs were retained. The reason recorded is the scheduling of the laboratory system. The univariate study is judged on its own runs and on the set-point runs of the qualification study, and no result of the response-surface design depends on it, so the order changes no conclusion of this report.</w:t>
+      </w:r>
+    </w:p>
+    <w:bookmarkEnd w:id="130"/>
+    <w:bookmarkStart w:id="134" w:name="sec-pd10"/>
+    <w:p>
+      <w:pPr>
+        <w:pStyle w:val="Heading3"/>
+      </w:pPr>
+      <w:r>
+        <w:t xml:space="preserve">13.3.6 PD-005-10. Pool host cell protein model used although its conclusion changes across the offset interval</w:t>
+      </w:r>
+    </w:p>
+    <w:p>
+      <w:pPr>
+        <w:pStyle w:val="FirstParagraph"/>
+      </w:pPr>
+      <w:r>
+        <w:t xml:space="preserve">PCMP-001 §7.1 states that a model whose conclusion for an output changes between the two ends of the offset interval is not used for that output. Over the NOR in force the upper prediction limit of a single run of pool host cell protein is 15,697 ng/mg with the offset ratio at its estimate and 17,143 ng/mg with the ratio at the low end of its interval, against the criterion of ≤ 16,719 ng/mg (</w:t>
+      </w:r>
+      <w:hyperlink w:anchor="sec-sdm">
+        <w:r>
+          <w:rPr>
+            <w:rStyle w:val="Hyperlink"/>
+          </w:rPr>
+          <w:t xml:space="preserve">Section 3.1</w:t>
+        </w:r>
+      </w:hyperlink>
+      <w:r>
+        <w:t xml:space="preserve">). The conclusion therefore changes across the interval. The model is used all the same for the judgement over the NOR, for the PARs and for the design space, with the ratio at its estimate as PCMP-001 §7.1 rule 2 requires. The offset is known precisely enough to be accounted for at its estimate. The NOR comes from production and is not narrowed by an offset. The limitation is stated with each conclusion for pool host cell protein, and the protein load NOR is flagged for discussion with manufacturing, so that manufacturing can decide whether the NOR can be improved.</w:t>
       </w:r>
     </w:p>
     <w:tbl>
@@ -27993,7 +28067,7 @@
       <w:tr>
         <w:tc>
           <w:tcPr/>
-          <w:bookmarkStart w:id="130" w:name="tbl-pd"/>
+          <w:bookmarkStart w:id="131" w:name="tbl-pd"/>
           <w:p>
             <w:pPr>
               <w:jc w:val="center"/>
@@ -28334,7 +28408,7 @@
               </w:tc>
             </w:tr>
           </w:tbl>
-          <w:bookmarkEnd w:id="130"/>
+          <w:bookmarkEnd w:id="131"/>
           <w:p/>
         </w:tc>
       </w:tr>
@@ -28360,7 +28434,7 @@
       <w:tr>
         <w:tc>
           <w:tcPr/>
-          <w:bookmarkStart w:id="131" w:name="tbl-pd-b"/>
+          <w:bookmarkStart w:id="132" w:name="tbl-pd-b"/>
           <w:p>
             <w:pPr>
               <w:jc w:val="center"/>
@@ -28371,7 +28445,7 @@
               <w:pStyle w:val="ImageCaption"/>
             </w:pPr>
             <w:r>
-              <w:t xml:space="preserve">Table 35: Discrepancies of this report from its plan PCP-005, PD-005-05 to PD-005-09.</w:t>
+              <w:t xml:space="preserve">Table 35: Discrepancies of this report from its plan PCP-005, PD-005-05 to PD-005-07.</w:t>
             </w:r>
           </w:p>
           <w:tbl>
@@ -28638,191 +28712,18 @@
                 </w:p>
               </w:tc>
             </w:tr>
-            <w:tr>
-              <w:tc>
-                <w:tcPr/>
-                <w:p>
-                  <w:pPr>
-                    <w:pStyle w:val="Compact"/>
-                    <w:jc w:val="center"/>
-                  </w:pPr>
-                  <w:r>
-                    <w:t xml:space="preserve">PD-005-08</w:t>
-                  </w:r>
-                </w:p>
-              </w:tc>
-              <w:tc>
-                <w:tcPr/>
-                <w:p>
-                  <w:pPr>
-                    <w:pStyle w:val="Compact"/>
-                    <w:jc w:val="center"/>
-                  </w:pPr>
-                  <w:r>
-                    <w:t xml:space="preserve">Leached Protein A offset of the scale-down model accounted for, not investigated</w:t>
-                  </w:r>
-                </w:p>
-              </w:tc>
-              <w:tc>
-                <w:tcPr/>
-                <w:p>
-                  <w:pPr>
-                    <w:pStyle w:val="Compact"/>
-                    <w:jc w:val="center"/>
-                  </w:pPr>
-                  <w:r>
-                    <w:t xml:space="preserve">PCP-005: Version 1.0: no statistically significant difference from the at-scale values at p &lt; 0.05, and any difference investigated and the model modified before the characterization studies</w:t>
-                  </w:r>
-                </w:p>
-              </w:tc>
-              <w:tc>
-                <w:tcPr/>
-                <w:p>
-                  <w:pPr>
-                    <w:pStyle w:val="Compact"/>
-                    <w:jc w:val="center"/>
-                  </w:pPr>
-                  <w:r>
-                    <w:t xml:space="preserve">leached Protein A differed between the scales at that level; it was not investigated before the characterization studies, and it is judged through its offset under PCMP-001 Version 2.0 §7.1</w:t>
-                  </w:r>
-                </w:p>
-              </w:tc>
-              <w:tc>
-                <w:tcPr/>
-                <w:p>
-                  <w:pPr>
-                    <w:pStyle w:val="Compact"/>
-                    <w:jc w:val="center"/>
-                  </w:pPr>
-                  <w:r>
-                    <w:t xml:space="preserve">a scale-down model may differ in mean from manufacturing scale where its offset is known precisely enough, the rule of PCMP-001 Version 2.0 §7.1, so the Version 1.0 test was stricter than the use of the model needs</w:t>
-                  </w:r>
-                </w:p>
-              </w:tc>
-            </w:tr>
-            <w:tr>
-              <w:tc>
-                <w:tcPr/>
-                <w:p>
-                  <w:pPr>
-                    <w:pStyle w:val="Compact"/>
-                    <w:jc w:val="center"/>
-                  </w:pPr>
-                  <w:r>
-                    <w:t xml:space="preserve">PD-005-09</w:t>
-                  </w:r>
-                </w:p>
-              </w:tc>
-              <w:tc>
-                <w:tcPr/>
-                <w:p>
-                  <w:pPr>
-                    <w:pStyle w:val="Compact"/>
-                    <w:jc w:val="center"/>
-                  </w:pPr>
-                  <w:r>
-                    <w:t xml:space="preserve">Univariate study made before the response-surface design</w:t>
-                  </w:r>
-                </w:p>
-              </w:tc>
-              <w:tc>
-                <w:tcPr/>
-                <w:p>
-                  <w:pPr>
-                    <w:pStyle w:val="Compact"/>
-                    <w:jc w:val="center"/>
-                  </w:pPr>
-                  <w:r>
-                    <w:t xml:space="preserve">PCP-005: the univariate assessments executed fourth, in parallel with or after the response-surface design (PCP-005 §11)</w:t>
-                  </w:r>
-                </w:p>
-              </w:tc>
-              <w:tc>
-                <w:tcPr/>
-                <w:p>
-                  <w:pPr>
-                    <w:pStyle w:val="Compact"/>
-                    <w:jc w:val="center"/>
-                  </w:pPr>
-                  <w:r>
-                    <w:t xml:space="preserve">the univariate study S-PA-UNI ran after the screening design and before the response-surface design began</w:t>
-                  </w:r>
-                </w:p>
-              </w:tc>
-              <w:tc>
-                <w:tcPr/>
-                <w:p>
-                  <w:pPr>
-                    <w:pStyle w:val="Compact"/>
-                    <w:jc w:val="center"/>
-                  </w:pPr>
-                  <w:r>
-                    <w:t xml:space="preserve">scheduling of the laboratory system</w:t>
-                  </w:r>
-                </w:p>
-              </w:tc>
-            </w:tr>
           </w:tbl>
-          <w:bookmarkEnd w:id="131"/>
+          <w:bookmarkEnd w:id="132"/>
           <w:p/>
         </w:tc>
       </w:tr>
     </w:tbl>
-    <w:bookmarkEnd w:id="132"/>
-    <w:bookmarkEnd w:id="133"/>
-    <w:bookmarkEnd w:id="134"/>
-    <w:bookmarkStart w:id="145" w:name="appendices"/>
     <w:p>
       <w:pPr>
-        <w:pStyle w:val="Heading1"/>
+        <w:pStyle w:val="BodyText"/>
       </w:pPr>
       <w:r>
-        <w:t xml:space="preserve">Appendices</w:t>
-      </w:r>
-    </w:p>
-    <w:bookmarkStart w:id="137" w:name="X3eb0dc32945a2e53c94598b2756dbf9ce86c7a7"/>
-    <w:p>
-      <w:pPr>
-        <w:pStyle w:val="Heading2"/>
-      </w:pPr>
-      <w:r>
-        <w:t xml:space="preserve">Appendix A. Screening design matrix and responses</w:t>
-      </w:r>
-    </w:p>
-    <w:p>
-      <w:pPr>
-        <w:pStyle w:val="FirstParagraph"/>
-      </w:pPr>
-      <w:hyperlink w:anchor="tbl-doe-protein-a-screening">
-        <w:r>
-          <w:rPr>
-            <w:rStyle w:val="Hyperlink"/>
-          </w:rPr>
-          <w:t xml:space="preserve">Table 36</w:t>
-        </w:r>
-      </w:hyperlink>
-      <w:r>
         <w:t xml:space="preserve"> </w:t>
-      </w:r>
-      <w:r>
-        <w:t xml:space="preserve">gives the screening design (study S-PA-SCR) in natural units, with the results as measured in the scale-down model.</w:t>
-      </w:r>
-      <w:r>
-        <w:t xml:space="preserve"> </w:t>
-      </w:r>
-      <w:hyperlink w:anchor="tbl-app-scr-info">
-        <w:r>
-          <w:rPr>
-            <w:rStyle w:val="Hyperlink"/>
-          </w:rPr>
-          <w:t xml:space="preserve">Table 37</w:t>
-        </w:r>
-      </w:hyperlink>
-      <w:r>
-        <w:t xml:space="preserve"> </w:t>
-      </w:r>
-      <w:r>
-        <w:t xml:space="preserve">gives the run order of execution and the results measured for information.</w:t>
       </w:r>
     </w:p>
     <w:tbl>
@@ -28838,7 +28739,7 @@
       <w:tr>
         <w:tc>
           <w:tcPr/>
-          <w:bookmarkStart w:id="135" w:name="tbl-doe-protein-a-screening"/>
+          <w:bookmarkStart w:id="133" w:name="tbl-pd-c"/>
           <w:p>
             <w:pPr>
               <w:jc w:val="center"/>
@@ -28849,7 +28750,361 @@
               <w:pStyle w:val="ImageCaption"/>
             </w:pPr>
             <w:r>
-              <w:t xml:space="preserve">Table 36: Protein A screening design, settings and results.</w:t>
+              <w:t xml:space="preserve">Table 36: Discrepancies of this report from its plan PCP-005, PD-005-08 to PD-005-10.</w:t>
+            </w:r>
+          </w:p>
+          <w:tbl>
+            <w:tblPr>
+              <w:tblStyle w:val="Table"/>
+              <w:tblW w:type="auto" w:w="0"/>
+              <w:tblLook w:firstRow="1" w:lastRow="0" w:firstColumn="0" w:lastColumn="0" w:noHBand="0" w:noVBand="0" w:val="0020"/>
+            </w:tblPr>
+            <w:tblGrid>
+              <w:gridCol w:w="1584"/>
+              <w:gridCol w:w="1584"/>
+              <w:gridCol w:w="1584"/>
+              <w:gridCol w:w="1584"/>
+              <w:gridCol w:w="1584"/>
+            </w:tblGrid>
+            <w:tr>
+              <w:trPr>
+                <w:tblHeader w:val="on"/>
+              </w:trPr>
+              <w:tc>
+                <w:tcPr/>
+                <w:p>
+                  <w:pPr>
+                    <w:pStyle w:val="Compact"/>
+                    <w:jc w:val="center"/>
+                  </w:pPr>
+                  <w:r>
+                    <w:t xml:space="preserve">Discrepancy</w:t>
+                  </w:r>
+                </w:p>
+              </w:tc>
+              <w:tc>
+                <w:tcPr/>
+                <w:p>
+                  <w:pPr>
+                    <w:pStyle w:val="Compact"/>
+                    <w:jc w:val="center"/>
+                  </w:pPr>
+                  <w:r>
+                    <w:t xml:space="preserve">Subject</w:t>
+                  </w:r>
+                </w:p>
+              </w:tc>
+              <w:tc>
+                <w:tcPr/>
+                <w:p>
+                  <w:pPr>
+                    <w:pStyle w:val="Compact"/>
+                    <w:jc w:val="center"/>
+                  </w:pPr>
+                  <w:r>
+                    <w:t xml:space="preserve">Planned</w:t>
+                  </w:r>
+                </w:p>
+              </w:tc>
+              <w:tc>
+                <w:tcPr/>
+                <w:p>
+                  <w:pPr>
+                    <w:pStyle w:val="Compact"/>
+                    <w:jc w:val="center"/>
+                  </w:pPr>
+                  <w:r>
+                    <w:t xml:space="preserve">Done</w:t>
+                  </w:r>
+                </w:p>
+              </w:tc>
+              <w:tc>
+                <w:tcPr/>
+                <w:p>
+                  <w:pPr>
+                    <w:pStyle w:val="Compact"/>
+                    <w:jc w:val="center"/>
+                  </w:pPr>
+                  <w:r>
+                    <w:t xml:space="preserve">Reason</w:t>
+                  </w:r>
+                </w:p>
+              </w:tc>
+            </w:tr>
+            <w:tr>
+              <w:tc>
+                <w:tcPr/>
+                <w:p>
+                  <w:pPr>
+                    <w:pStyle w:val="Compact"/>
+                    <w:jc w:val="center"/>
+                  </w:pPr>
+                  <w:r>
+                    <w:t xml:space="preserve">PD-005-08</w:t>
+                  </w:r>
+                </w:p>
+              </w:tc>
+              <w:tc>
+                <w:tcPr/>
+                <w:p>
+                  <w:pPr>
+                    <w:pStyle w:val="Compact"/>
+                    <w:jc w:val="center"/>
+                  </w:pPr>
+                  <w:r>
+                    <w:t xml:space="preserve">Leached Protein A offset of the scale-down model accounted for, not investigated</w:t>
+                  </w:r>
+                </w:p>
+              </w:tc>
+              <w:tc>
+                <w:tcPr/>
+                <w:p>
+                  <w:pPr>
+                    <w:pStyle w:val="Compact"/>
+                    <w:jc w:val="center"/>
+                  </w:pPr>
+                  <w:r>
+                    <w:t xml:space="preserve">PCP-005: Version 1.0: no statistically significant difference from the at-scale values at p &lt; 0.05, and any difference investigated and the model modified before the characterization studies</w:t>
+                  </w:r>
+                </w:p>
+              </w:tc>
+              <w:tc>
+                <w:tcPr/>
+                <w:p>
+                  <w:pPr>
+                    <w:pStyle w:val="Compact"/>
+                    <w:jc w:val="center"/>
+                  </w:pPr>
+                  <w:r>
+                    <w:t xml:space="preserve">leached Protein A differed between the scales at that level; it was not investigated before the characterization studies, and it is judged through its offset under PCMP-001 Version 2.0 §7.1</w:t>
+                  </w:r>
+                </w:p>
+              </w:tc>
+              <w:tc>
+                <w:tcPr/>
+                <w:p>
+                  <w:pPr>
+                    <w:pStyle w:val="Compact"/>
+                    <w:jc w:val="center"/>
+                  </w:pPr>
+                  <w:r>
+                    <w:t xml:space="preserve">a scale-down model may differ in mean from manufacturing scale where its offset is known precisely enough, the rule of PCMP-001 Version 2.0 §7.1, so the Version 1.0 test was stricter than the use of the model needs</w:t>
+                  </w:r>
+                </w:p>
+              </w:tc>
+            </w:tr>
+            <w:tr>
+              <w:tc>
+                <w:tcPr/>
+                <w:p>
+                  <w:pPr>
+                    <w:pStyle w:val="Compact"/>
+                    <w:jc w:val="center"/>
+                  </w:pPr>
+                  <w:r>
+                    <w:t xml:space="preserve">PD-005-09</w:t>
+                  </w:r>
+                </w:p>
+              </w:tc>
+              <w:tc>
+                <w:tcPr/>
+                <w:p>
+                  <w:pPr>
+                    <w:pStyle w:val="Compact"/>
+                    <w:jc w:val="center"/>
+                  </w:pPr>
+                  <w:r>
+                    <w:t xml:space="preserve">Univariate study made before the response-surface design</w:t>
+                  </w:r>
+                </w:p>
+              </w:tc>
+              <w:tc>
+                <w:tcPr/>
+                <w:p>
+                  <w:pPr>
+                    <w:pStyle w:val="Compact"/>
+                    <w:jc w:val="center"/>
+                  </w:pPr>
+                  <w:r>
+                    <w:t xml:space="preserve">PCP-005: the univariate assessments executed fourth, in parallel with or after the response-surface design (PCP-005 §11)</w:t>
+                  </w:r>
+                </w:p>
+              </w:tc>
+              <w:tc>
+                <w:tcPr/>
+                <w:p>
+                  <w:pPr>
+                    <w:pStyle w:val="Compact"/>
+                    <w:jc w:val="center"/>
+                  </w:pPr>
+                  <w:r>
+                    <w:t xml:space="preserve">the univariate study S-PA-UNI ran after the screening design and before the response-surface design began</w:t>
+                  </w:r>
+                </w:p>
+              </w:tc>
+              <w:tc>
+                <w:tcPr/>
+                <w:p>
+                  <w:pPr>
+                    <w:pStyle w:val="Compact"/>
+                    <w:jc w:val="center"/>
+                  </w:pPr>
+                  <w:r>
+                    <w:t xml:space="preserve">scheduling of the laboratory system</w:t>
+                  </w:r>
+                </w:p>
+              </w:tc>
+            </w:tr>
+            <w:tr>
+              <w:tc>
+                <w:tcPr/>
+                <w:p>
+                  <w:pPr>
+                    <w:pStyle w:val="Compact"/>
+                    <w:jc w:val="center"/>
+                  </w:pPr>
+                  <w:r>
+                    <w:t xml:space="preserve">PD-005-10</w:t>
+                  </w:r>
+                </w:p>
+              </w:tc>
+              <w:tc>
+                <w:tcPr/>
+                <w:p>
+                  <w:pPr>
+                    <w:pStyle w:val="Compact"/>
+                    <w:jc w:val="center"/>
+                  </w:pPr>
+                  <w:r>
+                    <w:t xml:space="preserve">Pool host cell protein model used although its conclusion changes across the offset interval</w:t>
+                  </w:r>
+                </w:p>
+              </w:tc>
+              <w:tc>
+                <w:tcPr/>
+                <w:p>
+                  <w:pPr>
+                    <w:pStyle w:val="Compact"/>
+                    <w:jc w:val="center"/>
+                  </w:pPr>
+                  <w:r>
+                    <w:t xml:space="preserve">PCP-005: a model whose conclusion for an output changes between the two ends of the offset interval is not used for that output (PCMP-001 Version 2.0 §7.1)</w:t>
+                  </w:r>
+                </w:p>
+              </w:tc>
+              <w:tc>
+                <w:tcPr/>
+                <w:p>
+                  <w:pPr>
+                    <w:pStyle w:val="Compact"/>
+                    <w:jc w:val="center"/>
+                  </w:pPr>
+                  <w:r>
+                    <w:t xml:space="preserve">the model of pool host cell protein is used for the judgement over the NOR, the PARs and the design space, judged with the offset ratio at its estimate (PCMP-001 Version 2.0 §7.1 rule 2); over the NOR in force the conclusion holds at the estimate and fails at the low end of the interval; the limitation is stated with each conclusion, and the protein load NOR is flagged for discussion with manufacturing</w:t>
+                  </w:r>
+                </w:p>
+              </w:tc>
+              <w:tc>
+                <w:tcPr/>
+                <w:p>
+                  <w:pPr>
+                    <w:pStyle w:val="Compact"/>
+                    <w:jc w:val="center"/>
+                  </w:pPr>
+                  <w:r>
+                    <w:t xml:space="preserve">the offset is known precisely enough to be accounted for at its estimate, and the NOR comes from production and is not narrowed by an offset; the flag lets manufacturing decide whether the NOR can be improved</w:t>
+                  </w:r>
+                </w:p>
+              </w:tc>
+            </w:tr>
+          </w:tbl>
+          <w:bookmarkEnd w:id="133"/>
+          <w:p/>
+        </w:tc>
+      </w:tr>
+    </w:tbl>
+    <w:bookmarkEnd w:id="134"/>
+    <w:bookmarkEnd w:id="135"/>
+    <w:bookmarkEnd w:id="136"/>
+    <w:bookmarkStart w:id="147" w:name="appendices"/>
+    <w:p>
+      <w:pPr>
+        <w:pStyle w:val="Heading1"/>
+      </w:pPr>
+      <w:r>
+        <w:t xml:space="preserve">Appendices</w:t>
+      </w:r>
+    </w:p>
+    <w:bookmarkStart w:id="139" w:name="X3eb0dc32945a2e53c94598b2756dbf9ce86c7a7"/>
+    <w:p>
+      <w:pPr>
+        <w:pStyle w:val="Heading2"/>
+      </w:pPr>
+      <w:r>
+        <w:t xml:space="preserve">Appendix A. Screening design matrix and responses</w:t>
+      </w:r>
+    </w:p>
+    <w:p>
+      <w:pPr>
+        <w:pStyle w:val="FirstParagraph"/>
+      </w:pPr>
+      <w:hyperlink w:anchor="tbl-doe-protein-a-screening">
+        <w:r>
+          <w:rPr>
+            <w:rStyle w:val="Hyperlink"/>
+          </w:rPr>
+          <w:t xml:space="preserve">Table 37</w:t>
+        </w:r>
+      </w:hyperlink>
+      <w:r>
+        <w:t xml:space="preserve"> </w:t>
+      </w:r>
+      <w:r>
+        <w:t xml:space="preserve">gives the screening design (study S-PA-SCR) in natural units, with the results as measured in the scale-down model.</w:t>
+      </w:r>
+      <w:r>
+        <w:t xml:space="preserve"> </w:t>
+      </w:r>
+      <w:hyperlink w:anchor="tbl-app-scr-info">
+        <w:r>
+          <w:rPr>
+            <w:rStyle w:val="Hyperlink"/>
+          </w:rPr>
+          <w:t xml:space="preserve">Table 38</w:t>
+        </w:r>
+      </w:hyperlink>
+      <w:r>
+        <w:t xml:space="preserve"> </w:t>
+      </w:r>
+      <w:r>
+        <w:t xml:space="preserve">gives the run order of execution and the results measured for information.</w:t>
+      </w:r>
+    </w:p>
+    <w:tbl>
+      <w:tblPr>
+        <w:tblStyle w:val="Table"/>
+        <w:tblW w:type="pct" w:w="5000"/>
+        <w:tblLayout w:type="fixed"/>
+        <w:tblLook w:firstRow="0" w:lastRow="0" w:firstColumn="0" w:lastColumn="0" w:noHBand="0" w:noVBand="0" w:val="0000"/>
+      </w:tblPr>
+      <w:tblGrid>
+        <w:gridCol w:w="7920"/>
+      </w:tblGrid>
+      <w:tr>
+        <w:tc>
+          <w:tcPr/>
+          <w:bookmarkStart w:id="137" w:name="tbl-doe-protein-a-screening"/>
+          <w:p>
+            <w:pPr>
+              <w:jc w:val="center"/>
+            </w:pPr>
+            <w:pPr>
+              <w:jc w:val="start"/>
+              <w:spacing w:before="200"/>
+              <w:pStyle w:val="ImageCaption"/>
+            </w:pPr>
+            <w:r>
+              <w:t xml:space="preserve">Table 37: Protein A screening design, settings and results.</w:t>
             </w:r>
           </w:p>
           <w:tbl>
@@ -31517,7 +31772,7 @@
               </w:tc>
             </w:tr>
           </w:tbl>
-          <w:bookmarkEnd w:id="135"/>
+          <w:bookmarkEnd w:id="137"/>
           <w:p/>
         </w:tc>
       </w:tr>
@@ -31543,7 +31798,7 @@
       <w:tr>
         <w:tc>
           <w:tcPr/>
-          <w:bookmarkStart w:id="136" w:name="tbl-app-scr-info"/>
+          <w:bookmarkStart w:id="138" w:name="tbl-app-scr-info"/>
           <w:p>
             <w:pPr>
               <w:jc w:val="center"/>
@@ -31554,7 +31809,7 @@
               <w:pStyle w:val="ImageCaption"/>
             </w:pPr>
             <w:r>
-              <w:t xml:space="preserve">Table 37: Screening design (study S-PA-SCR), run order and results measured for information.</w:t>
+              <w:t xml:space="preserve">Table 38: Screening design (study S-PA-SCR), run order and results measured for information.</w:t>
             </w:r>
           </w:p>
           <w:tbl>
@@ -32855,13 +33110,13 @@
               </w:tc>
             </w:tr>
           </w:tbl>
-          <w:bookmarkEnd w:id="136"/>
+          <w:bookmarkEnd w:id="138"/>
           <w:p/>
         </w:tc>
       </w:tr>
     </w:tbl>
-    <w:bookmarkEnd w:id="137"/>
-    <w:bookmarkStart w:id="140" w:name="X4125de861a1edaf509f699b4c84c2434921439f"/>
+    <w:bookmarkEnd w:id="139"/>
+    <w:bookmarkStart w:id="142" w:name="X4125de861a1edaf509f699b4c84c2434921439f"/>
     <w:p>
       <w:pPr>
         <w:pStyle w:val="Heading2"/>
@@ -32879,7 +33134,7 @@
           <w:rPr>
             <w:rStyle w:val="Hyperlink"/>
           </w:rPr>
-          <w:t xml:space="preserve">Table 38</w:t>
+          <w:t xml:space="preserve">Table 39</w:t>
         </w:r>
       </w:hyperlink>
       <w:r>
@@ -32896,7 +33151,7 @@
           <w:rPr>
             <w:rStyle w:val="Hyperlink"/>
           </w:rPr>
-          <w:t xml:space="preserve">Table 39</w:t>
+          <w:t xml:space="preserve">Table 40</w:t>
         </w:r>
       </w:hyperlink>
       <w:r>
@@ -32919,7 +33174,7 @@
       <w:tr>
         <w:tc>
           <w:tcPr/>
-          <w:bookmarkStart w:id="138" w:name="tbl-doe-protein-a-rsm"/>
+          <w:bookmarkStart w:id="140" w:name="tbl-doe-protein-a-rsm"/>
           <w:p>
             <w:pPr>
               <w:jc w:val="center"/>
@@ -32930,7 +33185,7 @@
               <w:pStyle w:val="ImageCaption"/>
             </w:pPr>
             <w:r>
-              <w:t xml:space="preserve">Table 38: Protein A response-surface design, settings and results.</w:t>
+              <w:t xml:space="preserve">Table 39: Protein A response-surface design, settings and results.</w:t>
             </w:r>
           </w:p>
           <w:tbl>
@@ -37083,7 +37338,7 @@
               </w:tc>
             </w:tr>
           </w:tbl>
-          <w:bookmarkEnd w:id="138"/>
+          <w:bookmarkEnd w:id="140"/>
           <w:p/>
         </w:tc>
       </w:tr>
@@ -37109,7 +37364,7 @@
       <w:tr>
         <w:tc>
           <w:tcPr/>
-          <w:bookmarkStart w:id="139" w:name="tbl-app-rsm-info"/>
+          <w:bookmarkStart w:id="141" w:name="tbl-app-rsm-info"/>
           <w:p>
             <w:pPr>
               <w:jc w:val="center"/>
@@ -37120,7 +37375,7 @@
               <w:pStyle w:val="ImageCaption"/>
             </w:pPr>
             <w:r>
-              <w:t xml:space="preserve">Table 39: Response-surface design (study S-PA-RSM), run order, elution buffer pH as analysed and results measured for information.</w:t>
+              <w:t xml:space="preserve">Table 40: Response-surface design (study S-PA-RSM), run order, elution buffer pH as analysed and results measured for information.</w:t>
             </w:r>
           </w:p>
           <w:tbl>
@@ -39334,13 +39589,13 @@
               </w:tc>
             </w:tr>
           </w:tbl>
-          <w:bookmarkEnd w:id="139"/>
+          <w:bookmarkEnd w:id="141"/>
           <w:p/>
         </w:tc>
       </w:tr>
     </w:tbl>
-    <w:bookmarkEnd w:id="140"/>
-    <w:bookmarkStart w:id="142" w:name="X36bf6f5778a70498f998897bcaba6cd1608671a"/>
+    <w:bookmarkEnd w:id="142"/>
+    <w:bookmarkStart w:id="144" w:name="X36bf6f5778a70498f998897bcaba6cd1608671a"/>
     <w:p>
       <w:pPr>
         <w:pStyle w:val="Heading2"/>
@@ -39358,7 +39613,7 @@
           <w:rPr>
             <w:rStyle w:val="Hyperlink"/>
           </w:rPr>
-          <w:t xml:space="preserve">Table 40</w:t>
+          <w:t xml:space="preserve">Table 41</w:t>
         </w:r>
       </w:hyperlink>
       <w:r>
@@ -39457,7 +39712,7 @@
       <w:tr>
         <w:tc>
           <w:tcPr/>
-          <w:bookmarkStart w:id="141" w:name="tbl-scr-lpa"/>
+          <w:bookmarkStart w:id="143" w:name="tbl-scr-lpa"/>
           <w:p>
             <w:pPr>
               <w:jc w:val="center"/>
@@ -39468,7 +39723,7 @@
               <w:pStyle w:val="ImageCaption"/>
             </w:pPr>
             <w:r>
-              <w:t xml:space="preserve">Table 40: Screening effects on leached Protein A (ppm), sorted by size.</w:t>
+              <w:t xml:space="preserve">Table 41: Screening effects on leached Protein A (ppm), sorted by size.</w:t>
             </w:r>
           </w:p>
           <w:tbl>
@@ -40303,13 +40558,13 @@
               </w:tc>
             </w:tr>
           </w:tbl>
-          <w:bookmarkEnd w:id="141"/>
+          <w:bookmarkEnd w:id="143"/>
           <w:p/>
         </w:tc>
       </w:tr>
     </w:tbl>
-    <w:bookmarkEnd w:id="142"/>
-    <w:bookmarkStart w:id="144" w:name="appendix-d.-analytical-methods-summary"/>
+    <w:bookmarkEnd w:id="144"/>
+    <w:bookmarkStart w:id="146" w:name="appendix-d.-analytical-methods-summary"/>
     <w:p>
       <w:pPr>
         <w:pStyle w:val="Heading2"/>
@@ -40327,7 +40582,7 @@
           <w:rPr>
             <w:rStyle w:val="Hyperlink"/>
           </w:rPr>
-          <w:t xml:space="preserve">Table 41</w:t>
+          <w:t xml:space="preserve">Table 42</w:t>
         </w:r>
       </w:hyperlink>
       <w:r>
@@ -40350,7 +40605,7 @@
       <w:tr>
         <w:tc>
           <w:tcPr/>
-          <w:bookmarkStart w:id="143" w:name="tbl-methods-summary"/>
+          <w:bookmarkStart w:id="145" w:name="tbl-methods-summary"/>
           <w:p>
             <w:pPr>
               <w:jc w:val="center"/>
@@ -40361,7 +40616,7 @@
               <w:pStyle w:val="ImageCaption"/>
             </w:pPr>
             <w:r>
-              <w:t xml:space="preserve">Table 41: Analytical methods used in the studies of the Protein A step.</w:t>
+              <w:t xml:space="preserve">Table 42: Analytical methods used in the studies of the Protein A step.</w:t>
             </w:r>
           </w:p>
           <w:tbl>
@@ -40999,14 +41254,14 @@
               </w:tc>
             </w:tr>
           </w:tbl>
-          <w:bookmarkEnd w:id="143"/>
+          <w:bookmarkEnd w:id="145"/>
           <w:p/>
         </w:tc>
       </w:tr>
     </w:tbl>
-    <w:bookmarkEnd w:id="144"/>
-    <w:bookmarkEnd w:id="145"/>
-    <w:bookmarkStart w:id="156" w:name="references"/>
+    <w:bookmarkEnd w:id="146"/>
+    <w:bookmarkEnd w:id="147"/>
+    <w:bookmarkStart w:id="158" w:name="references"/>
     <w:p>
       <w:pPr>
         <w:pStyle w:val="Heading1"/>
@@ -41015,8 +41270,8 @@
         <w:t xml:space="preserve">References</w:t>
       </w:r>
     </w:p>
-    <w:bookmarkStart w:id="155" w:name="refs"/>
-    <w:bookmarkStart w:id="146" w:name="ref-boxcox1964"/>
+    <w:bookmarkStart w:id="157" w:name="refs"/>
+    <w:bookmarkStart w:id="148" w:name="ref-boxcox1964"/>
     <w:p>
       <w:pPr>
         <w:pStyle w:val="Bibliography"/>
@@ -41047,8 +41302,8 @@
         <w:t xml:space="preserve">26 (2): 211–52.</w:t>
       </w:r>
     </w:p>
-    <w:bookmarkEnd w:id="146"/>
-    <w:bookmarkStart w:id="147" w:name="ref-burnham2002"/>
+    <w:bookmarkEnd w:id="148"/>
+    <w:bookmarkStart w:id="149" w:name="ref-burnham2002"/>
     <w:p>
       <w:pPr>
         <w:pStyle w:val="Bibliography"/>
@@ -41070,8 +41325,8 @@
         <w:t xml:space="preserve">. 2nd ed. New York: Springer.</w:t>
       </w:r>
     </w:p>
-    <w:bookmarkEnd w:id="147"/>
-    <w:bookmarkStart w:id="148" w:name="ref-amab2009"/>
+    <w:bookmarkEnd w:id="149"/>
+    <w:bookmarkStart w:id="150" w:name="ref-amab2009"/>
     <w:p>
       <w:pPr>
         <w:pStyle w:val="Bibliography"/>
@@ -41092,8 +41347,8 @@
         <w:t xml:space="preserve">CASSS.</w:t>
       </w:r>
     </w:p>
-    <w:bookmarkEnd w:id="148"/>
-    <w:bookmarkStart w:id="149" w:name="ref-hurvich1989"/>
+    <w:bookmarkEnd w:id="150"/>
+    <w:bookmarkStart w:id="151" w:name="ref-hurvich1989"/>
     <w:p>
       <w:pPr>
         <w:pStyle w:val="Bibliography"/>
@@ -41124,8 +41379,8 @@
         <w:t xml:space="preserve">76 (2): 297–307.</w:t>
       </w:r>
     </w:p>
-    <w:bookmarkEnd w:id="149"/>
-    <w:bookmarkStart w:id="150" w:name="ref-ichq8"/>
+    <w:bookmarkEnd w:id="151"/>
+    <w:bookmarkStart w:id="152" w:name="ref-ichq8"/>
     <w:p>
       <w:pPr>
         <w:pStyle w:val="Bibliography"/>
@@ -41146,8 +41401,8 @@
         <w:t xml:space="preserve">ICH.</w:t>
       </w:r>
     </w:p>
-    <w:bookmarkEnd w:id="150"/>
-    <w:bookmarkStart w:id="151" w:name="ref-ichq11"/>
+    <w:bookmarkEnd w:id="152"/>
+    <w:bookmarkStart w:id="153" w:name="ref-ichq11"/>
     <w:p>
       <w:pPr>
         <w:pStyle w:val="Bibliography"/>
@@ -41168,8 +41423,8 @@
         <w:t xml:space="preserve">ICH.</w:t>
       </w:r>
     </w:p>
-    <w:bookmarkEnd w:id="151"/>
-    <w:bookmarkStart w:id="152" w:name="ref-ichq9"/>
+    <w:bookmarkEnd w:id="153"/>
+    <w:bookmarkStart w:id="154" w:name="ref-ichq9"/>
     <w:p>
       <w:pPr>
         <w:pStyle w:val="Bibliography"/>
@@ -41190,8 +41445,8 @@
         <w:t xml:space="preserve">ICH.</w:t>
       </w:r>
     </w:p>
-    <w:bookmarkEnd w:id="152"/>
-    <w:bookmarkStart w:id="153" w:name="ref-montgomery2017"/>
+    <w:bookmarkEnd w:id="154"/>
+    <w:bookmarkStart w:id="155" w:name="ref-montgomery2017"/>
     <w:p>
       <w:pPr>
         <w:pStyle w:val="Bibliography"/>
@@ -41213,8 +41468,8 @@
         <w:t xml:space="preserve">. 9th ed. Hoboken, NJ: Wiley.</w:t>
       </w:r>
     </w:p>
-    <w:bookmarkEnd w:id="153"/>
-    <w:bookmarkStart w:id="154" w:name="ref-fda2011"/>
+    <w:bookmarkEnd w:id="155"/>
+    <w:bookmarkStart w:id="156" w:name="ref-fda2011"/>
     <w:p>
       <w:pPr>
         <w:pStyle w:val="Bibliography"/>
@@ -41235,9 +41490,9 @@
         <w:t xml:space="preserve">FDA.</w:t>
       </w:r>
     </w:p>
-    <w:bookmarkEnd w:id="154"/>
-    <w:bookmarkEnd w:id="155"/>
     <w:bookmarkEnd w:id="156"/>
+    <w:bookmarkEnd w:id="157"/>
+    <w:bookmarkEnd w:id="158"/>
     <w:sectPr>
       <w:footnotePr>
         <w:numRestart w:val="eachSect"/>

</xml_diff>